<commit_message>
bap6 answering, opening, reply briefs docx: Times New Roman (the typst face) via docx/reference.xml (build-reference.sh named EB Garamond: TNR-EMBEDDED, DEF-FONT-002), double and single pitch re-measured on the typst PDF (37.1 and 18.8 pt); TOC and TOA page numbers from the multi-pass engine (they were Word fields LibreOffice left empty; FRBP 8014(a)(2)-(3)), passim from 7 pages, rIdFtr footers and FORMBOOK_FINAL, so render.sh is retired; certificate of compliance names Times New Roman; cover on one page; typst heading gaps; certificates kept together; check.sh --engine docx 11/0, 10/0, 9/0 (fb-595.63)
</commit_message>
<xml_diff>
--- a/courts/sixth-circuit/bankruptcy-appellate-panel/answering-brief/usage/OUTPUT-answering-brief.docx
+++ b/courts/sixth-circuit/bankruptcy-appellate-panel/answering-brief/usage/OUTPUT-answering-brief.docx
@@ -64,18 +64,50 @@
     </w:p>
     <w:p>
       <w:pPr>
+        <w:pStyle w:val="CoverGap"/>
+      </w:pPr>
+      <w:r>
+        <w:t xml:space="preserve">v.</w:t>
+      </w:r>
+    </w:p>
+    <w:p>
+      <w:pPr>
+        <w:pStyle w:val="CoverGap"/>
+      </w:pPr>
+      <w:r>
+        <w:t xml:space="preserve">United Cumberland Bank</w:t>
+      </w:r>
+    </w:p>
+    <w:p>
+      <w:pPr>
         <w:pStyle w:val="Centered"/>
       </w:pPr>
       <w:r>
-        <w:t xml:space="preserve">v.</w:t>
-      </w:r>
-    </w:p>
-    <w:p>
-      <w:pPr>
-        <w:pStyle w:val="CoverGap"/>
-      </w:pPr>
-      <w:r>
-        <w:t xml:space="preserve">United Cumberland Bank</w:t>
+        <w:t xml:space="preserve">Appellee.</w:t>
+      </w:r>
+    </w:p>
+    <w:p>
+      <w:pPr>
+        <w:pStyle w:val="CoverWide"/>
+      </w:pPr>
+      <w:r>
+        <w:t xml:space="preserve">On Appeal from the United States Bankruptcy Court for the Western District of Kentucky. Originating Case No. 16-10407, Chapter 11, Hon. Joan A. Lloyd.</w:t>
+      </w:r>
+    </w:p>
+    <w:p>
+      <w:pPr>
+        <w:pStyle w:val="CoverTitle"/>
+      </w:pPr>
+      <w:r>
+        <w:t xml:space="preserve">Appellees’ Brief</w:t>
+      </w:r>
+    </w:p>
+    <w:p>
+      <w:pPr>
+        <w:pStyle w:val="CoverBottom"/>
+      </w:pPr>
+      <w:r>
+        <w:t xml:space="preserve">Scott A. Bachert</w:t>
       </w:r>
     </w:p>
     <w:p>
@@ -83,31 +115,7 @@
         <w:pStyle w:val="Centered"/>
       </w:pPr>
       <w:r>
-        <w:t xml:space="preserve">Appellee.</w:t>
-      </w:r>
-    </w:p>
-    <w:p>
-      <w:pPr>
-        <w:pStyle w:val="CoverGap"/>
-      </w:pPr>
-      <w:r>
-        <w:t xml:space="preserve">On Appeal from the United States Bankruptcy Court for the Western District of Kentucky. Originating Case No. 16-10407, Chapter 11, Hon. Joan A. Lloyd.</w:t>
-      </w:r>
-    </w:p>
-    <w:p>
-      <w:pPr>
-        <w:pStyle w:val="CoverTitle"/>
-      </w:pPr>
-      <w:r>
-        <w:t xml:space="preserve">Appellees’ Brief</w:t>
-      </w:r>
-    </w:p>
-    <w:p>
-      <w:pPr>
-        <w:pStyle w:val="CoverBottom"/>
-      </w:pPr>
-      <w:r>
-        <w:t xml:space="preserve">Scott A. Bachert</w:t>
+        <w:t xml:space="preserve">KERRICK BACHERT</w:t>
       </w:r>
     </w:p>
     <w:p>
@@ -115,7 +123,7 @@
         <w:pStyle w:val="Centered"/>
       </w:pPr>
       <w:r>
-        <w:t xml:space="preserve">KERRICK BACHERT</w:t>
+        <w:t xml:space="preserve">1025 State Street</w:t>
       </w:r>
     </w:p>
     <w:p>
@@ -123,7 +131,7 @@
         <w:pStyle w:val="Centered"/>
       </w:pPr>
       <w:r>
-        <w:t xml:space="preserve">1025 State Street</w:t>
+        <w:t xml:space="preserve">P.O. Box 9547</w:t>
       </w:r>
     </w:p>
     <w:p>
@@ -131,7 +139,7 @@
         <w:pStyle w:val="Centered"/>
       </w:pPr>
       <w:r>
-        <w:t xml:space="preserve">P.O. Box 9547</w:t>
+        <w:t xml:space="preserve">Bowling Green, KY 42102-9547</w:t>
       </w:r>
     </w:p>
     <w:p>
@@ -139,7 +147,7 @@
         <w:pStyle w:val="Centered"/>
       </w:pPr>
       <w:r>
-        <w:t xml:space="preserve">Bowling Green, KY 42102-9547</w:t>
+        <w:t xml:space="preserve">sbachert@kerricklaw.com</w:t>
       </w:r>
     </w:p>
     <w:p>
@@ -147,20 +155,12 @@
         <w:pStyle w:val="Centered"/>
       </w:pPr>
       <w:r>
-        <w:t xml:space="preserve">sbachert@kerricklaw.com</w:t>
-      </w:r>
-    </w:p>
-    <w:p>
-      <w:pPr>
-        <w:pStyle w:val="Centered"/>
-      </w:pPr>
-      <w:r>
         <w:t xml:space="preserve">Counsel for United Cumberland Bank</w:t>
       </w:r>
     </w:p>
     <w:p>
       <w:pPr>
-        <w:pStyle w:val="CoverGap"/>
+        <w:pStyle w:val="CoverGroup"/>
       </w:pPr>
       <w:r>
         <w:t xml:space="preserve">(270) 782-8160</w:t>
@@ -168,7 +168,7 @@
     </w:p>
     <w:p>
       <w:pPr>
-        <w:pStyle w:val="CoverGap"/>
+        <w:pStyle w:val="CoverDate"/>
       </w:pPr>
       <w:r>
         <w:t xml:space="preserve">August 30, 2019</w:t>
@@ -176,7 +176,9 @@
     </w:p>
     <w:p>
       <w:pPr>
+        <w:pStyle w:val="SectionEnd"/>
         <w:sectPr>
+          <w:footerReference w:type="default" r:id="rIdFtrNone"/>
           <w:pgSz w:w="12240" w:h="15840"/>
           <w:pgMar w:top="1440" w:right="1440" w:bottom="1440" w:left="1440" w:header="720" w:footer="720" w:gutter="0"/>
           <w:cols w:space="720"/>
@@ -185,7 +187,7 @@
     </w:p>
     <w:p>
       <w:pPr>
-        <w:pStyle w:val="Heading1"/>
+        <w:pStyle w:val="FrontHeading"/>
       </w:pPr>
       <w:r>
         <w:t xml:space="preserve">Corporate Disclosure Statement</w:t>
@@ -201,7 +203,7 @@
     </w:p>
     <w:p>
       <w:pPr>
-        <w:pStyle w:val="FrontHeadingBreak"/>
+        <w:pStyle w:val="ContentsHeadingBreak"/>
       </w:pPr>
       <w:r>
         <w:t xml:space="preserve">Table of Contents</w:t>
@@ -209,99 +211,147 @@
     </w:p>
     <w:p>
       <w:pPr>
-        <w:pStyle w:val="TOC1"/>
-      </w:pPr>
-      <w:r>
-        <w:fldChar w:fldCharType="begin"/>
-      </w:r>
-      <w:r>
-        <w:instrText xml:space="preserve"> TOC \o "1-9" \h \z \u </w:instrText>
-      </w:r>
-      <w:r>
-        <w:fldChar w:fldCharType="separate"/>
-      </w:r>
+        <w:pStyle w:val="TOCEntry1"/>
+      </w:pPr>
       <w:r>
         <w:t xml:space="preserve">Corporate Disclosure Statement</w:t>
       </w:r>
-    </w:p>
-    <w:p>
-      <w:pPr>
-        <w:pStyle w:val="TOC1"/>
+      <w:r>
+        <w:tab/>
+      </w:r>
+      <w:r>
+        <w:t xml:space="preserve">i</w:t>
+      </w:r>
+    </w:p>
+    <w:p>
+      <w:pPr>
+        <w:pStyle w:val="TOCEntry1"/>
       </w:pPr>
       <w:r>
         <w:t xml:space="preserve">Table of Authorities</w:t>
       </w:r>
-    </w:p>
-    <w:p>
-      <w:pPr>
-        <w:pStyle w:val="TOC1"/>
+      <w:r>
+        <w:tab/>
+      </w:r>
+      <w:r>
+        <w:t xml:space="preserve">iii</w:t>
+      </w:r>
+    </w:p>
+    <w:p>
+      <w:pPr>
+        <w:pStyle w:val="TOCEntry1"/>
       </w:pPr>
       <w:r>
         <w:t xml:space="preserve">Statement of the Issues</w:t>
       </w:r>
-    </w:p>
-    <w:p>
-      <w:pPr>
-        <w:pStyle w:val="TOC1"/>
+      <w:r>
+        <w:tab/>
+      </w:r>
+      <w:r>
+        <w:t xml:space="preserve">1</w:t>
+      </w:r>
+    </w:p>
+    <w:p>
+      <w:pPr>
+        <w:pStyle w:val="TOCEntry1"/>
       </w:pPr>
       <w:r>
         <w:t xml:space="preserve">Statement of the Case</w:t>
       </w:r>
-    </w:p>
-    <w:p>
-      <w:pPr>
-        <w:pStyle w:val="TOC1"/>
+      <w:r>
+        <w:tab/>
+      </w:r>
+      <w:r>
+        <w:t xml:space="preserve">1</w:t>
+      </w:r>
+    </w:p>
+    <w:p>
+      <w:pPr>
+        <w:pStyle w:val="TOCEntry1"/>
       </w:pPr>
       <w:r>
         <w:t xml:space="preserve">Standard of Review</w:t>
       </w:r>
-    </w:p>
-    <w:p>
-      <w:pPr>
-        <w:pStyle w:val="TOC1"/>
+      <w:r>
+        <w:tab/>
+      </w:r>
+      <w:r>
+        <w:t xml:space="preserve">4</w:t>
+      </w:r>
+    </w:p>
+    <w:p>
+      <w:pPr>
+        <w:pStyle w:val="TOCEntry1"/>
       </w:pPr>
       <w:r>
         <w:t xml:space="preserve">Summary of Argument</w:t>
       </w:r>
-    </w:p>
-    <w:p>
-      <w:pPr>
-        <w:pStyle w:val="TOC1"/>
+      <w:r>
+        <w:tab/>
+      </w:r>
+      <w:r>
+        <w:t xml:space="preserve">4</w:t>
+      </w:r>
+    </w:p>
+    <w:p>
+      <w:pPr>
+        <w:pStyle w:val="TOCEntry1"/>
       </w:pPr>
       <w:r>
         <w:t xml:space="preserve">Argument</w:t>
       </w:r>
-    </w:p>
-    <w:p>
-      <w:pPr>
-        <w:pStyle w:val="TOC2"/>
+      <w:r>
+        <w:tab/>
+      </w:r>
+      <w:r>
+        <w:t xml:space="preserve">5</w:t>
+      </w:r>
+    </w:p>
+    <w:p>
+      <w:pPr>
+        <w:pStyle w:val="TOCEntry2"/>
       </w:pPr>
       <w:r>
         <w:t xml:space="preserve">The Cash Collateral Orders do not obligate UCB to pay the Professional fees.</w:t>
       </w:r>
-    </w:p>
-    <w:p>
-      <w:pPr>
-        <w:pStyle w:val="TOC2"/>
+      <w:r>
+        <w:tab/>
+      </w:r>
+      <w:r>
+        <w:t xml:space="preserve">5</w:t>
+      </w:r>
+    </w:p>
+    <w:p>
+      <w:pPr>
+        <w:pStyle w:val="TOCEntry2"/>
       </w:pPr>
       <w:r>
         <w:t xml:space="preserve">The Plan of Confirmation does not require UCB to pay the Professional fees.</w:t>
       </w:r>
-    </w:p>
-    <w:p>
-      <w:pPr>
-        <w:pStyle w:val="TOC1"/>
+      <w:r>
+        <w:tab/>
+      </w:r>
+      <w:r>
+        <w:t xml:space="preserve">6</w:t>
+      </w:r>
+    </w:p>
+    <w:p>
+      <w:pPr>
+        <w:pStyle w:val="TOCEntry1"/>
       </w:pPr>
       <w:r>
         <w:t xml:space="preserve">Conclusion</w:t>
       </w:r>
       <w:r>
-        <w:fldChar w:fldCharType="end"/>
-      </w:r>
-    </w:p>
-    <w:p>
-      <w:pPr>
-        <w:pStyle w:val="OutlineBreak"/>
+        <w:tab/>
+      </w:r>
+      <w:r>
+        <w:t xml:space="preserve">7</w:t>
+      </w:r>
+    </w:p>
+    <w:p>
+      <w:pPr>
+        <w:pStyle w:val="AuthoritiesHeading"/>
       </w:pPr>
       <w:r>
         <w:t xml:space="preserve">Table of Authorities</w:t>
@@ -317,17 +367,8 @@
     </w:p>
     <w:p>
       <w:pPr>
-        <w:pStyle w:val="AuthorityLine"/>
-      </w:pPr>
-      <w:r>
-        <w:fldChar w:fldCharType="begin"/>
-      </w:r>
-      <w:r>
-        <w:instrText xml:space="preserve"> TOA \h \c "1" </w:instrText>
-      </w:r>
-      <w:r>
-        <w:fldChar w:fldCharType="separate"/>
-      </w:r>
+        <w:pStyle w:val="TOAEntry"/>
+      </w:pPr>
       <w:r>
         <w:rPr>
           <w:i/>
@@ -338,10 +379,16 @@
       <w:r>
         <w:t xml:space="preserve">, 855 F.3d 703 (6th Cir. 2017)</w:t>
       </w:r>
-    </w:p>
-    <w:p>
-      <w:pPr>
-        <w:pStyle w:val="AuthorityLine"/>
+      <w:r>
+        <w:tab/>
+      </w:r>
+      <w:r>
+        <w:t xml:space="preserve">4</w:t>
+      </w:r>
+    </w:p>
+    <w:p>
+      <w:pPr>
+        <w:pStyle w:val="TOAEntry"/>
       </w:pPr>
       <w:r>
         <w:rPr>
@@ -353,10 +400,16 @@
       <w:r>
         <w:t xml:space="preserve">, 136 B.R. 171 (Bankr. N.D. Ill. 1992)</w:t>
       </w:r>
-    </w:p>
-    <w:p>
-      <w:pPr>
-        <w:pStyle w:val="AuthorityLine"/>
+      <w:r>
+        <w:tab/>
+      </w:r>
+      <w:r>
+        <w:t xml:space="preserve">5</w:t>
+      </w:r>
+    </w:p>
+    <w:p>
+      <w:pPr>
+        <w:pStyle w:val="TOAEntry"/>
       </w:pPr>
       <w:r>
         <w:rPr>
@@ -369,7 +422,10 @@
         <w:t xml:space="preserve">, 911 F.3d 806 (6th Cir. 2018)</w:t>
       </w:r>
       <w:r>
-        <w:fldChar w:fldCharType="end"/>
+        <w:tab/>
+      </w:r>
+      <w:r>
+        <w:t xml:space="preserve">4</w:t>
       </w:r>
     </w:p>
     <w:p>
@@ -382,36 +438,37 @@
     </w:p>
     <w:p>
       <w:pPr>
-        <w:pStyle w:val="AuthorityLine"/>
-      </w:pPr>
-      <w:r>
-        <w:fldChar w:fldCharType="begin"/>
-      </w:r>
-      <w:r>
-        <w:instrText xml:space="preserve"> TOA \h \c "3" </w:instrText>
-      </w:r>
-      <w:r>
-        <w:fldChar w:fldCharType="separate"/>
-      </w:r>
+        <w:pStyle w:val="TOAEntry"/>
+      </w:pPr>
       <w:r>
         <w:t xml:space="preserve">11 U.S.C. § 1141(a)</w:t>
       </w:r>
-    </w:p>
-    <w:p>
-      <w:pPr>
-        <w:pStyle w:val="AuthorityLine"/>
+      <w:r>
+        <w:tab/>
+      </w:r>
+      <w:r>
+        <w:t xml:space="preserve">6</w:t>
+      </w:r>
+    </w:p>
+    <w:p>
+      <w:pPr>
+        <w:pStyle w:val="TOAEntry"/>
       </w:pPr>
       <w:r>
         <w:t xml:space="preserve">11 U.S.C. § 1141(b)</w:t>
       </w:r>
       <w:r>
-        <w:fldChar w:fldCharType="end"/>
-      </w:r>
-    </w:p>
-    <w:p>
-      <w:pPr>
+        <w:tab/>
+      </w:r>
+      <w:r>
+        <w:t xml:space="preserve">6</w:t>
+      </w:r>
+    </w:p>
+    <w:p>
+      <w:pPr>
+        <w:pStyle w:val="SectionEnd"/>
         <w:sectPr>
-          <w:footerReference w:type="default" r:id="rId9"/>
+          <w:footerReference w:type="default" r:id="rIdFtrPage"/>
           <w:pgSz w:w="12240" w:h="15840"/>
           <w:pgMar w:top="1440" w:right="1440" w:bottom="1440" w:left="1440" w:header="720" w:footer="720" w:gutter="0"/>
           <w:pgNumType w:fmt="lowerRoman" w:start="1"/>
@@ -419,90 +476,89 @@
         </w:sectPr>
       </w:pPr>
     </w:p>
-    <w:bookmarkStart w:id="20" w:name="statement-of-the-issues"/>
+    <w:p>
+      <w:pPr>
+        <w:pStyle w:val="Heading1Top"/>
+      </w:pPr>
+      <w:r>
+        <w:t xml:space="preserve">Statement of the Issues</w:t>
+      </w:r>
+    </w:p>
+    <w:p>
+      <w:pPr>
+        <w:pStyle w:val="FirstParagraph"/>
+      </w:pPr>
+      <w:r>
+        <w:t xml:space="preserve">Are the Appellants Dinsmore &amp; Shohl, LLP; Bingham Greenebaum Doll, LLP; Fox Rothschild, LLP and Phoenix Management Services, LLC entitled post-confirmation to recover unpaid fees pursuant to a Carve-Out in the interim Cash Collateral Orders which were not specifically authorized or reserved in the Order of Confirmation or the Confirmed Plan of Reorganization.</w:t>
+      </w:r>
+    </w:p>
     <w:p>
       <w:pPr>
         <w:pStyle w:val="Heading1"/>
       </w:pPr>
-      <w:r>
-        <w:t xml:space="preserve">Statement of the Issues</w:t>
-      </w:r>
+      <w:bookmarkStart w:id="9" w:name="_9ce86cd89e816c495213921bce711286420babc"/>
+      <w:r>
+        <w:t xml:space="preserve">Statement of the Case</w:t>
+      </w:r>
+      <w:bookmarkEnd w:id="9"/>
     </w:p>
     <w:p>
       <w:pPr>
         <w:pStyle w:val="FirstParagraph"/>
       </w:pPr>
       <w:r>
-        <w:t xml:space="preserve">Are the Appellants Dinsmore &amp; Shohl, LLP; Bingham Greenebaum Doll, LLP; Fox Rothschild, LLP and Phoenix Management Services, LLC entitled post-confirmation to recover unpaid fees pursuant to a Carve-Out in the interim Cash Collateral Orders which were not specifically authorized or reserved in the Order of Confirmation or the Confirmed Plan of Reorganization.</w:t>
-      </w:r>
-    </w:p>
-    <w:bookmarkEnd w:id="20"/>
-    <w:bookmarkStart w:id="21" w:name="statement-of-the-case"/>
+        <w:t xml:space="preserve">The Appellants consist of counsel for the Debtor, Chieftain Steel, LLC, and the attorneys and financial advisors for the creditors committee (hereinafter collectively referred to as (“Professionals”.) The Professionals are seeking to recover post-confirmation fees and expenses from the secured creditor although such recovery is not authorized under the Confirmed Plan of Reorganization or in the Order of Confirmation.</w:t>
+      </w:r>
+    </w:p>
+    <w:p>
+      <w:pPr>
+        <w:pStyle w:val="BodyText"/>
+      </w:pPr>
+      <w:r>
+        <w:t xml:space="preserve">Chieftain Steel, LLC (“Chieftain”) filed a voluntary petition for relief under Chapter 11 of the United States Bankruptcy Code on May 2, 2016. Subsequently, the Official Committee of Unsecured Creditors (the “Committee”) was appointed by the office of the United States Trustee. Chieftain was initially represented by Constance Grayson, but was replaced by Dinsmore &amp; Shohl, LLP, which was approved as counsel for Chieftain by Order dated August 22, 2016 (Doc #109).</w:t>
+      </w:r>
+    </w:p>
+    <w:p>
+      <w:pPr>
+        <w:pStyle w:val="BodyText"/>
+      </w:pPr>
+      <w:r>
+        <w:t xml:space="preserve">On July 8, 2016, the parties entered into an Agreed Order (I) Authorizing Debtor to Utilize Cash Collateral of Prepetition Lender (Doc #91). This initial Cash Collateral Order did not provide an amount for a Carve-Out. A Second Agreed Order was entered on August 4, 2016 (Doc #101). This Order authorized the Debtor to pay Dinsmore &amp; Shohl, LLP $20,000 per month for fees and pay $20,000 per month for the other Professionals. Its relevant part, the Second Cash Collateral Order provided: “Payment of any amounts on account of the Post-Petition Replacement Liens, the United Cumberland Pre-Petition Indebtedness, and the United Cumberland Pre-Petition Liens, shall be subject and subordinate to payment of the Carve-Out.” The Debtor “shall pay the Carve-Out as funds permit without causing an overdraft.” (Emphasis Added)</w:t>
+      </w:r>
+    </w:p>
+    <w:p>
+      <w:pPr>
+        <w:pStyle w:val="BodyText"/>
+      </w:pPr>
+      <w:r>
+        <w:t xml:space="preserve">Subsequently, additional Cash Collateral Orders were entered in the Chieftain case, through a Fourth Amended Final Agreed Order entered on April 17, 2017 (Doc #245). None of the subsequent Orders addressed any shortfall in the payment of attorney’s fees under the prior Cash Collateral Order nor did the Orders authorize additional amounts to be paid to the Professionals to address any arrearage.</w:t>
+      </w:r>
+    </w:p>
+    <w:p>
+      <w:pPr>
+        <w:pStyle w:val="BodyText"/>
+      </w:pPr>
+      <w:r>
+        <w:t xml:space="preserve">On April 14, 2017, Chieftain filed a Second Amended Plan of Reorganization (Doc # 249). The Second Amended Plan addressed the payment of Professional fees (¶3.05); the treatment of UCB’s secured claim (¶4.02) and reinstated the property of the estate to the Debtor. The Bankruptcy Court confirmed the Second Amended Plan by its Findings of Fact, Conclusions of Law, and Order Under 11 U.S.C. §§ 1129(a) Confirming the Joint Plan of Reorganization dated May 24, 2017 (Doc #266).</w:t>
+      </w:r>
+    </w:p>
+    <w:p>
+      <w:pPr>
+        <w:pStyle w:val="BodyText"/>
+      </w:pPr>
+      <w:r>
+        <w:t xml:space="preserve">After the filing of the Pennyrile’s involuntary bankruptcy, the Professionals sent a letter on May 7, 2018 to counsel for United Cumberland Bank (“UCB”) demanding payment of over $227,407.48 for professional fees. UCB denied that request. Subsequently on October 5, 2018, the professionals filed a Joint Motion to Compel Turnover and Payment of Carve-Out Held by United Cumberland Bank (Doc #409). After briefing and a hearing, Judge Joan Lloyd denied the Professional’s motion by Memorandum-Opinion dated March 13, 2019 (Doc #424). The Bankruptcy Court stated that it “sees nothing in the Second Amended Plan or the Carve-Out that requires payment of the Professionals’ fees directly from UCB’s collateral post-confirmation.”</w:t>
+      </w:r>
+    </w:p>
     <w:p>
       <w:pPr>
         <w:pStyle w:val="Heading1"/>
       </w:pPr>
-      <w:r>
-        <w:t xml:space="preserve">Statement of the Case</w:t>
-      </w:r>
-    </w:p>
-    <w:p>
-      <w:pPr>
-        <w:pStyle w:val="FirstParagraph"/>
-      </w:pPr>
-      <w:r>
-        <w:t xml:space="preserve">The Appellants consist of counsel for the Debtor, Chieftain Steel, LLC, and the attorneys and financial advisors for the creditors committee (hereinafter collectively referred to as (“Professionals”.) The Professionals are seeking to recover post-confirmation fees and expenses from the secured creditor although such recovery is not authorized under the Confirmed Plan of Reorganization or in the Order of Confirmation.</w:t>
-      </w:r>
-    </w:p>
-    <w:p>
-      <w:pPr>
-        <w:pStyle w:val="BodyText"/>
-      </w:pPr>
-      <w:r>
-        <w:t xml:space="preserve">Chieftain Steel, LLC (“Chieftain”) filed a voluntary petition for relief under Chapter 11 of the United States Bankruptcy Code on May 2, 2016. Subsequently, the Official Committee of Unsecured Creditors (the “Committee”) was appointed by the office of the United States Trustee. Chieftain was initially represented by Constance Grayson, but was replaced by Dinsmore &amp; Shohl, LLP, which was approved as counsel for Chieftain by Order dated August 22, 2016 (Doc #109).</w:t>
-      </w:r>
-    </w:p>
-    <w:p>
-      <w:pPr>
-        <w:pStyle w:val="BodyText"/>
-      </w:pPr>
-      <w:r>
-        <w:t xml:space="preserve">On July 8, 2016, the parties entered into an Agreed Order (I) Authorizing Debtor to Utilize Cash Collateral of Prepetition Lender (Doc #91). This initial Cash Collateral Order did not provide an amount for a Carve-Out. A Second Agreed Order was entered on August 4, 2016 (Doc #101). This Order authorized the Debtor to pay Dinsmore &amp; Shohl, LLP $20,000 per month for fees and pay $20,000 per month for the other Professionals. Its relevant part, the Second Cash Collateral Order provided: “Payment of any amounts on account of the Post-Petition Replacement Liens, the United Cumberland Pre-Petition Indebtedness, and the United Cumberland Pre-Petition Liens, shall be subject and subordinate to payment of the Carve-Out.” The Debtor “shall pay the Carve-Out as funds permit without causing an overdraft.” (Emphasis Added)</w:t>
-      </w:r>
-    </w:p>
-    <w:p>
-      <w:pPr>
-        <w:pStyle w:val="BodyText"/>
-      </w:pPr>
-      <w:r>
-        <w:t xml:space="preserve">Subsequently, additional Cash Collateral Orders were entered in the Chieftain case, through a Fourth Amended Final Agreed Order entered on April 17, 2017 (Doc #245). None of the subsequent Orders addressed any shortfall in the payment of attorney’s fees under the prior Cash Collateral Order nor did the Orders authorize additional amounts to be paid to the Professionals to address any arrearage.</w:t>
-      </w:r>
-    </w:p>
-    <w:p>
-      <w:pPr>
-        <w:pStyle w:val="BodyText"/>
-      </w:pPr>
-      <w:r>
-        <w:t xml:space="preserve">On April 14, 2017, Chieftain filed a Second Amended Plan of Reorganization (Doc # 249). The Second Amended Plan addressed the payment of Professional fees (¶3.05); the treatment of UCB’s secured claim (¶4.02) and reinstated the property of the estate to the Debtor. The Bankruptcy Court confirmed the Second Amended Plan by its Findings of Fact, Conclusions of Law, and Order Under 11 U.S.C. §§ 1129(a) Confirming the Joint Plan of Reorganization dated May 24, 2017 (Doc #266).</w:t>
-      </w:r>
-    </w:p>
-    <w:p>
-      <w:pPr>
-        <w:pStyle w:val="BodyText"/>
-      </w:pPr>
-      <w:r>
-        <w:t xml:space="preserve">After the filing of the Pennyrile’s involuntary bankruptcy, the Professionals sent a letter on May 7, 2018 to counsel for United Cumberland Bank (“UCB”) demanding payment of over $227,407.48 for professional fees. UCB denied that request. Subsequently on October 5, 2018, the professionals filed a Joint Motion to Compel Turnover and Payment of Carve-Out Held by United Cumberland Bank (Doc #409). After briefing and a hearing, Judge Joan Lloyd denied the Professional’s motion by Memorandum-Opinion dated March 13, 2019 (Doc #424). The Bankruptcy Court stated that it “sees nothing in the Second Amended Plan or the Carve-Out that requires payment of the Professionals’ fees directly from UCB’s collateral post-confirmation.”</w:t>
-      </w:r>
-    </w:p>
-    <w:bookmarkEnd w:id="21"/>
-    <w:bookmarkStart w:id="22" w:name="standard-of-review"/>
-    <w:p>
-      <w:pPr>
-        <w:pStyle w:val="Heading1"/>
-      </w:pPr>
+      <w:bookmarkStart w:id="10" w:name="_9339ea4a612847623b5ac5d9b950ce636f60fb0"/>
       <w:r>
         <w:t xml:space="preserve">Standard of Review</w:t>
       </w:r>
+      <w:bookmarkEnd w:id="10"/>
     </w:p>
     <w:p>
       <w:pPr>
@@ -522,19 +578,7 @@
         <w:t xml:space="preserve">In re Licking River Mining, LLC</w:t>
       </w:r>
       <w:r>
-        <w:t xml:space="preserve">, 911 F.3d 806 (6th Cir. 2018)</w:t>
-      </w:r>
-      <w:r>
-        <w:fldChar w:fldCharType="begin"/>
-      </w:r>
-      <w:r>
-        <w:instrText xml:space="preserve"> TA \l "In re Licking River Mining, LLC, 911 F.3d 806 (6th Cir. 2018)" \s "In re Licking River Mining, LLC" \c 1 </w:instrText>
-      </w:r>
-      <w:r>
-        <w:fldChar w:fldCharType="end"/>
-      </w:r>
-      <w:r>
-        <w:t xml:space="preserve">. The bankruptcy court’s interpreting of the Cash Collateral Order should be given deference.</w:t>
+        <w:t xml:space="preserve">, 911 F.3d 806 (6th Cir. 2018). The bankruptcy court’s interpreting of the Cash Collateral Order should be given deference.</w:t>
       </w:r>
       <w:r>
         <w:t xml:space="preserve"> </w:t>
@@ -547,19 +591,7 @@
         <w:t xml:space="preserve">Licking River Mining</w:t>
       </w:r>
       <w:r>
-        <w:t xml:space="preserve">, 911 F.3d at 810</w:t>
-      </w:r>
-      <w:r>
-        <w:fldChar w:fldCharType="begin"/>
-      </w:r>
-      <w:r>
-        <w:instrText xml:space="preserve"> TA \l "In re Licking River Mining, LLC, 911 F.3d 806 (6th Cir. 2018)" \s "In re Licking River Mining, LLC" \c 1 </w:instrText>
-      </w:r>
-      <w:r>
-        <w:fldChar w:fldCharType="end"/>
-      </w:r>
-      <w:r>
-        <w:t xml:space="preserve">, relying upon</w:t>
+        <w:t xml:space="preserve">, 911 F.3d at 810, relying upon</w:t>
       </w:r>
       <w:r>
         <w:t xml:space="preserve"> </w:t>
@@ -572,30 +604,18 @@
         <w:t xml:space="preserve">Harper v. The Overnight Comm. (In re Conoco, Inc.)</w:t>
       </w:r>
       <w:r>
-        <w:t xml:space="preserve">, 855 F.3d 703, 714 (6th Cir. 2017)</w:t>
-      </w:r>
-      <w:r>
-        <w:fldChar w:fldCharType="begin"/>
-      </w:r>
-      <w:r>
-        <w:instrText xml:space="preserve"> TA \l "Harper v. The Overnight Comm. (In re Conoco, Inc.), 855 F.3d 703 (6th Cir. 2017)" \s "Harper v. The Overnight Comm. (In re Conoco, Inc.)" \c 1 </w:instrText>
-      </w:r>
-      <w:r>
-        <w:fldChar w:fldCharType="end"/>
-      </w:r>
-      <w:r>
-        <w:t xml:space="preserve">.</w:t>
-      </w:r>
-    </w:p>
-    <w:bookmarkEnd w:id="22"/>
-    <w:bookmarkStart w:id="23" w:name="summary-of-argument"/>
+        <w:t xml:space="preserve">, 855 F.3d 703, 714 (6th Cir. 2017).</w:t>
+      </w:r>
+    </w:p>
     <w:p>
       <w:pPr>
         <w:pStyle w:val="Heading1"/>
       </w:pPr>
+      <w:bookmarkStart w:id="11" w:name="_46604d111831f1e81d7ad6a7ac73e8c7d2c5dc8"/>
       <w:r>
         <w:t xml:space="preserve">Summary of Argument</w:t>
       </w:r>
+      <w:bookmarkEnd w:id="11"/>
     </w:p>
     <w:p>
       <w:pPr>
@@ -605,15 +625,15 @@
         <w:t xml:space="preserve">Bankruptcy Judge Joan Lloyd, interpreting her own Orders and confirmed Second Amended Plan of Reorganization, did not abuse her discretion in finding that neither the Second Amended Plan or the Carve-Out provisions in the Cash Collateral Orders required payment of the Professionals from UCB’s collateral post-confirmation. Despite claims made by the Professionals, the Bankruptcy Court has not created havoc with the normal Chapter 11 fee arrangements or create a “dangerous precedent.” The collection of fees from UCB pursuant to the Carve-Out is not the Professionals only opportunity to be paid. The Liquidating Trustee appointed in the Confirmed Plan should also have funds available to pay administrative expenses.</w:t>
       </w:r>
     </w:p>
-    <w:bookmarkEnd w:id="23"/>
-    <w:bookmarkStart w:id="26" w:name="argument"/>
     <w:p>
       <w:pPr>
         <w:pStyle w:val="Heading1"/>
       </w:pPr>
+      <w:bookmarkStart w:id="12" w:name="_argument"/>
       <w:r>
         <w:t xml:space="preserve">Argument</w:t>
       </w:r>
+      <w:bookmarkEnd w:id="12"/>
     </w:p>
     <w:p>
       <w:pPr>
@@ -633,19 +653,7 @@
         <w:t xml:space="preserve">In re Evanston Beauty Supply, Inc.</w:t>
       </w:r>
       <w:r>
-        <w:t xml:space="preserve">, 136 B.R. 171, 177 (Bankr. N.D. Ill. 1992)</w:t>
-      </w:r>
-      <w:r>
-        <w:fldChar w:fldCharType="begin"/>
-      </w:r>
-      <w:r>
-        <w:instrText xml:space="preserve"> TA \l "In re Evanston Beauty Supply, Inc., 136 B.R. 171 (Bankr. N.D. Ill. 1992)" \s "In re Evanston Beauty Supply, Inc." \c 1 </w:instrText>
-      </w:r>
-      <w:r>
-        <w:fldChar w:fldCharType="end"/>
-      </w:r>
-      <w:r>
-        <w:t xml:space="preserve">. Professionals merely seek to enforce rights which do not exist under the plain language of the Cash Collateral Orders or the confirmed Second Amended Plan.</w:t>
+        <w:t xml:space="preserve">, 136 B.R. 171, 177 (Bankr. N.D. Ill. 1992). Professionals merely seek to enforce rights which do not exist under the plain language of the Cash Collateral Orders or the confirmed Second Amended Plan.</w:t>
       </w:r>
     </w:p>
     <w:p>
@@ -656,14 +664,15 @@
         <w:t xml:space="preserve">However, unfortunately for the Professionals, the Carve-Out, the Cash Collateral Orders and the Confirmed Plan do not authorize the collection from UCB post-confirmation. The Carve-Out and Plan further do not authorize such action after the initiation of the new involuntary Chapter 7 action.</w:t>
       </w:r>
     </w:p>
-    <w:bookmarkStart w:id="24" w:name="X98a30d67215e1bc1623500a509a14d7ad891c72"/>
     <w:p>
       <w:pPr>
         <w:pStyle w:val="Heading2"/>
       </w:pPr>
+      <w:bookmarkStart w:id="13" w:name="_98a30d67215e1bc1623500a509a14d7ad891c72"/>
       <w:r>
         <w:t xml:space="preserve">The Cash Collateral Orders do not obligate UCB to pay the Professional fees.</w:t>
       </w:r>
+      <w:bookmarkEnd w:id="13"/>
     </w:p>
     <w:p>
       <w:pPr>
@@ -689,46 +698,22 @@
         <w:t xml:space="preserve">Subsequent Cash Collateral Orders did not address or permit the carry forward of any arrears in the payments from the prior budget. Each Cash Collateral Order is silent as to what would occur should the Debtor fail to pay the $20,000 per month agreed to as to the Carve-out. Clearly there is no specific language requiring UCB to make up any such shortfall.</w:t>
       </w:r>
     </w:p>
-    <w:bookmarkEnd w:id="24"/>
-    <w:bookmarkStart w:id="25" w:name="X20ba20513426ddd780278ed2966a56db16aa60e"/>
     <w:p>
       <w:pPr>
         <w:pStyle w:val="Heading2"/>
       </w:pPr>
+      <w:bookmarkStart w:id="14" w:name="_20ba20513426ddd780278ed2966a56db16aa60e"/>
       <w:r>
         <w:t xml:space="preserve">The Plan of Confirmation does not require UCB to pay the Professional fees.</w:t>
       </w:r>
+      <w:bookmarkEnd w:id="14"/>
     </w:p>
     <w:p>
       <w:pPr>
         <w:pStyle w:val="FirstParagraph"/>
       </w:pPr>
       <w:r>
-        <w:t xml:space="preserve">A confirmed plan is legally binding on all parties. 11 U.S.C. § 1141(a)</w:t>
-      </w:r>
-      <w:r>
-        <w:fldChar w:fldCharType="begin"/>
-      </w:r>
-      <w:r>
-        <w:instrText xml:space="preserve"> TA \l "11 U.S.C. § 1141(a)" \s "11 U.S.C. § 1141(a)" \c 3 </w:instrText>
-      </w:r>
-      <w:r>
-        <w:fldChar w:fldCharType="end"/>
-      </w:r>
-      <w:r>
-        <w:t xml:space="preserve">. Post-Confirmation, parties are precluded from raising issues they could have raised pre-confirmation. 11 U.S.C. § 1141(b)</w:t>
-      </w:r>
-      <w:r>
-        <w:fldChar w:fldCharType="begin"/>
-      </w:r>
-      <w:r>
-        <w:instrText xml:space="preserve"> TA \l "11 U.S.C. § 1141(b)" \s "11 U.S.C. § 1141(b)" \c 3 </w:instrText>
-      </w:r>
-      <w:r>
-        <w:fldChar w:fldCharType="end"/>
-      </w:r>
-      <w:r>
-        <w:t xml:space="preserve">.</w:t>
+        <w:t xml:space="preserve">A confirmed plan is legally binding on all parties. 11 U.S.C. § 1141(a). Post-Confirmation, parties are precluded from raising issues they could have raised pre-confirmation. 11 U.S.C. § 1141(b).</w:t>
       </w:r>
     </w:p>
     <w:p>
@@ -739,16 +724,15 @@
         <w:t xml:space="preserve">As Judge Lloyd properly ruled, nothing in the Confirmed Second Amended Joint Plan of Reorganization “shifted the responsibility for payment of the Carve-Out from the Debtors to UCB.” The failure of the Plan to more specifically address payment of the Professionals fee is made problematic by the fact that the Second Amended Plan provided that Chieftain would merge post-confirmation with Floyd Industries. The Professionals’ Carve-Outs were only entered in the Chieftain case. They had no entitlement to a carve-out for fees in the Floyd Industries case.</w:t>
       </w:r>
     </w:p>
-    <w:bookmarkEnd w:id="25"/>
-    <w:bookmarkEnd w:id="26"/>
-    <w:bookmarkStart w:id="27" w:name="conclusion"/>
     <w:p>
       <w:pPr>
         <w:pStyle w:val="Heading1"/>
       </w:pPr>
+      <w:bookmarkStart w:id="15" w:name="_conclusion"/>
       <w:r>
         <w:t xml:space="preserve">Conclusion</w:t>
       </w:r>
+      <w:bookmarkEnd w:id="15"/>
     </w:p>
     <w:p>
       <w:pPr>
@@ -808,10 +792,10 @@
     </w:p>
     <w:p>
       <w:pPr>
-        <w:pStyle w:val="BodyText"/>
-      </w:pPr>
-      <w:r>
-        <w:t xml:space="preserve">This brief of appellee complies with the type-volume limitation of Fed. R. Bankr. P. 8015(a)(7)(B) because it contains 1,185 words, excluding the parts of the brief exempted by Fed. R. Bankr. P. 8015(g). It complies with the typeface requirement of Fed. R. Bankr. P. 8015(a)(5) and the type-style requirement of Fed. R. Bankr. P. 8015(a)(6) because it was prepared in a proportionally spaced typeface, EB Garamond at 14-point, with case names in italics.</w:t>
+        <w:pStyle w:val="CertText"/>
+      </w:pPr>
+      <w:r>
+        <w:t xml:space="preserve">This brief of appellee complies with the type-volume limitation of Fed. R. Bankr. P. 8015(a)(7)(B) because it contains 1,185 words, excluding the parts of the brief exempted by Fed. R. Bankr. P. 8015(g). It complies with the typeface requirement of Fed. R. Bankr. P. 8015(a)(5) and the type-style requirement of Fed. R. Bankr. P. 8015(a)(6) because it was prepared in a proportionally spaced typeface, Times New Roman at 14-point, with case names in italics.</w:t>
       </w:r>
     </w:p>
     <w:p>
@@ -856,7 +840,7 @@
     </w:p>
     <w:p>
       <w:pPr>
-        <w:pStyle w:val="FrontHeading"/>
+        <w:pStyle w:val="CertHeading"/>
       </w:pPr>
       <w:r>
         <w:t xml:space="preserve">Certificate of Service</w:t>
@@ -864,10 +848,10 @@
     </w:p>
     <w:p>
       <w:pPr>
-        <w:pStyle w:val="BodyText"/>
-      </w:pPr>
-      <w:r>
-        <w:t xml:space="preserve">I certify that on August 30, 2019 I filed this brief of appellee with the Clerk of the Bankruptcy Appellate Panel of the Sixth Circuit through the court's electronic filing system, which will send notice of the filing to all counsel of record.</w:t>
+        <w:pStyle w:val="CertText"/>
+      </w:pPr>
+      <w:r>
+        <w:t xml:space="preserve">I certify that on August 30, 2019 I filed this brief of appellee with the Clerk of the Bankruptcy Appellate Panel of the Sixth Circuit through the court’s electronic filing system, which will send notice of the filing to all counsel of record.</w:t>
       </w:r>
     </w:p>
     <w:p>
@@ -910,11 +894,10 @@
         <w:t xml:space="preserve">August 30, 2019</w:t>
       </w:r>
     </w:p>
-    <w:bookmarkEnd w:id="27"/>
     <w:sectPr>
-      <w:footerReference r:id="rId9" w:type="default"/>
-      <w:pgSz w:h="15840" w:w="12240"/>
-      <w:pgMar w:bottom="1440" w:footer="720" w:gutter="0" w:header="720" w:left="1440" w:right="1440" w:top="1440"/>
+      <w:footerReference w:type="default" r:id="rIdFtrPage"/>
+      <w:pgSz w:w="12240" w:h="15840"/>
+      <w:pgMar w:top="1440" w:right="1440" w:bottom="1440" w:left="1440" w:header="720" w:footer="720" w:gutter="0"/>
       <w:pgNumType w:fmt="decimal" w:start="1"/>
       <w:cols w:space="720"/>
     </w:sectPr>
@@ -926,12 +909,35 @@
 <w:comments xmlns:w="http://schemas.openxmlformats.org/wordprocessingml/2006/main" xmlns:m="http://schemas.openxmlformats.org/officeDocument/2006/math" xmlns:r="http://schemas.openxmlformats.org/officeDocument/2006/relationships" xmlns:o="urn:schemas-microsoft-com:office:office" xmlns:v="urn:schemas-microsoft-com:vml" xmlns:w10="urn:schemas-microsoft-com:office:word" xmlns:a="http://schemas.openxmlformats.org/drawingml/2006/main" xmlns:pic="http://schemas.openxmlformats.org/drawingml/2006/picture" xmlns:wp="http://schemas.openxmlformats.org/drawingml/2006/wordprocessingDrawing"/>
 </file>
 
-<file path=word/footer1.xml><?xml version="1.0" encoding="utf-8"?>
+<file path=word/footnotes.xml><?xml version="1.0" encoding="utf-8"?>
+<w:footnotes xmlns:w="http://schemas.openxmlformats.org/wordprocessingml/2006/main" xmlns:m="http://schemas.openxmlformats.org/officeDocument/2006/math" xmlns:r="http://schemas.openxmlformats.org/officeDocument/2006/relationships" xmlns:o="urn:schemas-microsoft-com:office:office" xmlns:v="urn:schemas-microsoft-com:vml" xmlns:w10="urn:schemas-microsoft-com:office:word" xmlns:a="http://schemas.openxmlformats.org/drawingml/2006/main" xmlns:pic="http://schemas.openxmlformats.org/drawingml/2006/picture" xmlns:wp="http://schemas.openxmlformats.org/drawingml/2006/wordprocessingDrawing">
+  <w:footnote w:type="continuationSeparator" w:id="0">
+    <w:p>
+      <w:r>
+        <w:continuationSeparator/>
+      </w:r>
+    </w:p>
+  </w:footnote>
+  <w:footnote w:type="separator" w:id="-1">
+    <w:p>
+      <w:r>
+        <w:separator/>
+      </w:r>
+    </w:p>
+  </w:footnote>
+</w:footnotes>
+</file>
+
+<file path=word/ftr-add.xml><?xml version="1.0" encoding="utf-8"?>
 <w:ftr xmlns:w="http://schemas.openxmlformats.org/wordprocessingml/2006/main" xmlns:r="http://schemas.openxmlformats.org/officeDocument/2006/relationships">
   <w:p>
     <w:pPr>
-      <w:pStyle w:val="Footer"/>
-    </w:pPr>
+      <w:spacing w:before="0" w:after="0"/>
+      <w:jc w:val="center"/>
+    </w:pPr>
+    <w:r>
+      <w:t>Add-</w:t>
+    </w:r>
     <w:r>
       <w:fldChar w:fldCharType="begin"/>
     </w:r>
@@ -951,23 +957,41 @@
 </w:ftr>
 </file>
 
-<file path=word/footnotes.xml><?xml version="1.0" encoding="utf-8"?>
-<w:footnotes xmlns:w="http://schemas.openxmlformats.org/wordprocessingml/2006/main" xmlns:m="http://schemas.openxmlformats.org/officeDocument/2006/math" xmlns:r="http://schemas.openxmlformats.org/officeDocument/2006/relationships" xmlns:o="urn:schemas-microsoft-com:office:office" xmlns:v="urn:schemas-microsoft-com:vml" xmlns:w10="urn:schemas-microsoft-com:office:word" xmlns:a="http://schemas.openxmlformats.org/drawingml/2006/main" xmlns:pic="http://schemas.openxmlformats.org/drawingml/2006/picture" xmlns:wp="http://schemas.openxmlformats.org/drawingml/2006/wordprocessingDrawing">
-  <w:footnote w:type="continuationSeparator" w:id="0">
-    <w:p>
-      <w:r>
-        <w:continuationSeparator/>
-      </w:r>
-    </w:p>
-  </w:footnote>
-  <w:footnote w:type="separator" w:id="-1">
-    <w:p>
-      <w:r>
-        <w:separator/>
-      </w:r>
-    </w:p>
-  </w:footnote>
-</w:footnotes>
+<file path=word/ftr-none.xml><?xml version="1.0" encoding="utf-8"?>
+<w:ftr xmlns:w="http://schemas.openxmlformats.org/wordprocessingml/2006/main" xmlns:r="http://schemas.openxmlformats.org/officeDocument/2006/relationships">
+  <w:p>
+    <w:pPr>
+      <w:spacing w:before="0" w:after="0"/>
+      <w:jc w:val="center"/>
+    </w:pPr>
+  </w:p>
+</w:ftr>
+</file>
+
+<file path=word/ftr-page.xml><?xml version="1.0" encoding="utf-8"?>
+<w:ftr xmlns:w="http://schemas.openxmlformats.org/wordprocessingml/2006/main" xmlns:r="http://schemas.openxmlformats.org/officeDocument/2006/relationships">
+  <w:p>
+    <w:pPr>
+      <w:spacing w:before="0" w:after="0"/>
+      <w:jc w:val="center"/>
+    </w:pPr>
+    <w:r>
+      <w:fldChar w:fldCharType="begin"/>
+    </w:r>
+    <w:r>
+      <w:instrText xml:space="preserve"> PAGE </w:instrText>
+    </w:r>
+    <w:r>
+      <w:fldChar w:fldCharType="separate"/>
+    </w:r>
+    <w:r>
+      <w:t>1</w:t>
+    </w:r>
+    <w:r>
+      <w:fldChar w:fldCharType="end"/>
+    </w:r>
+  </w:p>
+</w:ftr>
 </file>
 
 <file path=word/numbering.xml><?xml version="1.0" encoding="utf-8"?>
@@ -1059,46 +1083,148 @@
   <w:docDefaults>
     <w:rPrDefault>
       <w:rPr>
-        <w:rFonts w:ascii="EB Garamond" w:cs="EB Garamond" w:eastAsia="EB Garamond" w:hAnsi="EB Garamond"/>
+        <w:rFonts w:ascii="Times New Roman" w:hAnsi="Times New Roman" w:eastAsia="Times New Roman" w:cs="Times New Roman"/>
         <w:sz w:val="28"/>
         <w:szCs w:val="28"/>
-        <w:lang w:bidi="ar-SA" w:eastAsia="en-US" w:val="en-US"/>
+        <w:lang w:val="en-US" w:eastAsia="en-US" w:bidi="ar-SA"/>
       </w:rPr>
     </w:rPrDefault>
     <w:pPrDefault>
       <w:pPr>
-        <w:spacing w:after="0" w:line="364" w:lineRule="exact"/>
+        <w:spacing w:before="0" w:after="0" w:line="376" w:lineRule="exact"/>
       </w:pPr>
     </w:pPrDefault>
   </w:docDefaults>
-  <w:latentStyles w:count="276" w:defLockedState="0" w:defQFormat="0" w:defSemiHidden="0" w:defUIPriority="0" w:defUnhideWhenUsed="0"/>
-  <w:style w:customStyle="1" w:styleId="TitleChar" w:type="character">
+  <w:latentStyles w:defLockedState="0" w:defUIPriority="0" w:defSemiHidden="0" w:defUnhideWhenUsed="0" w:defQFormat="0" w:count="276"/>
+  <w:style w:type="paragraph" w:default="1" w:styleId="Normal">
+    <w:name w:val="Normal"/>
+    <w:qFormat/>
+    <w:pPr>
+      <w:spacing w:before="0" w:after="0" w:line="376" w:lineRule="exact"/>
+      <w:ind w:firstLine="0"/>
+    </w:pPr>
+  </w:style>
+  <w:style w:type="paragraph" w:styleId="BodyText">
+    <w:name w:val="Body Text"/>
+    <w:basedOn w:val="Normal"/>
+    <w:link w:val="BodyTextChar"/>
+    <w:qFormat/>
+    <w:pPr>
+      <w:spacing w:before="0" w:after="0" w:line="742" w:lineRule="exact"/>
+      <w:ind w:firstLine="720"/>
+    </w:pPr>
+  </w:style>
+  <w:style w:type="paragraph" w:styleId="FirstParagraph">
+    <w:name w:val="First Paragraph"/>
+    <w:basedOn w:val="BodyText"/>
+    <w:next w:val="BodyText"/>
+    <w:qFormat/>
+    <w:pPr>
+      <w:ind w:firstLine="0"/>
+    </w:pPr>
+  </w:style>
+  <w:style w:type="paragraph" w:customStyle="1" w:styleId="Compact">
+    <w:name w:val="Compact"/>
+    <w:basedOn w:val="BodyText"/>
+    <w:qFormat/>
+    <w:pPr>
+      <w:ind w:firstLine="0"/>
+    </w:pPr>
+  </w:style>
+  <w:style w:type="paragraph" w:styleId="Title">
+    <w:name w:val="Title"/>
+    <w:basedOn w:val="Normal"/>
+    <w:next w:val="BodyText"/>
+    <w:link w:val="TitleChar"/>
+    <w:uiPriority w:val="10"/>
+    <w:qFormat/>
+    <w:rsid w:val="00A10FD9"/>
+    <w:pPr>
+      <w:spacing w:after="80" w:line="240" w:lineRule="auto"/>
+      <w:contextualSpacing/>
+      <w:jc w:val="center"/>
+    </w:pPr>
+    <w:rPr>
+      <w:rFonts w:cstheme="majorBidi"/>
+      <w:sz w:val="56"/>
+      <w:szCs w:val="56"/>
+    </w:rPr>
+  </w:style>
+  <w:style w:type="character" w:customStyle="1" w:styleId="TitleChar">
     <w:name w:val="Title Char"/>
     <w:basedOn w:val="DefaultParagraphFont"/>
     <w:link w:val="Title"/>
     <w:uiPriority w:val="10"/>
     <w:rsid w:val="00A10FD9"/>
     <w:rPr>
-      <w:rFonts w:asciiTheme="majorHAnsi" w:cstheme="majorBidi" w:eastAsiaTheme="majorEastAsia" w:hAnsiTheme="majorHAnsi"/>
+      <w:rFonts w:cstheme="majorBidi"/>
       <w:sz w:val="56"/>
       <w:szCs w:val="56"/>
     </w:rPr>
   </w:style>
-  <w:style w:customStyle="1" w:styleId="SubtitleChar" w:type="character">
+  <w:style w:type="paragraph" w:styleId="Subtitle">
+    <w:name w:val="Subtitle"/>
+    <w:basedOn w:val="Title"/>
+    <w:next w:val="BodyText"/>
+    <w:link w:val="SubtitleChar"/>
+    <w:uiPriority w:val="11"/>
+    <w:qFormat/>
+    <w:rsid w:val="00A10FD9"/>
+    <w:pPr>
+      <w:numPr>
+        <w:ilvl w:val="1"/>
+      </w:numPr>
+    </w:pPr>
+    <w:rPr>
+      <w:rFonts w:cstheme="majorBidi"/>
+      <w:spacing w:val="15"/>
+      <w:sz w:val="28"/>
+      <w:szCs w:val="28"/>
+    </w:rPr>
+  </w:style>
+  <w:style w:type="character" w:customStyle="1" w:styleId="SubtitleChar">
     <w:name w:val="Subtitle Char"/>
     <w:basedOn w:val="DefaultParagraphFont"/>
     <w:link w:val="Subtitle"/>
     <w:uiPriority w:val="11"/>
     <w:rsid w:val="00A10FD9"/>
     <w:rPr>
-      <w:rFonts w:cstheme="majorBidi" w:eastAsiaTheme="majorEastAsia"/>
-      <w:color w:themeColor="text1" w:themeTint="A6" w:val="595959"/>
+      <w:rFonts w:cstheme="majorBidi"/>
+      <w:color w:val="595959" w:themeColor="text1" w:themeTint="A6"/>
       <w:spacing w:val="15"/>
       <w:sz w:val="28"/>
       <w:szCs w:val="28"/>
     </w:rPr>
   </w:style>
-  <w:style w:customStyle="1" w:styleId="AbstractTitle" w:type="paragraph">
+  <w:style w:type="paragraph" w:customStyle="1" w:styleId="Author">
+    <w:name w:val="Author"/>
+    <w:basedOn w:val="Title"/>
+    <w:next w:val="BodyText"/>
+    <w:qFormat/>
+    <w:pPr>
+      <w:keepNext/>
+      <w:keepLines/>
+    </w:pPr>
+    <w:rPr>
+      <w:sz w:val="24"/>
+      <w:szCs w:val="24"/>
+    </w:rPr>
+  </w:style>
+  <w:style w:type="paragraph" w:styleId="Date">
+    <w:name w:val="Date"/>
+    <w:basedOn w:val="Title"/>
+    <w:next w:val="BodyText"/>
+    <w:qFormat/>
+    <w:pPr>
+      <w:keepNext/>
+      <w:keepLines/>
+    </w:pPr>
+    <w:rPr>
+      <w:sz w:val="24"/>
+      <w:szCs w:val="24"/>
+    </w:rPr>
+  </w:style>
+  <w:style w:type="paragraph" w:customStyle="1" w:styleId="AbstractTitle">
     <w:name w:val="Abstract Title"/>
     <w:basedOn w:val="Normal"/>
     <w:next w:val="Abstract"/>
@@ -1106,7 +1232,7 @@
     <w:pPr>
       <w:keepNext/>
       <w:keepLines/>
-      <w:spacing w:after="0" w:before="300"/>
+      <w:spacing w:before="300" w:after="0"/>
       <w:jc w:val="center"/>
     </w:pPr>
     <w:rPr>
@@ -1115,7 +1241,22 @@
       <w:szCs w:val="20"/>
     </w:rPr>
   </w:style>
-  <w:style w:styleId="Bibliography" w:type="paragraph">
+  <w:style w:type="paragraph" w:customStyle="1" w:styleId="Abstract">
+    <w:name w:val="Abstract"/>
+    <w:basedOn w:val="Normal"/>
+    <w:next w:val="BodyText"/>
+    <w:qFormat/>
+    <w:pPr>
+      <w:keepNext/>
+      <w:keepLines/>
+      <w:spacing w:before="100" w:after="300"/>
+    </w:pPr>
+    <w:rPr>
+      <w:sz w:val="20"/>
+      <w:szCs w:val="20"/>
+    </w:rPr>
+  </w:style>
+  <w:style w:type="paragraph" w:styleId="Bibliography">
     <w:name w:val="Bibliography"/>
     <w:basedOn w:val="Normal"/>
     <w:next w:val="Bibliography"/>
@@ -1123,7 +1264,88 @@
     <w:pPr/>
     <w:rPr/>
   </w:style>
-  <w:style w:styleId="Heading5" w:type="paragraph">
+  <w:style w:type="paragraph" w:styleId="Heading1">
+    <w:name w:val="heading 1"/>
+    <w:basedOn w:val="Normal"/>
+    <w:next w:val="BodyText"/>
+    <w:uiPriority w:val="9"/>
+    <w:qFormat/>
+    <w:pPr>
+      <w:keepNext/>
+      <w:keepLines/>
+      <w:spacing w:before="349" w:after="0" w:line="527" w:lineRule="exact"/>
+      <w:ind w:firstLine="0"/>
+      <w:jc w:val="center"/>
+      <w:outlineLvl w:val="0"/>
+    </w:pPr>
+    <w:rPr>
+      <w:b/>
+      <w:bCs/>
+      <w:color w:val="000000"/>
+      <w:sz w:val="39"/>
+      <w:szCs w:val="39"/>
+    </w:rPr>
+  </w:style>
+  <w:style w:type="paragraph" w:styleId="Heading2">
+    <w:name w:val="heading 2"/>
+    <w:basedOn w:val="Normal"/>
+    <w:next w:val="BodyText"/>
+    <w:uiPriority w:val="9"/>
+    <w:qFormat/>
+    <w:pPr>
+      <w:keepNext/>
+      <w:keepLines/>
+      <w:spacing w:before="181" w:after="0" w:line="446" w:lineRule="exact"/>
+      <w:ind w:firstLine="0"/>
+      <w:outlineLvl w:val="1"/>
+    </w:pPr>
+    <w:rPr>
+      <w:b/>
+      <w:bCs/>
+      <w:color w:val="000000"/>
+      <w:sz w:val="34"/>
+      <w:szCs w:val="34"/>
+    </w:rPr>
+  </w:style>
+  <w:style w:type="paragraph" w:styleId="Heading3">
+    <w:name w:val="heading 3"/>
+    <w:basedOn w:val="Normal"/>
+    <w:next w:val="BodyText"/>
+    <w:uiPriority w:val="9"/>
+    <w:qFormat/>
+    <w:pPr>
+      <w:keepNext/>
+      <w:keepLines/>
+      <w:spacing w:before="160" w:after="0" w:line="372" w:lineRule="exact"/>
+      <w:ind w:left="720" w:firstLine="0"/>
+      <w:outlineLvl w:val="2"/>
+    </w:pPr>
+    <w:rPr>
+      <w:b/>
+      <w:bCs/>
+      <w:color w:val="000000"/>
+    </w:rPr>
+  </w:style>
+  <w:style w:type="paragraph" w:styleId="Heading4">
+    <w:name w:val="heading 4"/>
+    <w:basedOn w:val="Normal"/>
+    <w:next w:val="BodyText"/>
+    <w:uiPriority w:val="9"/>
+    <w:qFormat/>
+    <w:pPr>
+      <w:keepNext/>
+      <w:keepLines/>
+      <w:spacing w:before="160" w:after="0" w:line="376" w:lineRule="exact"/>
+      <w:ind w:left="1440" w:firstLine="0"/>
+      <w:outlineLvl w:val="3"/>
+    </w:pPr>
+    <w:rPr>
+      <w:i/>
+      <w:iCs/>
+      <w:color w:val="000000"/>
+    </w:rPr>
+  </w:style>
+  <w:style w:type="paragraph" w:styleId="Heading5">
     <w:name w:val="heading 5"/>
     <w:basedOn w:val="Normal"/>
     <w:next w:val="BodyText"/>
@@ -1136,15 +1358,15 @@
     <w:pPr>
       <w:keepNext/>
       <w:keepLines/>
-      <w:spacing w:after="40" w:before="80"/>
+      <w:spacing w:before="80" w:after="40"/>
       <w:outlineLvl w:val="4"/>
     </w:pPr>
     <w:rPr>
-      <w:rFonts w:cstheme="majorBidi" w:eastAsiaTheme="majorEastAsia"/>
-      <w:color w:themeColor="accent1" w:themeShade="BF" w:val="0F4761"/>
-    </w:rPr>
-  </w:style>
-  <w:style w:styleId="Heading6" w:type="paragraph">
+      <w:rFonts w:cstheme="majorBidi"/>
+      <w:color w:val="0F4761" w:themeColor="accent1" w:themeShade="BF"/>
+    </w:rPr>
+  </w:style>
+  <w:style w:type="paragraph" w:styleId="Heading6">
     <w:name w:val="heading 6"/>
     <w:basedOn w:val="Normal"/>
     <w:next w:val="BodyText"/>
@@ -1157,17 +1379,17 @@
     <w:pPr>
       <w:keepNext/>
       <w:keepLines/>
-      <w:spacing w:after="0" w:before="40"/>
+      <w:spacing w:before="40" w:after="0"/>
       <w:outlineLvl w:val="5"/>
     </w:pPr>
     <w:rPr>
-      <w:rFonts w:cstheme="majorBidi" w:eastAsiaTheme="majorEastAsia"/>
+      <w:rFonts w:cstheme="majorBidi"/>
       <w:i/>
       <w:iCs/>
-      <w:color w:themeColor="text1" w:themeTint="A6" w:val="595959"/>
-    </w:rPr>
-  </w:style>
-  <w:style w:styleId="Heading7" w:type="paragraph">
+      <w:color w:val="595959" w:themeColor="text1" w:themeTint="A6"/>
+    </w:rPr>
+  </w:style>
+  <w:style w:type="paragraph" w:styleId="Heading7">
     <w:name w:val="heading 7"/>
     <w:basedOn w:val="Normal"/>
     <w:next w:val="BodyText"/>
@@ -1180,15 +1402,15 @@
     <w:pPr>
       <w:keepNext/>
       <w:keepLines/>
-      <w:spacing w:after="0" w:before="40"/>
+      <w:spacing w:before="40" w:after="0"/>
       <w:outlineLvl w:val="6"/>
     </w:pPr>
     <w:rPr>
-      <w:rFonts w:cstheme="majorBidi" w:eastAsiaTheme="majorEastAsia"/>
-      <w:color w:themeColor="text1" w:themeTint="A6" w:val="595959"/>
-    </w:rPr>
-  </w:style>
-  <w:style w:styleId="Heading8" w:type="paragraph">
+      <w:rFonts w:cstheme="majorBidi"/>
+      <w:color w:val="595959" w:themeColor="text1" w:themeTint="A6"/>
+    </w:rPr>
+  </w:style>
+  <w:style w:type="paragraph" w:styleId="Heading8">
     <w:name w:val="heading 8"/>
     <w:basedOn w:val="Normal"/>
     <w:next w:val="BodyText"/>
@@ -1205,13 +1427,13 @@
       <w:outlineLvl w:val="7"/>
     </w:pPr>
     <w:rPr>
-      <w:rFonts w:cstheme="majorBidi" w:eastAsiaTheme="majorEastAsia"/>
+      <w:rFonts w:cstheme="majorBidi"/>
       <w:i/>
       <w:iCs/>
-      <w:color w:themeColor="text1" w:themeTint="D8" w:val="272727"/>
-    </w:rPr>
-  </w:style>
-  <w:style w:styleId="Heading9" w:type="paragraph">
+      <w:color w:val="272727" w:themeColor="text1" w:themeTint="D8"/>
+    </w:rPr>
+  </w:style>
+  <w:style w:type="paragraph" w:styleId="Heading9">
     <w:name w:val="heading 9"/>
     <w:basedOn w:val="Normal"/>
     <w:next w:val="BodyText"/>
@@ -1228,24 +1450,24 @@
       <w:outlineLvl w:val="8"/>
     </w:pPr>
     <w:rPr>
-      <w:rFonts w:cstheme="majorBidi" w:eastAsiaTheme="majorEastAsia"/>
-      <w:color w:themeColor="text1" w:themeTint="D8" w:val="272727"/>
-    </w:rPr>
-  </w:style>
-  <w:style w:customStyle="1" w:styleId="Heading1Char" w:type="character">
+      <w:rFonts w:cstheme="majorBidi"/>
+      <w:color w:val="272727" w:themeColor="text1" w:themeTint="D8"/>
+    </w:rPr>
+  </w:style>
+  <w:style w:type="character" w:customStyle="1" w:styleId="Heading1Char">
     <w:name w:val="Heading 1 Char"/>
     <w:basedOn w:val="DefaultParagraphFont"/>
     <w:link w:val="Heading1"/>
     <w:uiPriority w:val="9"/>
     <w:rsid w:val="00A10FD9"/>
     <w:rPr>
-      <w:rFonts w:asciiTheme="majorHAnsi" w:cstheme="majorBidi" w:eastAsiaTheme="majorEastAsia" w:hAnsiTheme="majorHAnsi"/>
-      <w:color w:themeColor="accent1" w:themeShade="BF" w:val="0F4761"/>
+      <w:rFonts w:cstheme="majorBidi"/>
+      <w:color w:val="0F4761" w:themeColor="accent1" w:themeShade="BF"/>
       <w:sz w:val="40"/>
       <w:szCs w:val="40"/>
     </w:rPr>
   </w:style>
-  <w:style w:customStyle="1" w:styleId="Heading2Char" w:type="character">
+  <w:style w:type="character" w:customStyle="1" w:styleId="Heading2Char">
     <w:name w:val="Heading 2 Char"/>
     <w:basedOn w:val="DefaultParagraphFont"/>
     <w:link w:val="Heading2"/>
@@ -1253,13 +1475,13 @@
     <w:semiHidden/>
     <w:rsid w:val="00A10FD9"/>
     <w:rPr>
-      <w:rFonts w:asciiTheme="majorHAnsi" w:cstheme="majorBidi" w:eastAsiaTheme="majorEastAsia" w:hAnsiTheme="majorHAnsi"/>
-      <w:color w:themeColor="accent1" w:themeShade="BF" w:val="0F4761"/>
+      <w:rFonts w:cstheme="majorBidi"/>
+      <w:color w:val="0F4761" w:themeColor="accent1" w:themeShade="BF"/>
       <w:sz w:val="32"/>
       <w:szCs w:val="32"/>
     </w:rPr>
   </w:style>
-  <w:style w:customStyle="1" w:styleId="Heading3Char" w:type="character">
+  <w:style w:type="character" w:customStyle="1" w:styleId="Heading3Char">
     <w:name w:val="Heading 3 Char"/>
     <w:basedOn w:val="DefaultParagraphFont"/>
     <w:link w:val="Heading3"/>
@@ -1267,13 +1489,13 @@
     <w:semiHidden/>
     <w:rsid w:val="00A10FD9"/>
     <w:rPr>
-      <w:rFonts w:cstheme="majorBidi" w:eastAsiaTheme="majorEastAsia"/>
-      <w:color w:themeColor="accent1" w:themeShade="BF" w:val="0F4761"/>
+      <w:rFonts w:cstheme="majorBidi"/>
+      <w:color w:val="0F4761" w:themeColor="accent1" w:themeShade="BF"/>
       <w:sz w:val="28"/>
       <w:szCs w:val="28"/>
     </w:rPr>
   </w:style>
-  <w:style w:customStyle="1" w:styleId="Heading4Char" w:type="character">
+  <w:style w:type="character" w:customStyle="1" w:styleId="Heading4Char">
     <w:name w:val="Heading 4 Char"/>
     <w:basedOn w:val="DefaultParagraphFont"/>
     <w:link w:val="Heading4"/>
@@ -1281,13 +1503,13 @@
     <w:semiHidden/>
     <w:rsid w:val="00A10FD9"/>
     <w:rPr>
-      <w:rFonts w:cstheme="majorBidi" w:eastAsiaTheme="majorEastAsia"/>
+      <w:rFonts w:cstheme="majorBidi"/>
       <w:i/>
       <w:iCs/>
-      <w:color w:themeColor="accent1" w:themeShade="BF" w:val="0F4761"/>
-    </w:rPr>
-  </w:style>
-  <w:style w:customStyle="1" w:styleId="Heading5Char" w:type="character">
+      <w:color w:val="0F4761" w:themeColor="accent1" w:themeShade="BF"/>
+    </w:rPr>
+  </w:style>
+  <w:style w:type="character" w:customStyle="1" w:styleId="Heading5Char">
     <w:name w:val="Heading 5 Char"/>
     <w:basedOn w:val="DefaultParagraphFont"/>
     <w:link w:val="Heading5"/>
@@ -1295,11 +1517,11 @@
     <w:semiHidden/>
     <w:rsid w:val="00A10FD9"/>
     <w:rPr>
-      <w:rFonts w:cstheme="majorBidi" w:eastAsiaTheme="majorEastAsia"/>
-      <w:color w:themeColor="accent1" w:themeShade="BF" w:val="0F4761"/>
-    </w:rPr>
-  </w:style>
-  <w:style w:customStyle="1" w:styleId="Heading6Char" w:type="character">
+      <w:rFonts w:cstheme="majorBidi"/>
+      <w:color w:val="0F4761" w:themeColor="accent1" w:themeShade="BF"/>
+    </w:rPr>
+  </w:style>
+  <w:style w:type="character" w:customStyle="1" w:styleId="Heading6Char">
     <w:name w:val="Heading 6 Char"/>
     <w:basedOn w:val="DefaultParagraphFont"/>
     <w:link w:val="Heading6"/>
@@ -1307,13 +1529,13 @@
     <w:semiHidden/>
     <w:rsid w:val="00A10FD9"/>
     <w:rPr>
-      <w:rFonts w:cstheme="majorBidi" w:eastAsiaTheme="majorEastAsia"/>
+      <w:rFonts w:cstheme="majorBidi"/>
       <w:i/>
       <w:iCs/>
-      <w:color w:themeColor="text1" w:themeTint="A6" w:val="595959"/>
-    </w:rPr>
-  </w:style>
-  <w:style w:customStyle="1" w:styleId="Heading7Char" w:type="character">
+      <w:color w:val="595959" w:themeColor="text1" w:themeTint="A6"/>
+    </w:rPr>
+  </w:style>
+  <w:style w:type="character" w:customStyle="1" w:styleId="Heading7Char">
     <w:name w:val="Heading 7 Char"/>
     <w:basedOn w:val="DefaultParagraphFont"/>
     <w:link w:val="Heading7"/>
@@ -1321,11 +1543,11 @@
     <w:semiHidden/>
     <w:rsid w:val="00A10FD9"/>
     <w:rPr>
-      <w:rFonts w:cstheme="majorBidi" w:eastAsiaTheme="majorEastAsia"/>
-      <w:color w:themeColor="text1" w:themeTint="A6" w:val="595959"/>
-    </w:rPr>
-  </w:style>
-  <w:style w:customStyle="1" w:styleId="Heading8Char" w:type="character">
+      <w:rFonts w:cstheme="majorBidi"/>
+      <w:color w:val="595959" w:themeColor="text1" w:themeTint="A6"/>
+    </w:rPr>
+  </w:style>
+  <w:style w:type="character" w:customStyle="1" w:styleId="Heading8Char">
     <w:name w:val="Heading 8 Char"/>
     <w:basedOn w:val="DefaultParagraphFont"/>
     <w:link w:val="Heading8"/>
@@ -1333,13 +1555,13 @@
     <w:semiHidden/>
     <w:rsid w:val="00A10FD9"/>
     <w:rPr>
-      <w:rFonts w:cstheme="majorBidi" w:eastAsiaTheme="majorEastAsia"/>
+      <w:rFonts w:cstheme="majorBidi"/>
       <w:i/>
       <w:iCs/>
-      <w:color w:themeColor="text1" w:themeTint="D8" w:val="272727"/>
-    </w:rPr>
-  </w:style>
-  <w:style w:customStyle="1" w:styleId="Heading9Char" w:type="character">
+      <w:color w:val="272727" w:themeColor="text1" w:themeTint="D8"/>
+    </w:rPr>
+  </w:style>
+  <w:style w:type="character" w:customStyle="1" w:styleId="Heading9Char">
     <w:name w:val="Heading 9 Char"/>
     <w:basedOn w:val="DefaultParagraphFont"/>
     <w:link w:val="Heading9"/>
@@ -1347,11 +1569,35 @@
     <w:semiHidden/>
     <w:rsid w:val="00A10FD9"/>
     <w:rPr>
-      <w:rFonts w:cstheme="majorBidi" w:eastAsiaTheme="majorEastAsia"/>
-      <w:color w:themeColor="text1" w:themeTint="D8" w:val="272727"/>
-    </w:rPr>
-  </w:style>
-  <w:style w:styleId="FootnoteBlockText" w:type="paragraph">
+      <w:rFonts w:cstheme="majorBidi"/>
+      <w:color w:val="272727" w:themeColor="text1" w:themeTint="D8"/>
+    </w:rPr>
+  </w:style>
+  <w:style w:type="paragraph" w:styleId="BlockText">
+    <w:name w:val="Block Text"/>
+    <w:basedOn w:val="Normal"/>
+    <w:next w:val="BodyText"/>
+    <w:qFormat/>
+    <w:pPr>
+      <w:spacing w:before="280" w:after="392" w:line="376" w:lineRule="exact"/>
+      <w:ind w:left="720" w:right="720" w:firstLine="0"/>
+    </w:pPr>
+  </w:style>
+  <w:style w:type="paragraph" w:styleId="FootnoteText">
+    <w:name w:val="Footnote Text"/>
+    <w:basedOn w:val="Normal"/>
+    <w:uiPriority w:val="9"/>
+    <w:unhideWhenUsed/>
+    <w:pPr>
+      <w:spacing w:before="0" w:after="0" w:line="376" w:lineRule="exact"/>
+      <w:ind w:firstLine="0"/>
+    </w:pPr>
+    <w:rPr>
+      <w:sz w:val="28"/>
+      <w:szCs w:val="28"/>
+    </w:rPr>
+  </w:style>
+  <w:style w:type="paragraph" w:styleId="FootnoteBlockText">
     <w:name w:val="Footnote Block Text"/>
     <w:basedOn w:val="FootnoteText"/>
     <w:next w:val="FootnoteText"/>
@@ -1359,38 +1605,29 @@
     <w:unhideWhenUsed/>
     <w:qFormat/>
     <w:pPr>
-      <w:spacing w:after="100" w:before="100"/>
+      <w:spacing w:before="100" w:after="100"/>
       <w:ind w:firstLine="0" w:left="480" w:right="480"/>
     </w:pPr>
   </w:style>
-  <w:style w:default="1" w:styleId="DefaultParagraphFont" w:type="character">
+  <w:style w:type="character" w:default="1" w:styleId="DefaultParagraphFont">
     <w:name w:val="Default Paragraph Font"/>
     <w:semiHidden/>
     <w:unhideWhenUsed/>
   </w:style>
-  <w:style w:default="1" w:styleId="Table" w:type="table">
+  <w:style w:type="table" w:default="1" w:styleId="Table">
     <w:name w:val="Table"/>
     <w:basedOn w:val="TableNormal"/>
-    <w:semiHidden/>
-    <w:unhideWhenUsed/>
     <w:qFormat/>
     <w:tblPr>
-      <w:tblInd w:type="dxa" w:w="0"/>
+      <w:tblInd w:w="0" w:type="dxa"/>
       <w:tblCellMar>
-        <w:top w:type="dxa" w:w="0"/>
-        <w:left w:type="dxa" w:w="108"/>
-        <w:bottom w:type="dxa" w:w="0"/>
-        <w:right w:type="dxa" w:w="108"/>
+        <w:top w:w="0" w:type="dxa"/>
+        <w:left w:w="108" w:type="dxa"/>
+        <w:bottom w:w="0" w:type="dxa"/>
+        <w:right w:w="108" w:type="dxa"/>
       </w:tblCellMar>
     </w:tblPr>
     <w:tblStylePr w:type="firstRow">
-      <w:tblPr>
-        <w:jc w:val="left"/>
-        <w:tblInd w:type="dxa" w:w="0"/>
-      </w:tblPr>
-      <w:trPr>
-        <w:jc w:val="left"/>
-      </w:trPr>
       <w:tcPr>
         <w:tcBorders>
           <w:bottom w:val="single"/>
@@ -1399,7 +1636,7 @@
       </w:tcPr>
     </w:tblStylePr>
   </w:style>
-  <w:style w:customStyle="1" w:styleId="DefinitionTerm" w:type="paragraph">
+  <w:style w:type="paragraph" w:customStyle="1" w:styleId="DefinitionTerm">
     <w:name w:val="Definition Term"/>
     <w:basedOn w:val="Normal"/>
     <w:next w:val="Definition"/>
@@ -1412,49 +1649,49 @@
       <w:b/>
     </w:rPr>
   </w:style>
-  <w:style w:customStyle="1" w:styleId="Definition" w:type="paragraph">
+  <w:style w:type="paragraph" w:customStyle="1" w:styleId="Definition">
     <w:name w:val="Definition"/>
     <w:basedOn w:val="Normal"/>
   </w:style>
-  <w:style w:styleId="Caption" w:type="paragraph">
+  <w:style w:type="paragraph" w:styleId="Caption">
     <w:name w:val="Caption"/>
     <w:basedOn w:val="Normal"/>
     <w:link w:val="BodyTextChar"/>
     <w:pPr>
-      <w:spacing w:after="120" w:before="0"/>
+      <w:spacing w:before="0" w:after="120"/>
     </w:pPr>
     <w:rPr>
       <w:i/>
     </w:rPr>
   </w:style>
-  <w:style w:customStyle="1" w:styleId="TableCaption" w:type="paragraph">
+  <w:style w:type="paragraph" w:customStyle="1" w:styleId="TableCaption">
     <w:name w:val="Table Caption"/>
     <w:basedOn w:val="Caption"/>
     <w:pPr>
       <w:keepNext/>
     </w:pPr>
   </w:style>
-  <w:style w:customStyle="1" w:styleId="ImageCaption" w:type="paragraph">
+  <w:style w:type="paragraph" w:customStyle="1" w:styleId="ImageCaption">
     <w:name w:val="Image Caption"/>
     <w:basedOn w:val="Caption"/>
   </w:style>
-  <w:style w:customStyle="1" w:styleId="Figure" w:type="paragraph">
+  <w:style w:type="paragraph" w:customStyle="1" w:styleId="Figure">
     <w:name w:val="Figure"/>
     <w:basedOn w:val="Normal"/>
   </w:style>
-  <w:style w:customStyle="1" w:styleId="CaptionedFigure" w:type="paragraph">
+  <w:style w:type="paragraph" w:customStyle="1" w:styleId="CaptionedFigure">
     <w:name w:val="Captioned Figure"/>
     <w:basedOn w:val="Figure"/>
     <w:pPr>
       <w:keepNext/>
     </w:pPr>
   </w:style>
-  <w:style w:customStyle="1" w:styleId="BodyTextChar" w:type="character">
+  <w:style w:type="character" w:customStyle="1" w:styleId="BodyTextChar">
     <w:name w:val="Body Text Char"/>
     <w:basedOn w:val="DefaultParagraphFont"/>
     <w:link w:val="BodyText"/>
   </w:style>
-  <w:style w:customStyle="1" w:styleId="VerbatimChar" w:type="character">
+  <w:style w:type="character" w:customStyle="1" w:styleId="VerbatimChar">
     <w:name w:val="Verbatim Char"/>
     <w:basedOn w:val="BodyTextChar"/>
     <w:rPr>
@@ -1462,25 +1699,25 @@
       <w:sz w:val="22"/>
     </w:rPr>
   </w:style>
-  <w:style w:customStyle="1" w:styleId="SectionNumber" w:type="character">
+  <w:style w:type="character" w:customStyle="1" w:styleId="SectionNumber">
     <w:name w:val="Section Number"/>
     <w:basedOn w:val="BodyTextChar"/>
   </w:style>
-  <w:style w:styleId="FootnoteReference" w:type="character">
+  <w:style w:type="character" w:styleId="FootnoteReference">
     <w:name w:val="Footnote Reference"/>
     <w:basedOn w:val="BodyTextChar"/>
     <w:rPr>
       <w:vertAlign w:val="superscript"/>
     </w:rPr>
   </w:style>
-  <w:style w:styleId="Hyperlink" w:type="character">
+  <w:style w:type="character" w:styleId="Hyperlink">
     <w:name w:val="Hyperlink"/>
     <w:basedOn w:val="BodyTextChar"/>
     <w:rPr>
-      <w:color w:themeColor="accent1" w:val="4F81BD"/>
-    </w:rPr>
-  </w:style>
-  <w:style w:styleId="TOCHeading" w:type="paragraph">
+      <w:color w:val="4F81BD" w:themeColor="accent1"/>
+    </w:rPr>
+  </w:style>
+  <w:style w:type="paragraph" w:styleId="TOCHeading">
     <w:name w:val="TOC Heading"/>
     <w:basedOn w:val="Heading1"/>
     <w:next w:val="BodyText"/>
@@ -1492,145 +1729,32 @@
       <w:outlineLvl w:val="9"/>
     </w:pPr>
     <w:rPr>
-      <w:rFonts w:asciiTheme="majorHAnsi" w:cstheme="majorBidi" w:eastAsiaTheme="majorEastAsia" w:hAnsiTheme="majorHAnsi"/>
+      <w:rFonts w:cstheme="majorBidi"/>
       <w:b w:val="0"/>
       <w:bCs w:val="0"/>
-      <w:color w:themeColor="accent1" w:themeShade="BF" w:val="365F91"/>
-    </w:rPr>
-  </w:style>
-  <w:style w:default="1" w:styleId="Normal" w:type="paragraph">
-    <w:name w:val="Normal"/>
-    <w:qFormat/>
-    <w:pPr>
-      <w:spacing w:after="0" w:before="0" w:line="364" w:lineRule="exact"/>
-      <w:ind w:firstLine="0"/>
-    </w:pPr>
-  </w:style>
-  <w:style w:styleId="BodyText" w:type="paragraph">
-    <w:name w:val="Body Text"/>
-    <w:basedOn w:val="Normal"/>
-    <w:link w:val="BodyTextChar"/>
-    <w:qFormat/>
-    <w:pPr>
-      <w:spacing w:after="0" w:before="0" w:line="728" w:lineRule="exact"/>
-      <w:ind w:firstLine="720"/>
-    </w:pPr>
-  </w:style>
-  <w:style w:styleId="FirstParagraph" w:type="paragraph">
-    <w:name w:val="First Paragraph"/>
-    <w:basedOn w:val="BodyText"/>
-    <w:next w:val="BodyText"/>
-    <w:qFormat/>
-    <w:pPr>
-      <w:ind w:firstLine="0"/>
-    </w:pPr>
-  </w:style>
-  <w:style w:customStyle="1" w:styleId="Compact" w:type="paragraph">
-    <w:name w:val="Compact"/>
-    <w:basedOn w:val="BodyText"/>
-    <w:qFormat/>
-    <w:pPr>
-      <w:ind w:firstLine="0"/>
-    </w:pPr>
-  </w:style>
-  <w:style w:styleId="BlockText" w:type="paragraph">
-    <w:name w:val="Block Text"/>
-    <w:basedOn w:val="Normal"/>
-    <w:next w:val="BodyText"/>
-    <w:qFormat/>
-    <w:pPr>
-      <w:spacing w:after="392" w:before="280" w:line="364" w:lineRule="exact"/>
-      <w:ind w:firstLine="0" w:left="720" w:right="720"/>
-    </w:pPr>
-  </w:style>
-  <w:style w:styleId="Heading1" w:type="paragraph">
-    <w:name w:val="heading 1"/>
-    <w:basedOn w:val="Normal"/>
-    <w:next w:val="BodyText"/>
+      <w:color w:val="365F91" w:themeColor="accent1" w:themeShade="BF"/>
+    </w:rPr>
+  </w:style>
+  <w:style w:type="paragraph" w:customStyle="1" w:styleId="CertText">
+    <w:name w:val="Cert Text"/>
+    <w:basedOn w:val="FirstParagraph"/>
     <w:qFormat/>
     <w:pPr>
       <w:keepNext/>
       <w:keepLines/>
-      <w:spacing w:after="336" w:before="448" w:line="510" w:lineRule="exact"/>
-      <w:ind w:firstLine="0"/>
-      <w:jc w:val="center"/>
+    </w:pPr>
+  </w:style>
+  <w:style w:type="paragraph" w:customStyle="1" w:styleId="Heading1Top">
+    <w:name w:val="Heading 1 Top"/>
+    <w:basedOn w:val="Heading1"/>
+    <w:next w:val="FirstParagraph"/>
+    <w:qFormat/>
+    <w:pPr>
+      <w:spacing w:before="0"/>
       <w:outlineLvl w:val="0"/>
     </w:pPr>
-    <w:rPr>
-      <w:b/>
-      <w:bCs/>
-      <w:sz w:val="39"/>
-      <w:szCs w:val="39"/>
-    </w:rPr>
-  </w:style>
-  <w:style w:styleId="Heading2" w:type="paragraph">
-    <w:name w:val="heading 2"/>
-    <w:basedOn w:val="Normal"/>
-    <w:next w:val="BodyText"/>
-    <w:qFormat/>
-    <w:pPr>
-      <w:keepNext/>
-      <w:keepLines/>
-      <w:spacing w:after="280" w:before="336" w:line="437" w:lineRule="exact"/>
-      <w:ind w:firstLine="0"/>
-      <w:outlineLvl w:val="1"/>
-    </w:pPr>
-    <w:rPr>
-      <w:b/>
-      <w:bCs/>
-      <w:sz w:val="34"/>
-      <w:szCs w:val="34"/>
-    </w:rPr>
-  </w:style>
-  <w:style w:styleId="Heading3" w:type="paragraph">
-    <w:name w:val="heading 3"/>
-    <w:basedOn w:val="Normal"/>
-    <w:next w:val="BodyText"/>
-    <w:qFormat/>
-    <w:pPr>
-      <w:keepNext/>
-      <w:keepLines/>
-      <w:spacing w:after="280" w:before="308" w:line="364" w:lineRule="exact"/>
-      <w:ind w:firstLine="0" w:left="720"/>
-      <w:outlineLvl w:val="2"/>
-    </w:pPr>
-    <w:rPr>
-      <w:b/>
-      <w:bCs/>
-    </w:rPr>
-  </w:style>
-  <w:style w:styleId="Heading4" w:type="paragraph">
-    <w:name w:val="heading 4"/>
-    <w:basedOn w:val="Normal"/>
-    <w:next w:val="BodyText"/>
-    <w:qFormat/>
-    <w:pPr>
-      <w:keepNext/>
-      <w:keepLines/>
-      <w:spacing w:after="280" w:before="280" w:line="364" w:lineRule="exact"/>
-      <w:ind w:firstLine="0" w:left="1440"/>
-      <w:outlineLvl w:val="3"/>
-    </w:pPr>
-    <w:rPr>
-      <w:i/>
-      <w:iCs/>
-    </w:rPr>
-  </w:style>
-  <w:style w:styleId="FootnoteText" w:type="paragraph">
-    <w:name w:val="Footnote Text"/>
-    <w:basedOn w:val="Normal"/>
-    <w:uiPriority w:val="9"/>
-    <w:unhideWhenUsed/>
-    <w:pPr>
-      <w:spacing w:after="0" w:before="0" w:line="364" w:lineRule="exact"/>
-      <w:ind w:firstLine="0"/>
-    </w:pPr>
-    <w:rPr>
-      <w:sz w:val="28"/>
-      <w:szCs w:val="28"/>
-    </w:rPr>
-  </w:style>
-  <w:style w:customStyle="1" w:styleId="Centered" w:type="paragraph">
+  </w:style>
+  <w:style w:type="paragraph" w:customStyle="1" w:styleId="Centered">
     <w:name w:val="Centered"/>
     <w:basedOn w:val="Normal"/>
     <w:qFormat/>
@@ -1638,20 +1762,28 @@
       <w:jc w:val="center"/>
     </w:pPr>
   </w:style>
-  <w:style w:customStyle="1" w:styleId="CoverGap" w:type="paragraph">
+  <w:style w:type="paragraph" w:customStyle="1" w:styleId="CoverGap">
     <w:name w:val="CoverGap"/>
     <w:basedOn w:val="Centered"/>
     <w:qFormat/>
     <w:pPr>
-      <w:spacing w:before="392"/>
-    </w:pPr>
-  </w:style>
-  <w:style w:customStyle="1" w:styleId="CoverTitle" w:type="paragraph">
+      <w:spacing w:before="70"/>
+    </w:pPr>
+  </w:style>
+  <w:style w:type="paragraph" w:customStyle="1" w:styleId="CoverWide">
+    <w:name w:val="CoverWide"/>
+    <w:basedOn w:val="Centered"/>
+    <w:qFormat/>
+    <w:pPr>
+      <w:spacing w:before="758"/>
+    </w:pPr>
+  </w:style>
+  <w:style w:type="paragraph" w:customStyle="1" w:styleId="CoverTitle">
     <w:name w:val="CoverTitle"/>
     <w:basedOn w:val="Centered"/>
     <w:qFormat/>
     <w:pPr>
-      <w:spacing w:before="392"/>
+      <w:spacing w:before="600" w:line="420" w:lineRule="exact"/>
     </w:pPr>
     <w:rPr>
       <w:b/>
@@ -1661,32 +1793,60 @@
       <w:szCs w:val="32"/>
     </w:rPr>
   </w:style>
-  <w:style w:customStyle="1" w:styleId="CoverBottom" w:type="paragraph">
+  <w:style w:type="paragraph" w:customStyle="1" w:styleId="CoverBottom">
     <w:name w:val="CoverBottom"/>
     <w:basedOn w:val="Centered"/>
     <w:qFormat/>
     <w:pPr>
-      <w:spacing w:after="252" w:before="1440"/>
-    </w:pPr>
-  </w:style>
-  <w:style w:customStyle="1" w:styleId="Single" w:type="paragraph">
+      <w:spacing w:before="360"/>
+    </w:pPr>
+  </w:style>
+  <w:style w:type="paragraph" w:customStyle="1" w:styleId="CoverGroup">
+    <w:name w:val="CoverGroup"/>
+    <w:basedOn w:val="Centered"/>
+    <w:qFormat/>
+    <w:pPr>
+      <w:spacing w:before="360"/>
+    </w:pPr>
+  </w:style>
+  <w:style w:type="paragraph" w:customStyle="1" w:styleId="CoverDate">
+    <w:name w:val="CoverDate"/>
+    <w:basedOn w:val="Centered"/>
+    <w:qFormat/>
+    <w:pPr>
+      <w:spacing w:before="160"/>
+    </w:pPr>
+  </w:style>
+  <w:style w:type="paragraph" w:customStyle="1" w:styleId="SectionEnd">
+    <w:name w:val="SectionEnd"/>
+    <w:basedOn w:val="Normal"/>
+    <w:qFormat/>
+    <w:pPr>
+      <w:spacing w:before="0" w:after="0" w:line="20" w:lineRule="exact"/>
+    </w:pPr>
+    <w:rPr>
+      <w:sz w:val="2"/>
+      <w:szCs w:val="2"/>
+    </w:rPr>
+  </w:style>
+  <w:style w:type="paragraph" w:customStyle="1" w:styleId="Single">
     <w:name w:val="Single"/>
     <w:basedOn w:val="Normal"/>
     <w:qFormat/>
     <w:pPr>
-      <w:spacing w:after="0" w:before="0" w:line="364" w:lineRule="exact"/>
+      <w:spacing w:before="0" w:after="0" w:line="376" w:lineRule="exact"/>
       <w:ind w:firstLine="0"/>
     </w:pPr>
   </w:style>
-  <w:style w:customStyle="1" w:styleId="FrontHeading" w:type="paragraph">
+  <w:style w:type="paragraph" w:customStyle="1" w:styleId="FrontHeading">
     <w:name w:val="FrontHeading"/>
     <w:basedOn w:val="Normal"/>
-    <w:next w:val="BodyText"/>
+    <w:next w:val="FirstParagraph"/>
     <w:qFormat/>
     <w:pPr>
       <w:keepNext/>
       <w:keepLines/>
-      <w:spacing w:after="336" w:before="448" w:line="510" w:lineRule="exact"/>
+      <w:spacing w:before="0" w:after="0" w:line="527" w:lineRule="exact"/>
       <w:ind w:firstLine="0"/>
       <w:jc w:val="center"/>
     </w:pPr>
@@ -1697,7 +1857,15 @@
       <w:szCs w:val="39"/>
     </w:rPr>
   </w:style>
-  <w:style w:customStyle="1" w:styleId="FrontHeadingBreak" w:type="paragraph">
+  <w:style w:type="paragraph" w:customStyle="1" w:styleId="CertHeading">
+    <w:name w:val="CertHeading"/>
+    <w:basedOn w:val="FrontHeading"/>
+    <w:qFormat/>
+    <w:pPr>
+      <w:spacing w:before="349"/>
+    </w:pPr>
+  </w:style>
+  <w:style w:type="paragraph" w:customStyle="1" w:styleId="FrontHeadingBreak">
     <w:name w:val="FrontHeadingBreak"/>
     <w:basedOn w:val="FrontHeading"/>
     <w:qFormat/>
@@ -1705,116 +1873,137 @@
       <w:pageBreakBefore/>
     </w:pPr>
   </w:style>
-  <w:style w:customStyle="1" w:styleId="OutlineBreak" w:type="paragraph">
-    <w:name w:val="OutlineBreak"/>
-    <w:basedOn w:val="Heading1"/>
+  <w:style w:type="paragraph" w:customStyle="1" w:styleId="ContentsHeading">
+    <w:name w:val="ContentsHeading"/>
+    <w:basedOn w:val="FrontHeading"/>
+    <w:qFormat/>
+    <w:pPr>
+      <w:spacing w:after="305"/>
+    </w:pPr>
+  </w:style>
+  <w:style w:type="paragraph" w:customStyle="1" w:styleId="ContentsHeadingBreak">
+    <w:name w:val="ContentsHeadingBreak"/>
+    <w:basedOn w:val="ContentsHeading"/>
     <w:qFormat/>
     <w:pPr>
       <w:pageBreakBefore/>
-      <w:outlineLvl w:val="0"/>
-    </w:pPr>
-  </w:style>
-  <w:style w:customStyle="1" w:styleId="AuthorityKind" w:type="paragraph">
+    </w:pPr>
+  </w:style>
+  <w:style w:type="paragraph" w:customStyle="1" w:styleId="AuthoritiesHeading">
+    <w:name w:val="AuthoritiesHeading"/>
+    <w:basedOn w:val="FrontHeadingBreak"/>
+    <w:qFormat/>
+    <w:pPr>
+      <w:spacing w:before="0" w:after="143"/>
+    </w:pPr>
+  </w:style>
+  <w:style w:type="paragraph" w:customStyle="1" w:styleId="AuthorityKind">
     <w:name w:val="AuthorityKind"/>
-    <w:basedOn w:val="Normal"/>
-    <w:next w:val="AuthorityLine"/>
+    <w:basedOn w:val="Single"/>
+    <w:next w:val="TOAEntry"/>
     <w:qFormat/>
     <w:pPr>
       <w:keepNext/>
-      <w:spacing w:after="280" w:before="336" w:line="364" w:lineRule="exact"/>
-      <w:ind w:firstLine="0"/>
+      <w:spacing w:before="160" w:after="40"/>
     </w:pPr>
     <w:rPr>
       <w:b/>
       <w:bCs/>
     </w:rPr>
   </w:style>
-  <w:style w:customStyle="1" w:styleId="AuthorityLine" w:type="paragraph">
-    <w:name w:val="AuthorityLine"/>
+  <w:style w:type="paragraph" w:customStyle="1" w:styleId="TOAEntry">
+    <w:name w:val="TOA Entry"/>
     <w:basedOn w:val="Single"/>
     <w:qFormat/>
     <w:pPr>
-      <w:spacing w:after="280"/>
-      <w:ind w:hanging="720" w:left="720"/>
-    </w:pPr>
-  </w:style>
-  <w:style w:customStyle="1" w:styleId="Signature" w:type="paragraph">
+      <w:keepLines/>
+      <w:tabs>
+        <w:tab w:val="right" w:leader="dot" w:pos="9350"/>
+      </w:tabs>
+      <w:spacing w:after="0"/>
+      <w:ind w:left="720" w:right="720" w:hanging="720"/>
+    </w:pPr>
+  </w:style>
+  <w:style w:type="paragraph" w:customStyle="1" w:styleId="TOCEntry1">
+    <w:name w:val="TOC Entry 1"/>
+    <w:basedOn w:val="Single"/>
+    <w:qFormat/>
+    <w:pPr>
+      <w:keepLines/>
+      <w:tabs>
+        <w:tab w:val="right" w:pos="9350"/>
+      </w:tabs>
+      <w:spacing w:after="0"/>
+      <w:ind w:left="420" w:right="720" w:hanging="420"/>
+    </w:pPr>
+  </w:style>
+  <w:style w:type="paragraph" w:customStyle="1" w:styleId="TOCEntry2">
+    <w:name w:val="TOC Entry 2"/>
+    <w:basedOn w:val="TOCEntry1"/>
+    <w:qFormat/>
+    <w:pPr>
+      <w:ind w:left="840" w:right="720" w:hanging="420"/>
+    </w:pPr>
+  </w:style>
+  <w:style w:type="paragraph" w:customStyle="1" w:styleId="TOCEntry3">
+    <w:name w:val="TOC Entry 3"/>
+    <w:basedOn w:val="TOCEntry1"/>
+    <w:qFormat/>
+    <w:pPr>
+      <w:ind w:left="1260" w:right="720" w:hanging="420"/>
+    </w:pPr>
+  </w:style>
+  <w:style w:type="paragraph" w:customStyle="1" w:styleId="TOCEntry4">
+    <w:name w:val="TOC Entry 4"/>
+    <w:basedOn w:val="TOCEntry1"/>
+    <w:qFormat/>
+    <w:pPr>
+      <w:ind w:left="1680" w:right="720" w:hanging="420"/>
+    </w:pPr>
+  </w:style>
+  <w:style w:type="paragraph" w:customStyle="1" w:styleId="Signature">
     <w:name w:val="Signature"/>
     <w:basedOn w:val="Single"/>
     <w:qFormat/>
     <w:pPr>
       <w:keepNext/>
       <w:keepLines/>
-      <w:ind w:firstLine="0" w:left="4680"/>
-    </w:pPr>
-  </w:style>
-  <w:style w:customStyle="1" w:styleId="SignatureLead" w:type="paragraph">
+      <w:ind w:left="4680" w:firstLine="0"/>
+    </w:pPr>
+  </w:style>
+  <w:style w:type="paragraph" w:customStyle="1" w:styleId="SignatureLead">
     <w:name w:val="SignatureLead"/>
     <w:basedOn w:val="Signature"/>
     <w:qFormat/>
     <w:pPr>
-      <w:spacing w:after="336" w:before="448"/>
-    </w:pPr>
-  </w:style>
-  <w:style w:customStyle="1" w:styleId="SignatureDate" w:type="paragraph">
+      <w:spacing w:before="260" w:after="700"/>
+    </w:pPr>
+  </w:style>
+  <w:style w:type="paragraph" w:customStyle="1" w:styleId="SignatureDate">
     <w:name w:val="SignatureDate"/>
     <w:basedOn w:val="Signature"/>
     <w:qFormat/>
     <w:pPr>
-      <w:spacing w:before="224"/>
-    </w:pPr>
-  </w:style>
-  <w:style w:styleId="TOC1" w:type="paragraph">
-    <w:name w:val="toc 1"/>
-    <w:basedOn w:val="Single"/>
-    <w:next w:val="Normal"/>
-    <w:uiPriority w:val="39"/>
-    <w:unhideWhenUsed/>
-    <w:pPr>
-      <w:spacing w:after="200"/>
-      <w:ind w:firstLine="0" w:left="0"/>
-    </w:pPr>
-  </w:style>
-  <w:style w:styleId="TOC2" w:type="paragraph">
-    <w:name w:val="toc 2"/>
-    <w:basedOn w:val="Single"/>
-    <w:next w:val="Normal"/>
-    <w:uiPriority w:val="39"/>
-    <w:unhideWhenUsed/>
-    <w:pPr>
-      <w:spacing w:after="200"/>
-      <w:ind w:firstLine="0" w:left="720"/>
-    </w:pPr>
-  </w:style>
-  <w:style w:styleId="TOC3" w:type="paragraph">
-    <w:name w:val="toc 3"/>
-    <w:basedOn w:val="Single"/>
-    <w:next w:val="Normal"/>
-    <w:uiPriority w:val="39"/>
-    <w:unhideWhenUsed/>
-    <w:pPr>
-      <w:spacing w:after="200"/>
-      <w:ind w:firstLine="0" w:left="1440"/>
-    </w:pPr>
-  </w:style>
-  <w:style w:styleId="TOC4" w:type="paragraph">
-    <w:name w:val="toc 4"/>
-    <w:basedOn w:val="Single"/>
-    <w:next w:val="Normal"/>
-    <w:uiPriority w:val="39"/>
-    <w:unhideWhenUsed/>
-    <w:pPr>
-      <w:spacing w:after="200"/>
-      <w:ind w:firstLine="0" w:left="2160"/>
-    </w:pPr>
-  </w:style>
-  <w:style w:styleId="Footer" w:type="paragraph">
+      <w:keepNext w:val="0"/>
+      <w:spacing w:before="590"/>
+    </w:pPr>
+  </w:style>
+  <w:style w:type="paragraph" w:customStyle="1" w:styleId="KeepWithNext">
+    <w:name w:val="Keep With Next"/>
+    <w:basedOn w:val="BodyText"/>
+    <w:qFormat/>
+    <w:pPr>
+      <w:keepNext/>
+      <w:keepLines/>
+    </w:pPr>
+  </w:style>
+  <w:style w:type="paragraph" w:styleId="Footer">
     <w:name w:val="footer"/>
     <w:basedOn w:val="Normal"/>
     <w:uiPriority w:val="99"/>
     <w:unhideWhenUsed/>
     <w:pPr>
-      <w:spacing w:after="0" w:before="0" w:line="240" w:lineRule="auto"/>
+      <w:spacing w:before="0" w:after="0" w:line="240" w:lineRule="auto"/>
       <w:ind w:firstLine="0"/>
       <w:jc w:val="center"/>
     </w:pPr>
@@ -1822,6 +2011,36 @@
       <w:sz w:val="28"/>
       <w:szCs w:val="28"/>
     </w:rPr>
+  </w:style>
+  <w:style w:type="paragraph" w:customStyle="1" w:styleId="CertText">
+    <w:name w:val="CertText"/>
+    <w:basedOn w:val="BodyText"/>
+    <w:qFormat/>
+  </w:style>
+  <w:style w:type="paragraph" w:customStyle="1" w:styleId="FirstParagraph">
+    <w:name w:val="FirstParagraph"/>
+    <w:basedOn w:val="BodyText"/>
+    <w:qFormat/>
+  </w:style>
+  <w:style w:type="paragraph" w:customStyle="1" w:styleId="Heading1Top">
+    <w:name w:val="Heading1Top"/>
+    <w:basedOn w:val="BodyText"/>
+    <w:qFormat/>
+  </w:style>
+  <w:style w:type="paragraph" w:customStyle="1" w:styleId="TOAEntry">
+    <w:name w:val="TOAEntry"/>
+    <w:basedOn w:val="BodyText"/>
+    <w:qFormat/>
+  </w:style>
+  <w:style w:type="paragraph" w:customStyle="1" w:styleId="TOCEntry1">
+    <w:name w:val="TOCEntry1"/>
+    <w:basedOn w:val="BodyText"/>
+    <w:qFormat/>
+  </w:style>
+  <w:style w:type="paragraph" w:customStyle="1" w:styleId="TOCEntry2">
+    <w:name w:val="TOCEntry2"/>
+    <w:basedOn w:val="BodyText"/>
+    <w:qFormat/>
   </w:style>
   <w:style w:type="paragraph" w:customStyle="1" w:styleId="SourceCode">
     <w:name w:val="Source Code"/>
@@ -2103,7 +2322,7 @@
     </a:clrScheme>
     <a:fontScheme name="Office">
       <a:majorFont>
-        <a:latin typeface="Aptos Display" panose="02110004020202020204"/>
+        <a:latin typeface="Times New Roman" panose="02110004020202020204"/>
         <a:ea typeface=""/>
         <a:cs typeface=""/>
         <a:font script="Jpan" typeface="游ゴシック Light"/>
@@ -2155,7 +2374,7 @@
         <a:font script="Tfng" typeface="Ebrima"/>
       </a:majorFont>
       <a:minorFont>
-        <a:latin typeface="Aptos" panose="02110004020202020204"/>
+        <a:latin typeface="Times New Roman" panose="02110004020202020204"/>
         <a:ea typeface=""/>
         <a:cs typeface=""/>
         <a:font script="Jpan" typeface="游明朝"/>

</xml_diff>

<commit_message>
bap6 answering-brief: typst/docx on the shared cross-engine layout model, on fb-595.63's docx engine (docx/reference.xml, fb render's multi-pass TOC and TOA pages, the opening brief's filter with the answering CFG); docx XENG-001..003 pass, cross_engine: gate (fb-595.54.3)
</commit_message>
<xml_diff>
--- a/courts/sixth-circuit/bankruptcy-appellate-panel/answering-brief/usage/OUTPUT-answering-brief.docx
+++ b/courts/sixth-circuit/bankruptcy-appellate-panel/answering-brief/usage/OUTPUT-answering-brief.docx
@@ -4,15 +4,21 @@
   <w:body>
     <w:p>
       <w:pPr>
-        <w:pStyle w:val="Centered"/>
-      </w:pPr>
-      <w:r>
-        <w:t xml:space="preserve">Case No. 19-8005</w:t>
-      </w:r>
-    </w:p>
-    <w:p>
-      <w:pPr>
-        <w:pStyle w:val="CoverGap"/>
+        <w:pStyle w:val="BapLine"/>
+        <w:spacing w:before="0" w:after="0" w:line="364" w:lineRule="exact"/>
+        <w:jc w:val="center"/>
+      </w:pPr>
+      <w:r>
+        <w:t xml:space="preserve">Case No. 19</w:t>
+        <w:noBreakHyphen/>
+        <w:t xml:space="preserve">8005</w:t>
+      </w:r>
+    </w:p>
+    <w:p>
+      <w:pPr>
+        <w:pStyle w:val="BapLine"/>
+        <w:spacing w:before="252" w:after="0" w:line="364" w:lineRule="exact"/>
+        <w:jc w:val="center"/>
       </w:pPr>
       <w:r>
         <w:rPr>
@@ -24,39 +30,121 @@
     </w:p>
     <w:p>
       <w:pPr>
-        <w:pStyle w:val="CoverGap"/>
-      </w:pPr>
-      <w:r>
-        <w:t xml:space="preserve">Dinsmore &amp; Shohl LLP</w:t>
-      </w:r>
-    </w:p>
-    <w:p>
-      <w:pPr>
-        <w:pStyle w:val="Centered"/>
-      </w:pPr>
-      <w:r>
-        <w:t xml:space="preserve">Bingham Greenebaum Doll LLP</w:t>
-      </w:r>
-    </w:p>
-    <w:p>
-      <w:pPr>
-        <w:pStyle w:val="Centered"/>
-      </w:pPr>
-      <w:r>
-        <w:t xml:space="preserve">Fox Rothschild LLP</w:t>
-      </w:r>
-    </w:p>
-    <w:p>
-      <w:pPr>
-        <w:pStyle w:val="Centered"/>
-      </w:pPr>
-      <w:r>
-        <w:t xml:space="preserve">and Phoenix Management Services, LLC</w:t>
-      </w:r>
-    </w:p>
-    <w:p>
-      <w:pPr>
-        <w:pStyle w:val="Centered"/>
+        <w:pStyle w:val="BapLine"/>
+        <w:spacing w:before="252" w:after="0" w:line="364" w:lineRule="exact"/>
+        <w:jc w:val="center"/>
+      </w:pPr>
+      <w:r>
+        <w:t xml:space="preserve">Dinsmore</w:t>
+      </w:r>
+      <w:r>
+        <w:t xml:space="preserve"> </w:t>
+      </w:r>
+      <w:r>
+        <w:t xml:space="preserve">&amp;</w:t>
+      </w:r>
+      <w:r>
+        <w:t xml:space="preserve"> </w:t>
+      </w:r>
+      <w:r>
+        <w:t xml:space="preserve">Shohl</w:t>
+      </w:r>
+      <w:r>
+        <w:t xml:space="preserve"> </w:t>
+      </w:r>
+      <w:r>
+        <w:t xml:space="preserve">LLP</w:t>
+      </w:r>
+    </w:p>
+    <w:p>
+      <w:pPr>
+        <w:pStyle w:val="BapLine"/>
+        <w:spacing w:before="0" w:after="0" w:line="364" w:lineRule="exact"/>
+        <w:jc w:val="center"/>
+      </w:pPr>
+      <w:r>
+        <w:t xml:space="preserve">Bingham</w:t>
+      </w:r>
+      <w:r>
+        <w:t xml:space="preserve"> </w:t>
+      </w:r>
+      <w:r>
+        <w:t xml:space="preserve">Greenebaum</w:t>
+      </w:r>
+      <w:r>
+        <w:t xml:space="preserve"> </w:t>
+      </w:r>
+      <w:r>
+        <w:t xml:space="preserve">Doll</w:t>
+      </w:r>
+      <w:r>
+        <w:t xml:space="preserve"> </w:t>
+      </w:r>
+      <w:r>
+        <w:t xml:space="preserve">LLP</w:t>
+      </w:r>
+    </w:p>
+    <w:p>
+      <w:pPr>
+        <w:pStyle w:val="BapLine"/>
+        <w:spacing w:before="0" w:after="0" w:line="364" w:lineRule="exact"/>
+        <w:jc w:val="center"/>
+      </w:pPr>
+      <w:r>
+        <w:t xml:space="preserve">Fox</w:t>
+      </w:r>
+      <w:r>
+        <w:t xml:space="preserve"> </w:t>
+      </w:r>
+      <w:r>
+        <w:t xml:space="preserve">Rothschild</w:t>
+      </w:r>
+      <w:r>
+        <w:t xml:space="preserve"> </w:t>
+      </w:r>
+      <w:r>
+        <w:t xml:space="preserve">LLP</w:t>
+      </w:r>
+    </w:p>
+    <w:p>
+      <w:pPr>
+        <w:pStyle w:val="BapLine"/>
+        <w:spacing w:before="0" w:after="0" w:line="364" w:lineRule="exact"/>
+        <w:jc w:val="center"/>
+      </w:pPr>
+      <w:r>
+        <w:t xml:space="preserve">and</w:t>
+      </w:r>
+      <w:r>
+        <w:t xml:space="preserve"> </w:t>
+      </w:r>
+      <w:r>
+        <w:t xml:space="preserve">Phoenix</w:t>
+      </w:r>
+      <w:r>
+        <w:t xml:space="preserve"> </w:t>
+      </w:r>
+      <w:r>
+        <w:t xml:space="preserve">Management</w:t>
+      </w:r>
+      <w:r>
+        <w:t xml:space="preserve"> </w:t>
+      </w:r>
+      <w:r>
+        <w:t xml:space="preserve">Services,</w:t>
+      </w:r>
+      <w:r>
+        <w:t xml:space="preserve"> </w:t>
+      </w:r>
+      <w:r>
+        <w:t xml:space="preserve">LLC</w:t>
+      </w:r>
+    </w:p>
+    <w:p>
+      <w:pPr>
+        <w:pStyle w:val="BapLine"/>
+        <w:spacing w:before="0" w:after="0" w:line="364" w:lineRule="exact"/>
+        <w:jc w:val="center"/>
       </w:pPr>
       <w:r>
         <w:t xml:space="preserve">Appellants,</w:t>
@@ -64,7 +152,9 @@
     </w:p>
     <w:p>
       <w:pPr>
-        <w:pStyle w:val="CoverGap"/>
+        <w:pStyle w:val="BapLine"/>
+        <w:spacing w:before="252" w:after="0" w:line="364" w:lineRule="exact"/>
+        <w:jc w:val="center"/>
       </w:pPr>
       <w:r>
         <w:t xml:space="preserve">v.</w:t>
@@ -72,15 +162,31 @@
     </w:p>
     <w:p>
       <w:pPr>
-        <w:pStyle w:val="CoverGap"/>
-      </w:pPr>
-      <w:r>
-        <w:t xml:space="preserve">United Cumberland Bank</w:t>
-      </w:r>
-    </w:p>
-    <w:p>
-      <w:pPr>
-        <w:pStyle w:val="Centered"/>
+        <w:pStyle w:val="BapLine"/>
+        <w:spacing w:before="252" w:after="0" w:line="364" w:lineRule="exact"/>
+        <w:jc w:val="center"/>
+      </w:pPr>
+      <w:r>
+        <w:t xml:space="preserve">United</w:t>
+      </w:r>
+      <w:r>
+        <w:t xml:space="preserve"> </w:t>
+      </w:r>
+      <w:r>
+        <w:t xml:space="preserve">Cumberland</w:t>
+      </w:r>
+      <w:r>
+        <w:t xml:space="preserve"> </w:t>
+      </w:r>
+      <w:r>
+        <w:t xml:space="preserve">Bank</w:t>
+      </w:r>
+    </w:p>
+    <w:p>
+      <w:pPr>
+        <w:pStyle w:val="BapLine"/>
+        <w:spacing w:before="0" w:after="0" w:line="364" w:lineRule="exact"/>
+        <w:jc w:val="center"/>
       </w:pPr>
       <w:r>
         <w:t xml:space="preserve">Appellee.</w:t>
@@ -88,63 +194,287 @@
     </w:p>
     <w:p>
       <w:pPr>
-        <w:pStyle w:val="CoverWide"/>
-      </w:pPr>
-      <w:r>
-        <w:t xml:space="preserve">On Appeal from the United States Bankruptcy Court for the Western District of Kentucky. Originating Case No. 16-10407, Chapter 11, Hon. Joan A. Lloyd.</w:t>
-      </w:r>
-    </w:p>
-    <w:p>
-      <w:pPr>
-        <w:pStyle w:val="CoverTitle"/>
-      </w:pPr>
-      <w:r>
-        <w:t xml:space="preserve">Appellees’ Brief</w:t>
-      </w:r>
-    </w:p>
-    <w:p>
-      <w:pPr>
-        <w:pStyle w:val="CoverBottom"/>
-      </w:pPr>
-      <w:r>
-        <w:t xml:space="preserve">Scott A. Bachert</w:t>
-      </w:r>
-    </w:p>
-    <w:p>
-      <w:pPr>
-        <w:pStyle w:val="Centered"/>
-      </w:pPr>
-      <w:r>
-        <w:t xml:space="preserve">KERRICK BACHERT</w:t>
-      </w:r>
-    </w:p>
-    <w:p>
-      <w:pPr>
-        <w:pStyle w:val="Centered"/>
-      </w:pPr>
-      <w:r>
-        <w:t xml:space="preserve">1025 State Street</w:t>
-      </w:r>
-    </w:p>
-    <w:p>
-      <w:pPr>
-        <w:pStyle w:val="Centered"/>
-      </w:pPr>
-      <w:r>
-        <w:t xml:space="preserve">P.O. Box 9547</w:t>
-      </w:r>
-    </w:p>
-    <w:p>
-      <w:pPr>
-        <w:pStyle w:val="Centered"/>
-      </w:pPr>
-      <w:r>
-        <w:t xml:space="preserve">Bowling Green, KY 42102-9547</w:t>
-      </w:r>
-    </w:p>
-    <w:p>
-      <w:pPr>
-        <w:pStyle w:val="Centered"/>
+        <w:pStyle w:val="BapLine"/>
+        <w:spacing w:before="392" w:after="0" w:line="364" w:lineRule="exact"/>
+        <w:jc w:val="center"/>
+      </w:pPr>
+      <w:r>
+        <w:t xml:space="preserve">On</w:t>
+      </w:r>
+      <w:r>
+        <w:t xml:space="preserve"> </w:t>
+      </w:r>
+      <w:r>
+        <w:t xml:space="preserve">Appeal</w:t>
+      </w:r>
+      <w:r>
+        <w:t xml:space="preserve"> </w:t>
+      </w:r>
+      <w:r>
+        <w:t xml:space="preserve">from</w:t>
+      </w:r>
+      <w:r>
+        <w:t xml:space="preserve"> </w:t>
+      </w:r>
+      <w:r>
+        <w:t xml:space="preserve">the</w:t>
+      </w:r>
+      <w:r>
+        <w:t xml:space="preserve"> </w:t>
+      </w:r>
+      <w:r>
+        <w:t xml:space="preserve">United</w:t>
+      </w:r>
+      <w:r>
+        <w:t xml:space="preserve"> </w:t>
+      </w:r>
+      <w:r>
+        <w:t xml:space="preserve">States</w:t>
+      </w:r>
+      <w:r>
+        <w:t xml:space="preserve"> </w:t>
+      </w:r>
+      <w:r>
+        <w:t xml:space="preserve">Bankruptcy</w:t>
+      </w:r>
+      <w:r>
+        <w:t xml:space="preserve"> </w:t>
+      </w:r>
+      <w:r>
+        <w:t xml:space="preserve">Court</w:t>
+      </w:r>
+      <w:r>
+        <w:t xml:space="preserve"> </w:t>
+      </w:r>
+      <w:r>
+        <w:t xml:space="preserve">for</w:t>
+      </w:r>
+      <w:r>
+        <w:t xml:space="preserve"> </w:t>
+      </w:r>
+      <w:r>
+        <w:t xml:space="preserve">the</w:t>
+      </w:r>
+      <w:r>
+        <w:t xml:space="preserve"> </w:t>
+      </w:r>
+      <w:r>
+        <w:t xml:space="preserve">Western</w:t>
+      </w:r>
+      <w:r>
+        <w:t xml:space="preserve"> </w:t>
+      </w:r>
+      <w:r>
+        <w:t xml:space="preserve">District</w:t>
+      </w:r>
+      <w:r>
+        <w:t xml:space="preserve"> </w:t>
+      </w:r>
+      <w:r>
+        <w:t xml:space="preserve">of</w:t>
+      </w:r>
+      <w:r>
+        <w:t xml:space="preserve"> </w:t>
+      </w:r>
+      <w:r>
+        <w:t xml:space="preserve">Kentucky.</w:t>
+      </w:r>
+      <w:r>
+        <w:t xml:space="preserve"> </w:t>
+      </w:r>
+      <w:r>
+        <w:t xml:space="preserve">Originating</w:t>
+      </w:r>
+      <w:r>
+        <w:t xml:space="preserve"> </w:t>
+      </w:r>
+      <w:r>
+        <w:t xml:space="preserve">Case</w:t>
+      </w:r>
+      <w:r>
+        <w:t xml:space="preserve"> </w:t>
+      </w:r>
+      <w:r>
+        <w:t xml:space="preserve">No.</w:t>
+      </w:r>
+      <w:r>
+        <w:t xml:space="preserve"> </w:t>
+      </w:r>
+      <w:r>
+        <w:t xml:space="preserve">16</w:t>
+        <w:noBreakHyphen/>
+        <w:t xml:space="preserve">10407,</w:t>
+      </w:r>
+      <w:r>
+        <w:t xml:space="preserve"> </w:t>
+      </w:r>
+      <w:r>
+        <w:t xml:space="preserve">Chapter</w:t>
+      </w:r>
+      <w:r>
+        <w:t xml:space="preserve"> </w:t>
+      </w:r>
+      <w:r>
+        <w:t xml:space="preserve">11,</w:t>
+      </w:r>
+      <w:r>
+        <w:t xml:space="preserve"> </w:t>
+      </w:r>
+      <w:r>
+        <w:t xml:space="preserve">Hon.</w:t>
+      </w:r>
+      <w:r>
+        <w:t xml:space="preserve"> </w:t>
+      </w:r>
+      <w:r>
+        <w:t xml:space="preserve">Joan</w:t>
+      </w:r>
+      <w:r>
+        <w:t xml:space="preserve"> </w:t>
+      </w:r>
+      <w:r>
+        <w:t xml:space="preserve">A.</w:t>
+      </w:r>
+      <w:r>
+        <w:t xml:space="preserve"> </w:t>
+      </w:r>
+      <w:r>
+        <w:t xml:space="preserve">Lloyd.</w:t>
+      </w:r>
+    </w:p>
+    <w:p>
+      <w:pPr>
+        <w:pStyle w:val="BapLine"/>
+        <w:spacing w:before="392" w:after="0" w:line="364" w:lineRule="exact"/>
+        <w:jc w:val="center"/>
+      </w:pPr>
+      <w:r>
+        <w:rPr>
+          <w:b/>
+          <w:bCs/>
+          <w:sz w:val="32"/>
+          <w:szCs w:val="32"/>
+        </w:rPr>
+        <w:t xml:space="preserve">APPELLEES’ BRIEF</w:t>
+      </w:r>
+    </w:p>
+    <w:p>
+      <w:pPr>
+        <w:pStyle w:val="BapLine"/>
+        <w:spacing w:before="728" w:after="0" w:line="364" w:lineRule="exact"/>
+        <w:jc w:val="center"/>
+      </w:pPr>
+      <w:r>
+        <w:t xml:space="preserve">Scott</w:t>
+      </w:r>
+      <w:r>
+        <w:t xml:space="preserve"> </w:t>
+      </w:r>
+      <w:r>
+        <w:t xml:space="preserve">A.</w:t>
+      </w:r>
+      <w:r>
+        <w:t xml:space="preserve"> </w:t>
+      </w:r>
+      <w:r>
+        <w:t xml:space="preserve">Bachert</w:t>
+      </w:r>
+    </w:p>
+    <w:p>
+      <w:pPr>
+        <w:pStyle w:val="BapLine"/>
+        <w:spacing w:before="0" w:after="0" w:line="364" w:lineRule="exact"/>
+        <w:jc w:val="center"/>
+      </w:pPr>
+      <w:r>
+        <w:t xml:space="preserve">KERRICK</w:t>
+      </w:r>
+      <w:r>
+        <w:t xml:space="preserve"> </w:t>
+      </w:r>
+      <w:r>
+        <w:t xml:space="preserve">BACHERT</w:t>
+      </w:r>
+    </w:p>
+    <w:p>
+      <w:pPr>
+        <w:pStyle w:val="BapLine"/>
+        <w:spacing w:before="0" w:after="0" w:line="364" w:lineRule="exact"/>
+        <w:jc w:val="center"/>
+      </w:pPr>
+      <w:r>
+        <w:t xml:space="preserve">1025</w:t>
+      </w:r>
+      <w:r>
+        <w:t xml:space="preserve"> </w:t>
+      </w:r>
+      <w:r>
+        <w:t xml:space="preserve">State</w:t>
+      </w:r>
+      <w:r>
+        <w:t xml:space="preserve"> </w:t>
+      </w:r>
+      <w:r>
+        <w:t xml:space="preserve">Street</w:t>
+      </w:r>
+    </w:p>
+    <w:p>
+      <w:pPr>
+        <w:pStyle w:val="BapLine"/>
+        <w:spacing w:before="0" w:after="0" w:line="364" w:lineRule="exact"/>
+        <w:jc w:val="center"/>
+      </w:pPr>
+      <w:r>
+        <w:t xml:space="preserve">P.O.</w:t>
+      </w:r>
+      <w:r>
+        <w:t xml:space="preserve"> </w:t>
+      </w:r>
+      <w:r>
+        <w:t xml:space="preserve">Box</w:t>
+      </w:r>
+      <w:r>
+        <w:t xml:space="preserve"> </w:t>
+      </w:r>
+      <w:r>
+        <w:t xml:space="preserve">9547</w:t>
+      </w:r>
+    </w:p>
+    <w:p>
+      <w:pPr>
+        <w:pStyle w:val="BapLine"/>
+        <w:spacing w:before="0" w:after="0" w:line="364" w:lineRule="exact"/>
+        <w:jc w:val="center"/>
+      </w:pPr>
+      <w:r>
+        <w:t xml:space="preserve">Bowling</w:t>
+      </w:r>
+      <w:r>
+        <w:t xml:space="preserve"> </w:t>
+      </w:r>
+      <w:r>
+        <w:t xml:space="preserve">Green,</w:t>
+      </w:r>
+      <w:r>
+        <w:t xml:space="preserve"> </w:t>
+      </w:r>
+      <w:r>
+        <w:t xml:space="preserve">KY</w:t>
+      </w:r>
+      <w:r>
+        <w:t xml:space="preserve"> </w:t>
+      </w:r>
+      <w:r>
+        <w:t xml:space="preserve">42102</w:t>
+        <w:noBreakHyphen/>
+        <w:t xml:space="preserve">9547</w:t>
+      </w:r>
+    </w:p>
+    <w:p>
+      <w:pPr>
+        <w:pStyle w:val="BapLine"/>
+        <w:spacing w:before="0" w:after="0" w:line="364" w:lineRule="exact"/>
+        <w:jc w:val="center"/>
       </w:pPr>
       <w:r>
         <w:t xml:space="preserve">sbachert@kerricklaw.com</w:t>
@@ -152,44 +482,103 @@
     </w:p>
     <w:p>
       <w:pPr>
-        <w:pStyle w:val="Centered"/>
-      </w:pPr>
-      <w:r>
-        <w:t xml:space="preserve">Counsel for United Cumberland Bank</w:t>
-      </w:r>
-    </w:p>
-    <w:p>
-      <w:pPr>
-        <w:pStyle w:val="CoverGroup"/>
-      </w:pPr>
-      <w:r>
-        <w:t xml:space="preserve">(270) 782-8160</w:t>
-      </w:r>
-    </w:p>
-    <w:p>
-      <w:pPr>
-        <w:pStyle w:val="CoverDate"/>
-      </w:pPr>
-      <w:r>
-        <w:t xml:space="preserve">August 30, 2019</w:t>
-      </w:r>
-    </w:p>
-    <w:p>
-      <w:pPr>
-        <w:pStyle w:val="SectionEnd"/>
+        <w:pStyle w:val="BapLine"/>
+        <w:spacing w:before="0" w:after="0" w:line="364" w:lineRule="exact"/>
+        <w:jc w:val="center"/>
+      </w:pPr>
+      <w:r>
+        <w:t xml:space="preserve">Counsel</w:t>
+      </w:r>
+      <w:r>
+        <w:t xml:space="preserve"> </w:t>
+      </w:r>
+      <w:r>
+        <w:t xml:space="preserve">for</w:t>
+      </w:r>
+      <w:r>
+        <w:t xml:space="preserve"> </w:t>
+      </w:r>
+      <w:r>
+        <w:t xml:space="preserve">United</w:t>
+      </w:r>
+      <w:r>
+        <w:t xml:space="preserve"> </w:t>
+      </w:r>
+      <w:r>
+        <w:t xml:space="preserve">Cumberland</w:t>
+      </w:r>
+      <w:r>
+        <w:t xml:space="preserve"> </w:t>
+      </w:r>
+      <w:r>
+        <w:t xml:space="preserve">Bank</w:t>
+      </w:r>
+    </w:p>
+    <w:p>
+      <w:pPr>
+        <w:pStyle w:val="BapLine"/>
+        <w:spacing w:before="252" w:after="0" w:line="364" w:lineRule="exact"/>
+        <w:jc w:val="center"/>
+      </w:pPr>
+      <w:r>
+        <w:t xml:space="preserve">(270)</w:t>
+      </w:r>
+      <w:r>
+        <w:t xml:space="preserve"> </w:t>
+      </w:r>
+      <w:r>
+        <w:t xml:space="preserve">782</w:t>
+        <w:noBreakHyphen/>
+        <w:t xml:space="preserve">8160</w:t>
+      </w:r>
+    </w:p>
+    <w:p>
+      <w:pPr>
+        <w:pStyle w:val="BapLine"/>
+        <w:spacing w:before="224" w:after="0" w:line="364" w:lineRule="exact"/>
+        <w:jc w:val="center"/>
+      </w:pPr>
+      <w:r>
+        <w:t xml:space="preserve">August</w:t>
+      </w:r>
+      <w:r>
+        <w:t xml:space="preserve"> </w:t>
+      </w:r>
+      <w:r>
+        <w:t xml:space="preserve">30,</w:t>
+      </w:r>
+      <w:r>
+        <w:t xml:space="preserve"> </w:t>
+      </w:r>
+      <w:r>
+        <w:t xml:space="preserve">2019</w:t>
+      </w:r>
+    </w:p>
+    <w:p>
+      <w:pPr>
+        <w:spacing w:before="0" w:after="0" w:line="20" w:lineRule="exact"/>
         <w:sectPr>
           <w:footerReference w:type="default" r:id="rIdFtrNone"/>
           <w:pgSz w:w="12240" w:h="15840"/>
           <w:pgMar w:top="1440" w:right="1440" w:bottom="1440" w:left="1440" w:header="720" w:footer="720" w:gutter="0"/>
-          <w:cols w:space="720"/>
         </w:sectPr>
       </w:pPr>
     </w:p>
     <w:p>
       <w:pPr>
-        <w:pStyle w:val="FrontHeading"/>
-      </w:pPr>
-      <w:r>
+        <w:pStyle w:val="BapLine"/>
+        <w:keepNext/>
+        <w:keepLines/>
+        <w:spacing w:before="0" w:after="336" w:line="480" w:lineRule="exact"/>
+        <w:jc w:val="center"/>
+      </w:pPr>
+      <w:r>
+        <w:rPr>
+          <w:b/>
+          <w:bCs/>
+          <w:sz w:val="39"/>
+          <w:szCs w:val="39"/>
+        </w:rPr>
         <w:t xml:space="preserve">Corporate Disclosure Statement</w:t>
       </w:r>
     </w:p>
@@ -203,20 +592,40 @@
     </w:p>
     <w:p>
       <w:pPr>
-        <w:pStyle w:val="ContentsHeadingBreak"/>
-      </w:pPr>
-      <w:r>
+        <w:pStyle w:val="BapLine"/>
+        <w:keepNext/>
+        <w:keepLines/>
+        <w:pageBreakBefore/>
+        <w:spacing w:before="0" w:after="336" w:line="480" w:lineRule="exact"/>
+        <w:jc w:val="center"/>
+      </w:pPr>
+      <w:r>
+        <w:rPr>
+          <w:b/>
+          <w:bCs/>
+          <w:sz w:val="39"/>
+          <w:szCs w:val="39"/>
+        </w:rPr>
         <w:t xml:space="preserve">Table of Contents</w:t>
       </w:r>
     </w:p>
     <w:p>
       <w:pPr>
-        <w:pStyle w:val="TOCEntry1"/>
+        <w:pStyle w:val="BapLine"/>
+        <w:keepLines/>
+        <w:tabs>
+          <w:tab w:val="right" w:leader="dot" w:pos="9360"/>
+        </w:tabs>
+        <w:spacing w:before="140" w:after="0" w:line="364" w:lineRule="exact"/>
+        <w:ind w:left="420" w:right="720" w:hanging="420"/>
       </w:pPr>
       <w:r>
         <w:t xml:space="preserve">Corporate Disclosure Statement</w:t>
       </w:r>
       <w:r>
+        <w:t xml:space="preserve">   </w:t>
+      </w:r>
+      <w:r>
         <w:tab/>
       </w:r>
       <w:r>
@@ -225,12 +634,21 @@
     </w:p>
     <w:p>
       <w:pPr>
-        <w:pStyle w:val="TOCEntry1"/>
+        <w:pStyle w:val="BapLine"/>
+        <w:keepLines/>
+        <w:tabs>
+          <w:tab w:val="right" w:leader="dot" w:pos="9360"/>
+        </w:tabs>
+        <w:spacing w:before="140" w:after="0" w:line="364" w:lineRule="exact"/>
+        <w:ind w:left="420" w:right="720" w:hanging="420"/>
       </w:pPr>
       <w:r>
         <w:t xml:space="preserve">Table of Authorities</w:t>
       </w:r>
       <w:r>
+        <w:t xml:space="preserve">   </w:t>
+      </w:r>
+      <w:r>
         <w:tab/>
       </w:r>
       <w:r>
@@ -239,10 +657,37 @@
     </w:p>
     <w:p>
       <w:pPr>
-        <w:pStyle w:val="TOCEntry1"/>
-      </w:pPr>
-      <w:r>
-        <w:t xml:space="preserve">Statement of the Issues</w:t>
+        <w:pStyle w:val="BapLine"/>
+        <w:keepLines/>
+        <w:tabs>
+          <w:tab w:val="right" w:leader="dot" w:pos="9360"/>
+        </w:tabs>
+        <w:spacing w:before="140" w:after="0" w:line="364" w:lineRule="exact"/>
+        <w:ind w:left="420" w:right="720" w:hanging="420"/>
+      </w:pPr>
+      <w:r>
+        <w:t xml:space="preserve">Statement</w:t>
+      </w:r>
+      <w:r>
+        <w:t xml:space="preserve"> </w:t>
+      </w:r>
+      <w:r>
+        <w:t xml:space="preserve">of</w:t>
+      </w:r>
+      <w:r>
+        <w:t xml:space="preserve"> </w:t>
+      </w:r>
+      <w:r>
+        <w:t xml:space="preserve">the</w:t>
+      </w:r>
+      <w:r>
+        <w:t xml:space="preserve"> </w:t>
+      </w:r>
+      <w:r>
+        <w:t xml:space="preserve">Issues</w:t>
+      </w:r>
+      <w:r>
+        <w:t xml:space="preserve">   </w:t>
       </w:r>
       <w:r>
         <w:tab/>
@@ -253,10 +698,37 @@
     </w:p>
     <w:p>
       <w:pPr>
-        <w:pStyle w:val="TOCEntry1"/>
-      </w:pPr>
-      <w:r>
-        <w:t xml:space="preserve">Statement of the Case</w:t>
+        <w:pStyle w:val="BapLine"/>
+        <w:keepLines/>
+        <w:tabs>
+          <w:tab w:val="right" w:leader="dot" w:pos="9360"/>
+        </w:tabs>
+        <w:spacing w:before="140" w:after="0" w:line="364" w:lineRule="exact"/>
+        <w:ind w:left="420" w:right="720" w:hanging="420"/>
+      </w:pPr>
+      <w:r>
+        <w:t xml:space="preserve">Statement</w:t>
+      </w:r>
+      <w:r>
+        <w:t xml:space="preserve"> </w:t>
+      </w:r>
+      <w:r>
+        <w:t xml:space="preserve">of</w:t>
+      </w:r>
+      <w:r>
+        <w:t xml:space="preserve"> </w:t>
+      </w:r>
+      <w:r>
+        <w:t xml:space="preserve">the</w:t>
+      </w:r>
+      <w:r>
+        <w:t xml:space="preserve"> </w:t>
+      </w:r>
+      <w:r>
+        <w:t xml:space="preserve">Case</w:t>
+      </w:r>
+      <w:r>
+        <w:t xml:space="preserve">   </w:t>
       </w:r>
       <w:r>
         <w:tab/>
@@ -267,10 +739,31 @@
     </w:p>
     <w:p>
       <w:pPr>
-        <w:pStyle w:val="TOCEntry1"/>
-      </w:pPr>
-      <w:r>
-        <w:t xml:space="preserve">Standard of Review</w:t>
+        <w:pStyle w:val="BapLine"/>
+        <w:keepLines/>
+        <w:tabs>
+          <w:tab w:val="right" w:leader="dot" w:pos="9360"/>
+        </w:tabs>
+        <w:spacing w:before="140" w:after="0" w:line="364" w:lineRule="exact"/>
+        <w:ind w:left="420" w:right="720" w:hanging="420"/>
+      </w:pPr>
+      <w:r>
+        <w:t xml:space="preserve">Standard</w:t>
+      </w:r>
+      <w:r>
+        <w:t xml:space="preserve"> </w:t>
+      </w:r>
+      <w:r>
+        <w:t xml:space="preserve">of</w:t>
+      </w:r>
+      <w:r>
+        <w:t xml:space="preserve"> </w:t>
+      </w:r>
+      <w:r>
+        <w:t xml:space="preserve">Review</w:t>
+      </w:r>
+      <w:r>
+        <w:t xml:space="preserve">   </w:t>
       </w:r>
       <w:r>
         <w:tab/>
@@ -281,10 +774,31 @@
     </w:p>
     <w:p>
       <w:pPr>
-        <w:pStyle w:val="TOCEntry1"/>
-      </w:pPr>
-      <w:r>
-        <w:t xml:space="preserve">Summary of Argument</w:t>
+        <w:pStyle w:val="BapLine"/>
+        <w:keepLines/>
+        <w:tabs>
+          <w:tab w:val="right" w:leader="dot" w:pos="9360"/>
+        </w:tabs>
+        <w:spacing w:before="140" w:after="0" w:line="364" w:lineRule="exact"/>
+        <w:ind w:left="420" w:right="720" w:hanging="420"/>
+      </w:pPr>
+      <w:r>
+        <w:t xml:space="preserve">Summary</w:t>
+      </w:r>
+      <w:r>
+        <w:t xml:space="preserve"> </w:t>
+      </w:r>
+      <w:r>
+        <w:t xml:space="preserve">of</w:t>
+      </w:r>
+      <w:r>
+        <w:t xml:space="preserve"> </w:t>
+      </w:r>
+      <w:r>
+        <w:t xml:space="preserve">Argument</w:t>
+      </w:r>
+      <w:r>
+        <w:t xml:space="preserve">   </w:t>
       </w:r>
       <w:r>
         <w:tab/>
@@ -295,12 +809,21 @@
     </w:p>
     <w:p>
       <w:pPr>
-        <w:pStyle w:val="TOCEntry1"/>
+        <w:pStyle w:val="BapLine"/>
+        <w:keepLines/>
+        <w:tabs>
+          <w:tab w:val="right" w:leader="dot" w:pos="9360"/>
+        </w:tabs>
+        <w:spacing w:before="140" w:after="0" w:line="364" w:lineRule="exact"/>
+        <w:ind w:left="420" w:right="720" w:hanging="420"/>
       </w:pPr>
       <w:r>
         <w:t xml:space="preserve">Argument</w:t>
       </w:r>
       <w:r>
+        <w:t xml:space="preserve">   </w:t>
+      </w:r>
+      <w:r>
         <w:tab/>
       </w:r>
       <w:r>
@@ -309,40 +832,211 @@
     </w:p>
     <w:p>
       <w:pPr>
-        <w:pStyle w:val="TOCEntry2"/>
-      </w:pPr>
-      <w:r>
-        <w:t xml:space="preserve">The Cash Collateral Orders do not obligate UCB to pay the Professional fees.</w:t>
+        <w:pStyle w:val="BapLine"/>
+        <w:keepLines/>
+        <w:tabs>
+          <w:tab w:val="right" w:leader="dot" w:pos="9360"/>
+        </w:tabs>
+        <w:spacing w:before="140" w:after="0" w:line="364" w:lineRule="exact"/>
+        <w:ind w:left="840" w:right="720" w:hanging="420"/>
+      </w:pPr>
+      <w:r>
+        <w:t xml:space="preserve">The</w:t>
+      </w:r>
+      <w:r>
+        <w:t xml:space="preserve"> </w:t>
+      </w:r>
+      <w:r>
+        <w:t xml:space="preserve">Cash</w:t>
+      </w:r>
+      <w:r>
+        <w:t xml:space="preserve"> </w:t>
+      </w:r>
+      <w:r>
+        <w:t xml:space="preserve">Collateral</w:t>
+      </w:r>
+      <w:r>
+        <w:t xml:space="preserve"> </w:t>
+      </w:r>
+      <w:r>
+        <w:t xml:space="preserve">Orders</w:t>
+      </w:r>
+      <w:r>
+        <w:t xml:space="preserve"> </w:t>
+      </w:r>
+      <w:r>
+        <w:t xml:space="preserve">do</w:t>
+      </w:r>
+      <w:r>
+        <w:t xml:space="preserve"> </w:t>
+      </w:r>
+      <w:r>
+        <w:t xml:space="preserve">not</w:t>
+      </w:r>
+      <w:r>
+        <w:t xml:space="preserve"> </w:t>
+      </w:r>
+      <w:r>
+        <w:t xml:space="preserve">obligate</w:t>
+      </w:r>
+      <w:r>
+        <w:t xml:space="preserve"> </w:t>
+      </w:r>
+      <w:r>
+        <w:t xml:space="preserve">UCB</w:t>
+      </w:r>
+      <w:r>
+        <w:t xml:space="preserve"> </w:t>
+      </w:r>
+      <w:r>
+        <w:t xml:space="preserve">to</w:t>
+      </w:r>
+      <w:r>
+        <w:t xml:space="preserve"> </w:t>
+      </w:r>
+      <w:r>
+        <w:t xml:space="preserve">pay</w:t>
+      </w:r>
+      <w:r>
+        <w:t xml:space="preserve"> </w:t>
+      </w:r>
+      <w:r>
+        <w:t xml:space="preserve">the</w:t>
+      </w:r>
+      <w:r>
+        <w:t xml:space="preserve"> </w:t>
+      </w:r>
+      <w:r>
+        <w:t xml:space="preserve">Professional</w:t>
+      </w:r>
+      <w:r>
+        <w:t xml:space="preserve"> </w:t>
+      </w:r>
+      <w:r>
+        <w:t xml:space="preserve">fees.</w:t>
+      </w:r>
+      <w:r>
+        <w:t xml:space="preserve">   </w:t>
       </w:r>
       <w:r>
         <w:tab/>
       </w:r>
       <w:r>
-        <w:t xml:space="preserve">5</w:t>
-      </w:r>
-    </w:p>
-    <w:p>
-      <w:pPr>
-        <w:pStyle w:val="TOCEntry2"/>
-      </w:pPr>
-      <w:r>
-        <w:t xml:space="preserve">The Plan of Confirmation does not require UCB to pay the Professional fees.</w:t>
+        <w:t xml:space="preserve">6</w:t>
+      </w:r>
+    </w:p>
+    <w:p>
+      <w:pPr>
+        <w:pStyle w:val="BapLine"/>
+        <w:keepLines/>
+        <w:tabs>
+          <w:tab w:val="right" w:leader="dot" w:pos="9360"/>
+        </w:tabs>
+        <w:spacing w:before="140" w:after="0" w:line="364" w:lineRule="exact"/>
+        <w:ind w:left="840" w:right="720" w:hanging="420"/>
+      </w:pPr>
+      <w:r>
+        <w:t xml:space="preserve">The</w:t>
+      </w:r>
+      <w:r>
+        <w:t xml:space="preserve"> </w:t>
+      </w:r>
+      <w:r>
+        <w:t xml:space="preserve">Plan</w:t>
+      </w:r>
+      <w:r>
+        <w:t xml:space="preserve"> </w:t>
+      </w:r>
+      <w:r>
+        <w:t xml:space="preserve">of</w:t>
+      </w:r>
+      <w:r>
+        <w:t xml:space="preserve"> </w:t>
+      </w:r>
+      <w:r>
+        <w:t xml:space="preserve">Confirmation</w:t>
+      </w:r>
+      <w:r>
+        <w:t xml:space="preserve"> </w:t>
+      </w:r>
+      <w:r>
+        <w:t xml:space="preserve">does</w:t>
+      </w:r>
+      <w:r>
+        <w:t xml:space="preserve"> </w:t>
+      </w:r>
+      <w:r>
+        <w:t xml:space="preserve">not</w:t>
+      </w:r>
+      <w:r>
+        <w:t xml:space="preserve"> </w:t>
+      </w:r>
+      <w:r>
+        <w:t xml:space="preserve">require</w:t>
+      </w:r>
+      <w:r>
+        <w:t xml:space="preserve"> </w:t>
+      </w:r>
+      <w:r>
+        <w:t xml:space="preserve">UCB</w:t>
+      </w:r>
+      <w:r>
+        <w:t xml:space="preserve"> </w:t>
+      </w:r>
+      <w:r>
+        <w:t xml:space="preserve">to</w:t>
+      </w:r>
+      <w:r>
+        <w:t xml:space="preserve"> </w:t>
+      </w:r>
+      <w:r>
+        <w:t xml:space="preserve">pay</w:t>
+      </w:r>
+      <w:r>
+        <w:t xml:space="preserve"> </w:t>
+      </w:r>
+      <w:r>
+        <w:t xml:space="preserve">the</w:t>
+      </w:r>
+      <w:r>
+        <w:t xml:space="preserve"> </w:t>
+      </w:r>
+      <w:r>
+        <w:t xml:space="preserve">Professional</w:t>
+      </w:r>
+      <w:r>
+        <w:t xml:space="preserve"> </w:t>
+      </w:r>
+      <w:r>
+        <w:t xml:space="preserve">fees.</w:t>
+      </w:r>
+      <w:r>
+        <w:t xml:space="preserve">   </w:t>
       </w:r>
       <w:r>
         <w:tab/>
       </w:r>
       <w:r>
-        <w:t xml:space="preserve">6</w:t>
-      </w:r>
-    </w:p>
-    <w:p>
-      <w:pPr>
-        <w:pStyle w:val="TOCEntry1"/>
+        <w:t xml:space="preserve">7</w:t>
+      </w:r>
+    </w:p>
+    <w:p>
+      <w:pPr>
+        <w:pStyle w:val="BapLine"/>
+        <w:keepLines/>
+        <w:tabs>
+          <w:tab w:val="right" w:leader="dot" w:pos="9360"/>
+        </w:tabs>
+        <w:spacing w:before="140" w:after="0" w:line="364" w:lineRule="exact"/>
+        <w:ind w:left="420" w:right="720" w:hanging="420"/>
       </w:pPr>
       <w:r>
         <w:t xml:space="preserve">Conclusion</w:t>
       </w:r>
       <w:r>
+        <w:t xml:space="preserve">   </w:t>
+      </w:r>
+      <w:r>
         <w:tab/>
       </w:r>
       <w:r>
@@ -351,75 +1045,208 @@
     </w:p>
     <w:p>
       <w:pPr>
-        <w:pStyle w:val="AuthoritiesHeading"/>
-      </w:pPr>
-      <w:r>
+        <w:pStyle w:val="BapLine"/>
+        <w:keepNext/>
+        <w:keepLines/>
+        <w:pageBreakBefore/>
+        <w:spacing w:before="0" w:after="336" w:line="480" w:lineRule="exact"/>
+        <w:jc w:val="center"/>
+      </w:pPr>
+      <w:r>
+        <w:rPr>
+          <w:b/>
+          <w:bCs/>
+          <w:sz w:val="39"/>
+          <w:szCs w:val="39"/>
+        </w:rPr>
         <w:t xml:space="preserve">Table of Authorities</w:t>
       </w:r>
     </w:p>
     <w:p>
       <w:pPr>
-        <w:pStyle w:val="AuthorityKind"/>
-      </w:pPr>
-      <w:r>
+        <w:pStyle w:val="BapLine"/>
+        <w:keepNext/>
+        <w:keepLines/>
+        <w:spacing w:before="336" w:after="224" w:line="364" w:lineRule="exact"/>
+      </w:pPr>
+      <w:r>
+        <w:rPr>
+          <w:b/>
+          <w:bCs/>
+        </w:rPr>
         <w:t xml:space="preserve">Cases</w:t>
       </w:r>
     </w:p>
     <w:p>
       <w:pPr>
-        <w:pStyle w:val="TOAEntry"/>
+        <w:pStyle w:val="BapLine"/>
+        <w:keepLines/>
+        <w:tabs>
+          <w:tab w:val="right" w:leader="dot" w:pos="9360"/>
+        </w:tabs>
+        <w:spacing w:before="140" w:after="0" w:line="364" w:lineRule="exact"/>
+        <w:ind w:left="720" w:right="1120" w:hanging="720"/>
       </w:pPr>
       <w:r>
         <w:rPr>
           <w:i/>
           <w:iCs/>
         </w:rPr>
-        <w:t xml:space="preserve">Harper v. The Overnight Comm. (In re Conoco, Inc.)</w:t>
-      </w:r>
-      <w:r>
-        <w:t xml:space="preserve">, 855 F.3d 703 (6th Cir. 2017)</w:t>
-      </w:r>
-      <w:r>
-        <w:tab/>
-      </w:r>
-      <w:r>
-        <w:t xml:space="preserve">4</w:t>
-      </w:r>
-    </w:p>
-    <w:p>
-      <w:pPr>
-        <w:pStyle w:val="TOAEntry"/>
-      </w:pPr>
+        <w:t xml:space="preserve">Harper</w:t>
+      </w:r>
       <w:r>
         <w:rPr>
           <w:i/>
           <w:iCs/>
         </w:rPr>
-        <w:t xml:space="preserve">In re Evanston Beauty Supply, Inc.</w:t>
-      </w:r>
-      <w:r>
-        <w:t xml:space="preserve">, 136 B.R. 171 (Bankr. N.D. Ill. 1992)</w:t>
-      </w:r>
-      <w:r>
-        <w:tab/>
-      </w:r>
-      <w:r>
-        <w:t xml:space="preserve">5</w:t>
-      </w:r>
-    </w:p>
-    <w:p>
-      <w:pPr>
-        <w:pStyle w:val="TOAEntry"/>
-      </w:pPr>
+        <w:t xml:space="preserve"> </w:t>
+      </w:r>
       <w:r>
         <w:rPr>
           <w:i/>
           <w:iCs/>
         </w:rPr>
-        <w:t xml:space="preserve">In re Licking River Mining, LLC</w:t>
-      </w:r>
-      <w:r>
-        <w:t xml:space="preserve">, 911 F.3d 806 (6th Cir. 2018)</w:t>
+        <w:t xml:space="preserve">v.</w:t>
+      </w:r>
+      <w:r>
+        <w:rPr>
+          <w:i/>
+          <w:iCs/>
+        </w:rPr>
+        <w:t xml:space="preserve"> </w:t>
+      </w:r>
+      <w:r>
+        <w:rPr>
+          <w:i/>
+          <w:iCs/>
+        </w:rPr>
+        <w:t xml:space="preserve">The</w:t>
+      </w:r>
+      <w:r>
+        <w:rPr>
+          <w:i/>
+          <w:iCs/>
+        </w:rPr>
+        <w:t xml:space="preserve"> </w:t>
+      </w:r>
+      <w:r>
+        <w:rPr>
+          <w:i/>
+          <w:iCs/>
+        </w:rPr>
+        <w:t xml:space="preserve">Overnight</w:t>
+      </w:r>
+      <w:r>
+        <w:rPr>
+          <w:i/>
+          <w:iCs/>
+        </w:rPr>
+        <w:t xml:space="preserve"> </w:t>
+      </w:r>
+      <w:r>
+        <w:rPr>
+          <w:i/>
+          <w:iCs/>
+        </w:rPr>
+        <w:t xml:space="preserve">Comm.</w:t>
+      </w:r>
+      <w:r>
+        <w:rPr>
+          <w:i/>
+          <w:iCs/>
+        </w:rPr>
+        <w:t xml:space="preserve"> </w:t>
+      </w:r>
+      <w:r>
+        <w:rPr>
+          <w:i/>
+          <w:iCs/>
+        </w:rPr>
+        <w:t xml:space="preserve">(In</w:t>
+      </w:r>
+      <w:r>
+        <w:rPr>
+          <w:i/>
+          <w:iCs/>
+        </w:rPr>
+        <w:t xml:space="preserve"> </w:t>
+      </w:r>
+      <w:r>
+        <w:rPr>
+          <w:i/>
+          <w:iCs/>
+        </w:rPr>
+        <w:t xml:space="preserve">re</w:t>
+      </w:r>
+      <w:r>
+        <w:rPr>
+          <w:i/>
+          <w:iCs/>
+        </w:rPr>
+        <w:t xml:space="preserve"> </w:t>
+      </w:r>
+      <w:r>
+        <w:rPr>
+          <w:i/>
+          <w:iCs/>
+        </w:rPr>
+        <w:t xml:space="preserve">Conoco,</w:t>
+      </w:r>
+      <w:r>
+        <w:rPr>
+          <w:i/>
+          <w:iCs/>
+        </w:rPr>
+        <w:t xml:space="preserve"> </w:t>
+      </w:r>
+      <w:r>
+        <w:rPr>
+          <w:i/>
+          <w:iCs/>
+        </w:rPr>
+        <w:t xml:space="preserve">Inc.)</w:t>
+      </w:r>
+      <w:r>
+        <w:t xml:space="preserve">,</w:t>
+      </w:r>
+      <w:r>
+        <w:t xml:space="preserve"> </w:t>
+      </w:r>
+      <w:r>
+        <w:t xml:space="preserve">855</w:t>
+      </w:r>
+      <w:r>
+        <w:t xml:space="preserve"> </w:t>
+      </w:r>
+      <w:r>
+        <w:t xml:space="preserve">F.3d</w:t>
+      </w:r>
+      <w:r>
+        <w:t xml:space="preserve"> </w:t>
+      </w:r>
+      <w:r>
+        <w:t xml:space="preserve">703</w:t>
+      </w:r>
+      <w:r>
+        <w:t xml:space="preserve"> </w:t>
+      </w:r>
+      <w:r>
+        <w:t xml:space="preserve">(6th</w:t>
+      </w:r>
+      <w:r>
+        <w:t xml:space="preserve"> </w:t>
+      </w:r>
+      <w:r>
+        <w:t xml:space="preserve">Cir.</w:t>
+      </w:r>
+      <w:r>
+        <w:t xml:space="preserve"> </w:t>
+      </w:r>
+      <w:r>
+        <w:t xml:space="preserve">2017)</w:t>
+      </w:r>
+      <w:r>
+        <w:t xml:space="preserve">   </w:t>
       </w:r>
       <w:r>
         <w:tab/>
@@ -430,58 +1257,460 @@
     </w:p>
     <w:p>
       <w:pPr>
-        <w:pStyle w:val="AuthorityKind"/>
-      </w:pPr>
-      <w:r>
+        <w:pStyle w:val="BapLine"/>
+        <w:keepLines/>
+        <w:tabs>
+          <w:tab w:val="right" w:leader="dot" w:pos="9360"/>
+        </w:tabs>
+        <w:spacing w:before="140" w:after="0" w:line="364" w:lineRule="exact"/>
+        <w:ind w:left="720" w:right="1120" w:hanging="720"/>
+      </w:pPr>
+      <w:r>
+        <w:rPr>
+          <w:i/>
+          <w:iCs/>
+        </w:rPr>
+        <w:t xml:space="preserve">In</w:t>
+      </w:r>
+      <w:r>
+        <w:rPr>
+          <w:i/>
+          <w:iCs/>
+        </w:rPr>
+        <w:t xml:space="preserve"> </w:t>
+      </w:r>
+      <w:r>
+        <w:rPr>
+          <w:i/>
+          <w:iCs/>
+        </w:rPr>
+        <w:t xml:space="preserve">re</w:t>
+      </w:r>
+      <w:r>
+        <w:rPr>
+          <w:i/>
+          <w:iCs/>
+        </w:rPr>
+        <w:t xml:space="preserve"> </w:t>
+      </w:r>
+      <w:r>
+        <w:rPr>
+          <w:i/>
+          <w:iCs/>
+        </w:rPr>
+        <w:t xml:space="preserve">Evanston</w:t>
+      </w:r>
+      <w:r>
+        <w:rPr>
+          <w:i/>
+          <w:iCs/>
+        </w:rPr>
+        <w:t xml:space="preserve"> </w:t>
+      </w:r>
+      <w:r>
+        <w:rPr>
+          <w:i/>
+          <w:iCs/>
+        </w:rPr>
+        <w:t xml:space="preserve">Beauty</w:t>
+      </w:r>
+      <w:r>
+        <w:rPr>
+          <w:i/>
+          <w:iCs/>
+        </w:rPr>
+        <w:t xml:space="preserve"> </w:t>
+      </w:r>
+      <w:r>
+        <w:rPr>
+          <w:i/>
+          <w:iCs/>
+        </w:rPr>
+        <w:t xml:space="preserve">Supply,</w:t>
+      </w:r>
+      <w:r>
+        <w:rPr>
+          <w:i/>
+          <w:iCs/>
+        </w:rPr>
+        <w:t xml:space="preserve"> </w:t>
+      </w:r>
+      <w:r>
+        <w:rPr>
+          <w:i/>
+          <w:iCs/>
+        </w:rPr>
+        <w:t xml:space="preserve">Inc.</w:t>
+      </w:r>
+      <w:r>
+        <w:t xml:space="preserve">,</w:t>
+      </w:r>
+      <w:r>
+        <w:t xml:space="preserve"> </w:t>
+      </w:r>
+      <w:r>
+        <w:t xml:space="preserve">136</w:t>
+      </w:r>
+      <w:r>
+        <w:t xml:space="preserve"> </w:t>
+      </w:r>
+      <w:r>
+        <w:t xml:space="preserve">B.R.</w:t>
+      </w:r>
+      <w:r>
+        <w:t xml:space="preserve"> </w:t>
+      </w:r>
+      <w:r>
+        <w:t xml:space="preserve">171</w:t>
+      </w:r>
+      <w:r>
+        <w:t xml:space="preserve"> </w:t>
+      </w:r>
+      <w:r>
+        <w:t xml:space="preserve">(Bankr.</w:t>
+      </w:r>
+      <w:r>
+        <w:t xml:space="preserve"> </w:t>
+      </w:r>
+      <w:r>
+        <w:t xml:space="preserve">N.D.</w:t>
+      </w:r>
+      <w:r>
+        <w:t xml:space="preserve"> </w:t>
+      </w:r>
+      <w:r>
+        <w:t xml:space="preserve">Ill.</w:t>
+      </w:r>
+      <w:r>
+        <w:t xml:space="preserve"> </w:t>
+      </w:r>
+      <w:r>
+        <w:t xml:space="preserve">1992)</w:t>
+      </w:r>
+      <w:r>
+        <w:t xml:space="preserve">   </w:t>
+      </w:r>
+      <w:r>
+        <w:tab/>
+      </w:r>
+      <w:r>
+        <w:t xml:space="preserve">5</w:t>
+      </w:r>
+    </w:p>
+    <w:p>
+      <w:pPr>
+        <w:pStyle w:val="BapLine"/>
+        <w:keepLines/>
+        <w:tabs>
+          <w:tab w:val="right" w:leader="dot" w:pos="9360"/>
+        </w:tabs>
+        <w:spacing w:before="140" w:after="0" w:line="364" w:lineRule="exact"/>
+        <w:ind w:left="720" w:right="1120" w:hanging="720"/>
+      </w:pPr>
+      <w:r>
+        <w:rPr>
+          <w:i/>
+          <w:iCs/>
+        </w:rPr>
+        <w:t xml:space="preserve">In</w:t>
+      </w:r>
+      <w:r>
+        <w:rPr>
+          <w:i/>
+          <w:iCs/>
+        </w:rPr>
+        <w:t xml:space="preserve"> </w:t>
+      </w:r>
+      <w:r>
+        <w:rPr>
+          <w:i/>
+          <w:iCs/>
+        </w:rPr>
+        <w:t xml:space="preserve">re</w:t>
+      </w:r>
+      <w:r>
+        <w:rPr>
+          <w:i/>
+          <w:iCs/>
+        </w:rPr>
+        <w:t xml:space="preserve"> </w:t>
+      </w:r>
+      <w:r>
+        <w:rPr>
+          <w:i/>
+          <w:iCs/>
+        </w:rPr>
+        <w:t xml:space="preserve">Licking</w:t>
+      </w:r>
+      <w:r>
+        <w:rPr>
+          <w:i/>
+          <w:iCs/>
+        </w:rPr>
+        <w:t xml:space="preserve"> </w:t>
+      </w:r>
+      <w:r>
+        <w:rPr>
+          <w:i/>
+          <w:iCs/>
+        </w:rPr>
+        <w:t xml:space="preserve">River</w:t>
+      </w:r>
+      <w:r>
+        <w:rPr>
+          <w:i/>
+          <w:iCs/>
+        </w:rPr>
+        <w:t xml:space="preserve"> </w:t>
+      </w:r>
+      <w:r>
+        <w:rPr>
+          <w:i/>
+          <w:iCs/>
+        </w:rPr>
+        <w:t xml:space="preserve">Mining,</w:t>
+      </w:r>
+      <w:r>
+        <w:rPr>
+          <w:i/>
+          <w:iCs/>
+        </w:rPr>
+        <w:t xml:space="preserve"> </w:t>
+      </w:r>
+      <w:r>
+        <w:rPr>
+          <w:i/>
+          <w:iCs/>
+        </w:rPr>
+        <w:t xml:space="preserve">LLC</w:t>
+      </w:r>
+      <w:r>
+        <w:t xml:space="preserve">,</w:t>
+      </w:r>
+      <w:r>
+        <w:t xml:space="preserve"> </w:t>
+      </w:r>
+      <w:r>
+        <w:t xml:space="preserve">911</w:t>
+      </w:r>
+      <w:r>
+        <w:t xml:space="preserve"> </w:t>
+      </w:r>
+      <w:r>
+        <w:t xml:space="preserve">F.3d</w:t>
+      </w:r>
+      <w:r>
+        <w:t xml:space="preserve"> </w:t>
+      </w:r>
+      <w:r>
+        <w:t xml:space="preserve">806</w:t>
+      </w:r>
+      <w:r>
+        <w:t xml:space="preserve"> </w:t>
+      </w:r>
+      <w:r>
+        <w:t xml:space="preserve">(6th</w:t>
+      </w:r>
+      <w:r>
+        <w:t xml:space="preserve"> </w:t>
+      </w:r>
+      <w:r>
+        <w:t xml:space="preserve">Cir.</w:t>
+      </w:r>
+      <w:r>
+        <w:t xml:space="preserve"> </w:t>
+      </w:r>
+      <w:r>
+        <w:t xml:space="preserve">2018)</w:t>
+      </w:r>
+      <w:r>
+        <w:t xml:space="preserve">   </w:t>
+      </w:r>
+      <w:r>
+        <w:tab/>
+      </w:r>
+      <w:r>
+        <w:t xml:space="preserve">4</w:t>
+      </w:r>
+    </w:p>
+    <w:p>
+      <w:pPr>
+        <w:pStyle w:val="BapLine"/>
+        <w:keepNext/>
+        <w:keepLines/>
+        <w:spacing w:before="336" w:after="224" w:line="364" w:lineRule="exact"/>
+      </w:pPr>
+      <w:r>
+        <w:rPr>
+          <w:b/>
+          <w:bCs/>
+        </w:rPr>
         <w:t xml:space="preserve">Statutes</w:t>
       </w:r>
     </w:p>
     <w:p>
       <w:pPr>
-        <w:pStyle w:val="TOAEntry"/>
-      </w:pPr>
-      <w:r>
-        <w:t xml:space="preserve">11 U.S.C. § 1141(a)</w:t>
+        <w:pStyle w:val="BapLine"/>
+        <w:keepLines/>
+        <w:tabs>
+          <w:tab w:val="right" w:leader="dot" w:pos="9360"/>
+        </w:tabs>
+        <w:spacing w:before="140" w:after="0" w:line="364" w:lineRule="exact"/>
+        <w:ind w:left="720" w:right="1120" w:hanging="720"/>
+      </w:pPr>
+      <w:r>
+        <w:t xml:space="preserve">11</w:t>
+      </w:r>
+      <w:r>
+        <w:t xml:space="preserve"> </w:t>
+      </w:r>
+      <w:r>
+        <w:t xml:space="preserve">U.S.C.</w:t>
+      </w:r>
+      <w:r>
+        <w:t xml:space="preserve"> </w:t>
+      </w:r>
+      <w:r>
+        <w:t xml:space="preserve">§</w:t>
+      </w:r>
+      <w:r>
+        <w:t xml:space="preserve"> </w:t>
+      </w:r>
+      <w:r>
+        <w:t xml:space="preserve">1141(a)</w:t>
+      </w:r>
+      <w:r>
+        <w:t xml:space="preserve">   </w:t>
       </w:r>
       <w:r>
         <w:tab/>
       </w:r>
       <w:r>
-        <w:t xml:space="preserve">6</w:t>
-      </w:r>
-    </w:p>
-    <w:p>
-      <w:pPr>
-        <w:pStyle w:val="TOAEntry"/>
-      </w:pPr>
-      <w:r>
-        <w:t xml:space="preserve">11 U.S.C. § 1141(b)</w:t>
+        <w:t xml:space="preserve">7</w:t>
+      </w:r>
+    </w:p>
+    <w:p>
+      <w:pPr>
+        <w:pStyle w:val="BapLine"/>
+        <w:keepLines/>
+        <w:tabs>
+          <w:tab w:val="right" w:leader="dot" w:pos="9360"/>
+        </w:tabs>
+        <w:spacing w:before="140" w:after="0" w:line="364" w:lineRule="exact"/>
+        <w:ind w:left="720" w:right="1120" w:hanging="720"/>
+      </w:pPr>
+      <w:r>
+        <w:t xml:space="preserve">11</w:t>
+      </w:r>
+      <w:r>
+        <w:t xml:space="preserve"> </w:t>
+      </w:r>
+      <w:r>
+        <w:t xml:space="preserve">U.S.C.</w:t>
+      </w:r>
+      <w:r>
+        <w:t xml:space="preserve"> </w:t>
+      </w:r>
+      <w:r>
+        <w:t xml:space="preserve">§</w:t>
+      </w:r>
+      <w:r>
+        <w:t xml:space="preserve"> </w:t>
+      </w:r>
+      <w:r>
+        <w:t xml:space="preserve">1141(b)</w:t>
+      </w:r>
+      <w:r>
+        <w:t xml:space="preserve">   </w:t>
       </w:r>
       <w:r>
         <w:tab/>
       </w:r>
       <w:r>
-        <w:t xml:space="preserve">6</w:t>
-      </w:r>
-    </w:p>
-    <w:p>
-      <w:pPr>
-        <w:pStyle w:val="SectionEnd"/>
+        <w:t xml:space="preserve">7</w:t>
+      </w:r>
+    </w:p>
+    <w:p>
+      <w:pPr>
+        <w:spacing w:before="0" w:after="0" w:line="20" w:lineRule="exact"/>
         <w:sectPr>
-          <w:footerReference w:type="default" r:id="rIdFtrPage"/>
+          <w:footerReference w:type="default" r:id="rIdBapPage"/>
           <w:pgSz w:w="12240" w:h="15840"/>
           <w:pgMar w:top="1440" w:right="1440" w:bottom="1440" w:left="1440" w:header="720" w:footer="720" w:gutter="0"/>
           <w:pgNumType w:fmt="lowerRoman" w:start="1"/>
-          <w:cols w:space="720"/>
         </w:sectPr>
       </w:pPr>
     </w:p>
     <w:p>
       <w:pPr>
-        <w:pStyle w:val="Heading1Top"/>
-      </w:pPr>
-      <w:r>
-        <w:t xml:space="preserve">Statement of the Issues</w:t>
+        <w:pStyle w:val="BapLine"/>
+        <w:keepNext/>
+        <w:keepLines/>
+        <w:spacing w:before="0" w:after="336" w:line="480" w:lineRule="exact"/>
+        <w:jc w:val="center"/>
+      </w:pPr>
+      <w:r>
+        <w:rPr>
+          <w:b/>
+          <w:bCs/>
+          <w:sz w:val="39"/>
+          <w:szCs w:val="39"/>
+        </w:rPr>
+        <w:t xml:space="preserve">Statement</w:t>
+      </w:r>
+      <w:r>
+        <w:rPr>
+          <w:b/>
+          <w:bCs/>
+          <w:sz w:val="39"/>
+          <w:szCs w:val="39"/>
+        </w:rPr>
+        <w:t xml:space="preserve"> </w:t>
+      </w:r>
+      <w:r>
+        <w:rPr>
+          <w:b/>
+          <w:bCs/>
+          <w:sz w:val="39"/>
+          <w:szCs w:val="39"/>
+        </w:rPr>
+        <w:t xml:space="preserve">of</w:t>
+      </w:r>
+      <w:r>
+        <w:rPr>
+          <w:b/>
+          <w:bCs/>
+          <w:sz w:val="39"/>
+          <w:szCs w:val="39"/>
+        </w:rPr>
+        <w:t xml:space="preserve"> </w:t>
+      </w:r>
+      <w:r>
+        <w:rPr>
+          <w:b/>
+          <w:bCs/>
+          <w:sz w:val="39"/>
+          <w:szCs w:val="39"/>
+        </w:rPr>
+        <w:t xml:space="preserve">the</w:t>
+      </w:r>
+      <w:r>
+        <w:rPr>
+          <w:b/>
+          <w:bCs/>
+          <w:sz w:val="39"/>
+          <w:szCs w:val="39"/>
+        </w:rPr>
+        <w:t xml:space="preserve"> </w:t>
+      </w:r>
+      <w:r>
+        <w:rPr>
+          <w:b/>
+          <w:bCs/>
+          <w:sz w:val="39"/>
+          <w:szCs w:val="39"/>
+        </w:rPr>
+        <w:t xml:space="preserve">Issues</w:t>
       </w:r>
     </w:p>
     <w:p>
@@ -494,13 +1723,75 @@
     </w:p>
     <w:p>
       <w:pPr>
-        <w:pStyle w:val="Heading1"/>
-      </w:pPr>
-      <w:bookmarkStart w:id="9" w:name="_9ce86cd89e816c495213921bce711286420babc"/>
-      <w:r>
-        <w:t xml:space="preserve">Statement of the Case</w:t>
-      </w:r>
-      <w:bookmarkEnd w:id="9"/>
+        <w:pStyle w:val="BapLine"/>
+        <w:keepNext/>
+        <w:keepLines/>
+        <w:spacing w:before="448" w:after="336" w:line="480" w:lineRule="exact"/>
+        <w:jc w:val="center"/>
+      </w:pPr>
+      <w:r>
+        <w:rPr>
+          <w:b/>
+          <w:bCs/>
+          <w:sz w:val="39"/>
+          <w:szCs w:val="39"/>
+        </w:rPr>
+        <w:t xml:space="preserve">Statement</w:t>
+      </w:r>
+      <w:r>
+        <w:rPr>
+          <w:b/>
+          <w:bCs/>
+          <w:sz w:val="39"/>
+          <w:szCs w:val="39"/>
+        </w:rPr>
+        <w:t xml:space="preserve"> </w:t>
+      </w:r>
+      <w:r>
+        <w:rPr>
+          <w:b/>
+          <w:bCs/>
+          <w:sz w:val="39"/>
+          <w:szCs w:val="39"/>
+        </w:rPr>
+        <w:t xml:space="preserve">of</w:t>
+      </w:r>
+      <w:r>
+        <w:rPr>
+          <w:b/>
+          <w:bCs/>
+          <w:sz w:val="39"/>
+          <w:szCs w:val="39"/>
+        </w:rPr>
+        <w:t xml:space="preserve"> </w:t>
+      </w:r>
+      <w:r>
+        <w:rPr>
+          <w:b/>
+          <w:bCs/>
+          <w:sz w:val="39"/>
+          <w:szCs w:val="39"/>
+        </w:rPr>
+        <w:t xml:space="preserve">the</w:t>
+      </w:r>
+      <w:r>
+        <w:rPr>
+          <w:b/>
+          <w:bCs/>
+          <w:sz w:val="39"/>
+          <w:szCs w:val="39"/>
+        </w:rPr>
+        <w:t xml:space="preserve"> </w:t>
+      </w:r>
+      <w:r>
+        <w:rPr>
+          <w:b/>
+          <w:bCs/>
+          <w:sz w:val="39"/>
+          <w:szCs w:val="39"/>
+        </w:rPr>
+        <w:t xml:space="preserve">Case</w:t>
+      </w:r>
     </w:p>
     <w:p>
       <w:pPr>
@@ -552,13 +1843,57 @@
     </w:p>
     <w:p>
       <w:pPr>
-        <w:pStyle w:val="Heading1"/>
-      </w:pPr>
-      <w:bookmarkStart w:id="10" w:name="_9339ea4a612847623b5ac5d9b950ce636f60fb0"/>
-      <w:r>
-        <w:t xml:space="preserve">Standard of Review</w:t>
-      </w:r>
-      <w:bookmarkEnd w:id="10"/>
+        <w:pStyle w:val="BapLine"/>
+        <w:keepNext/>
+        <w:keepLines/>
+        <w:spacing w:before="448" w:after="336" w:line="480" w:lineRule="exact"/>
+        <w:jc w:val="center"/>
+      </w:pPr>
+      <w:r>
+        <w:rPr>
+          <w:b/>
+          <w:bCs/>
+          <w:sz w:val="39"/>
+          <w:szCs w:val="39"/>
+        </w:rPr>
+        <w:t xml:space="preserve">Standard</w:t>
+      </w:r>
+      <w:r>
+        <w:rPr>
+          <w:b/>
+          <w:bCs/>
+          <w:sz w:val="39"/>
+          <w:szCs w:val="39"/>
+        </w:rPr>
+        <w:t xml:space="preserve"> </w:t>
+      </w:r>
+      <w:r>
+        <w:rPr>
+          <w:b/>
+          <w:bCs/>
+          <w:sz w:val="39"/>
+          <w:szCs w:val="39"/>
+        </w:rPr>
+        <w:t xml:space="preserve">of</w:t>
+      </w:r>
+      <w:r>
+        <w:rPr>
+          <w:b/>
+          <w:bCs/>
+          <w:sz w:val="39"/>
+          <w:szCs w:val="39"/>
+        </w:rPr>
+        <w:t xml:space="preserve"> </w:t>
+      </w:r>
+      <w:r>
+        <w:rPr>
+          <w:b/>
+          <w:bCs/>
+          <w:sz w:val="39"/>
+          <w:szCs w:val="39"/>
+        </w:rPr>
+        <w:t xml:space="preserve">Review</w:t>
+      </w:r>
     </w:p>
     <w:p>
       <w:pPr>
@@ -609,13 +1944,57 @@
     </w:p>
     <w:p>
       <w:pPr>
-        <w:pStyle w:val="Heading1"/>
-      </w:pPr>
-      <w:bookmarkStart w:id="11" w:name="_46604d111831f1e81d7ad6a7ac73e8c7d2c5dc8"/>
-      <w:r>
-        <w:t xml:space="preserve">Summary of Argument</w:t>
-      </w:r>
-      <w:bookmarkEnd w:id="11"/>
+        <w:pStyle w:val="BapLine"/>
+        <w:keepNext/>
+        <w:keepLines/>
+        <w:spacing w:before="448" w:after="336" w:line="480" w:lineRule="exact"/>
+        <w:jc w:val="center"/>
+      </w:pPr>
+      <w:r>
+        <w:rPr>
+          <w:b/>
+          <w:bCs/>
+          <w:sz w:val="39"/>
+          <w:szCs w:val="39"/>
+        </w:rPr>
+        <w:t xml:space="preserve">Summary</w:t>
+      </w:r>
+      <w:r>
+        <w:rPr>
+          <w:b/>
+          <w:bCs/>
+          <w:sz w:val="39"/>
+          <w:szCs w:val="39"/>
+        </w:rPr>
+        <w:t xml:space="preserve"> </w:t>
+      </w:r>
+      <w:r>
+        <w:rPr>
+          <w:b/>
+          <w:bCs/>
+          <w:sz w:val="39"/>
+          <w:szCs w:val="39"/>
+        </w:rPr>
+        <w:t xml:space="preserve">of</w:t>
+      </w:r>
+      <w:r>
+        <w:rPr>
+          <w:b/>
+          <w:bCs/>
+          <w:sz w:val="39"/>
+          <w:szCs w:val="39"/>
+        </w:rPr>
+        <w:t xml:space="preserve"> </w:t>
+      </w:r>
+      <w:r>
+        <w:rPr>
+          <w:b/>
+          <w:bCs/>
+          <w:sz w:val="39"/>
+          <w:szCs w:val="39"/>
+        </w:rPr>
+        <w:t xml:space="preserve">Argument</w:t>
+      </w:r>
     </w:p>
     <w:p>
       <w:pPr>
@@ -627,13 +2006,21 @@
     </w:p>
     <w:p>
       <w:pPr>
-        <w:pStyle w:val="Heading1"/>
-      </w:pPr>
-      <w:bookmarkStart w:id="12" w:name="_argument"/>
-      <w:r>
+        <w:pStyle w:val="BapLine"/>
+        <w:keepNext/>
+        <w:keepLines/>
+        <w:spacing w:before="448" w:after="336" w:line="480" w:lineRule="exact"/>
+        <w:jc w:val="center"/>
+      </w:pPr>
+      <w:r>
+        <w:rPr>
+          <w:b/>
+          <w:bCs/>
+          <w:sz w:val="39"/>
+          <w:szCs w:val="39"/>
+        </w:rPr>
         <w:t xml:space="preserve">Argument</w:t>
       </w:r>
-      <w:bookmarkEnd w:id="12"/>
     </w:p>
     <w:p>
       <w:pPr>
@@ -666,13 +2053,236 @@
     </w:p>
     <w:p>
       <w:pPr>
-        <w:pStyle w:val="Heading2"/>
-      </w:pPr>
-      <w:bookmarkStart w:id="13" w:name="_98a30d67215e1bc1623500a509a14d7ad891c72"/>
-      <w:r>
-        <w:t xml:space="preserve">The Cash Collateral Orders do not obligate UCB to pay the Professional fees.</w:t>
-      </w:r>
-      <w:bookmarkEnd w:id="13"/>
+        <w:pStyle w:val="BapLine"/>
+        <w:keepNext/>
+        <w:keepLines/>
+        <w:spacing w:before="336" w:after="280" w:line="400" w:lineRule="exact"/>
+      </w:pPr>
+      <w:r>
+        <w:rPr>
+          <w:b/>
+          <w:bCs/>
+          <w:sz w:val="34"/>
+          <w:szCs w:val="34"/>
+        </w:rPr>
+        <w:t xml:space="preserve">The</w:t>
+      </w:r>
+      <w:r>
+        <w:rPr>
+          <w:b/>
+          <w:bCs/>
+          <w:sz w:val="34"/>
+          <w:szCs w:val="34"/>
+        </w:rPr>
+        <w:t xml:space="preserve"> </w:t>
+      </w:r>
+      <w:r>
+        <w:rPr>
+          <w:b/>
+          <w:bCs/>
+          <w:sz w:val="34"/>
+          <w:szCs w:val="34"/>
+        </w:rPr>
+        <w:t xml:space="preserve">Cash</w:t>
+      </w:r>
+      <w:r>
+        <w:rPr>
+          <w:b/>
+          <w:bCs/>
+          <w:sz w:val="34"/>
+          <w:szCs w:val="34"/>
+        </w:rPr>
+        <w:t xml:space="preserve"> </w:t>
+      </w:r>
+      <w:r>
+        <w:rPr>
+          <w:b/>
+          <w:bCs/>
+          <w:sz w:val="34"/>
+          <w:szCs w:val="34"/>
+        </w:rPr>
+        <w:t xml:space="preserve">Collateral</w:t>
+      </w:r>
+      <w:r>
+        <w:rPr>
+          <w:b/>
+          <w:bCs/>
+          <w:sz w:val="34"/>
+          <w:szCs w:val="34"/>
+        </w:rPr>
+        <w:t xml:space="preserve"> </w:t>
+      </w:r>
+      <w:r>
+        <w:rPr>
+          <w:b/>
+          <w:bCs/>
+          <w:sz w:val="34"/>
+          <w:szCs w:val="34"/>
+        </w:rPr>
+        <w:t xml:space="preserve">Orders</w:t>
+      </w:r>
+      <w:r>
+        <w:rPr>
+          <w:b/>
+          <w:bCs/>
+          <w:sz w:val="34"/>
+          <w:szCs w:val="34"/>
+        </w:rPr>
+        <w:t xml:space="preserve"> </w:t>
+      </w:r>
+      <w:r>
+        <w:rPr>
+          <w:b/>
+          <w:bCs/>
+          <w:sz w:val="34"/>
+          <w:szCs w:val="34"/>
+        </w:rPr>
+        <w:t xml:space="preserve">do</w:t>
+      </w:r>
+      <w:r>
+        <w:rPr>
+          <w:b/>
+          <w:bCs/>
+          <w:sz w:val="34"/>
+          <w:szCs w:val="34"/>
+        </w:rPr>
+        <w:t xml:space="preserve"> </w:t>
+      </w:r>
+      <w:r>
+        <w:rPr>
+          <w:b/>
+          <w:bCs/>
+          <w:sz w:val="34"/>
+          <w:szCs w:val="34"/>
+        </w:rPr>
+        <w:t xml:space="preserve">not</w:t>
+      </w:r>
+      <w:r>
+        <w:rPr>
+          <w:b/>
+          <w:bCs/>
+          <w:sz w:val="34"/>
+          <w:szCs w:val="34"/>
+        </w:rPr>
+        <w:t xml:space="preserve"> </w:t>
+      </w:r>
+      <w:r>
+        <w:rPr>
+          <w:b/>
+          <w:bCs/>
+          <w:sz w:val="34"/>
+          <w:szCs w:val="34"/>
+        </w:rPr>
+        <w:t xml:space="preserve">obligate</w:t>
+      </w:r>
+      <w:r>
+        <w:rPr>
+          <w:b/>
+          <w:bCs/>
+          <w:sz w:val="34"/>
+          <w:szCs w:val="34"/>
+        </w:rPr>
+        <w:t xml:space="preserve"> </w:t>
+      </w:r>
+      <w:r>
+        <w:rPr>
+          <w:b/>
+          <w:bCs/>
+          <w:sz w:val="34"/>
+          <w:szCs w:val="34"/>
+        </w:rPr>
+        <w:t xml:space="preserve">UCB</w:t>
+      </w:r>
+      <w:r>
+        <w:rPr>
+          <w:b/>
+          <w:bCs/>
+          <w:sz w:val="34"/>
+          <w:szCs w:val="34"/>
+        </w:rPr>
+        <w:t xml:space="preserve"> </w:t>
+      </w:r>
+      <w:r>
+        <w:rPr>
+          <w:b/>
+          <w:bCs/>
+          <w:sz w:val="34"/>
+          <w:szCs w:val="34"/>
+        </w:rPr>
+        <w:t xml:space="preserve">to</w:t>
+      </w:r>
+      <w:r>
+        <w:rPr>
+          <w:b/>
+          <w:bCs/>
+          <w:sz w:val="34"/>
+          <w:szCs w:val="34"/>
+        </w:rPr>
+        <w:t xml:space="preserve"> </w:t>
+      </w:r>
+      <w:r>
+        <w:rPr>
+          <w:b/>
+          <w:bCs/>
+          <w:sz w:val="34"/>
+          <w:szCs w:val="34"/>
+        </w:rPr>
+        <w:t xml:space="preserve">pay</w:t>
+      </w:r>
+      <w:r>
+        <w:rPr>
+          <w:b/>
+          <w:bCs/>
+          <w:sz w:val="34"/>
+          <w:szCs w:val="34"/>
+        </w:rPr>
+        <w:t xml:space="preserve"> </w:t>
+      </w:r>
+      <w:r>
+        <w:rPr>
+          <w:b/>
+          <w:bCs/>
+          <w:sz w:val="34"/>
+          <w:szCs w:val="34"/>
+        </w:rPr>
+        <w:t xml:space="preserve">the</w:t>
+      </w:r>
+      <w:r>
+        <w:rPr>
+          <w:b/>
+          <w:bCs/>
+          <w:sz w:val="34"/>
+          <w:szCs w:val="34"/>
+        </w:rPr>
+        <w:t xml:space="preserve"> </w:t>
+      </w:r>
+      <w:r>
+        <w:rPr>
+          <w:b/>
+          <w:bCs/>
+          <w:sz w:val="34"/>
+          <w:szCs w:val="34"/>
+        </w:rPr>
+        <w:t xml:space="preserve">Professional</w:t>
+      </w:r>
+      <w:r>
+        <w:rPr>
+          <w:b/>
+          <w:bCs/>
+          <w:sz w:val="34"/>
+          <w:szCs w:val="34"/>
+        </w:rPr>
+        <w:t xml:space="preserve"> </w:t>
+      </w:r>
+      <w:r>
+        <w:rPr>
+          <w:b/>
+          <w:bCs/>
+          <w:sz w:val="34"/>
+          <w:szCs w:val="34"/>
+        </w:rPr>
+        <w:t xml:space="preserve">fees.</w:t>
+      </w:r>
     </w:p>
     <w:p>
       <w:pPr>
@@ -700,20 +2310,243 @@
     </w:p>
     <w:p>
       <w:pPr>
-        <w:pStyle w:val="Heading2"/>
-      </w:pPr>
-      <w:bookmarkStart w:id="14" w:name="_20ba20513426ddd780278ed2966a56db16aa60e"/>
-      <w:r>
-        <w:t xml:space="preserve">The Plan of Confirmation does not require UCB to pay the Professional fees.</w:t>
-      </w:r>
-      <w:bookmarkEnd w:id="14"/>
+        <w:pStyle w:val="BapLine"/>
+        <w:keepNext/>
+        <w:keepLines/>
+        <w:spacing w:before="336" w:after="280" w:line="400" w:lineRule="exact"/>
+      </w:pPr>
+      <w:r>
+        <w:rPr>
+          <w:b/>
+          <w:bCs/>
+          <w:sz w:val="34"/>
+          <w:szCs w:val="34"/>
+        </w:rPr>
+        <w:t xml:space="preserve">The</w:t>
+      </w:r>
+      <w:r>
+        <w:rPr>
+          <w:b/>
+          <w:bCs/>
+          <w:sz w:val="34"/>
+          <w:szCs w:val="34"/>
+        </w:rPr>
+        <w:t xml:space="preserve"> </w:t>
+      </w:r>
+      <w:r>
+        <w:rPr>
+          <w:b/>
+          <w:bCs/>
+          <w:sz w:val="34"/>
+          <w:szCs w:val="34"/>
+        </w:rPr>
+        <w:t xml:space="preserve">Plan</w:t>
+      </w:r>
+      <w:r>
+        <w:rPr>
+          <w:b/>
+          <w:bCs/>
+          <w:sz w:val="34"/>
+          <w:szCs w:val="34"/>
+        </w:rPr>
+        <w:t xml:space="preserve"> </w:t>
+      </w:r>
+      <w:r>
+        <w:rPr>
+          <w:b/>
+          <w:bCs/>
+          <w:sz w:val="34"/>
+          <w:szCs w:val="34"/>
+        </w:rPr>
+        <w:t xml:space="preserve">of</w:t>
+      </w:r>
+      <w:r>
+        <w:rPr>
+          <w:b/>
+          <w:bCs/>
+          <w:sz w:val="34"/>
+          <w:szCs w:val="34"/>
+        </w:rPr>
+        <w:t xml:space="preserve"> </w:t>
+      </w:r>
+      <w:r>
+        <w:rPr>
+          <w:b/>
+          <w:bCs/>
+          <w:sz w:val="34"/>
+          <w:szCs w:val="34"/>
+        </w:rPr>
+        <w:t xml:space="preserve">Confirmation</w:t>
+      </w:r>
+      <w:r>
+        <w:rPr>
+          <w:b/>
+          <w:bCs/>
+          <w:sz w:val="34"/>
+          <w:szCs w:val="34"/>
+        </w:rPr>
+        <w:t xml:space="preserve"> </w:t>
+      </w:r>
+      <w:r>
+        <w:rPr>
+          <w:b/>
+          <w:bCs/>
+          <w:sz w:val="34"/>
+          <w:szCs w:val="34"/>
+        </w:rPr>
+        <w:t xml:space="preserve">does</w:t>
+      </w:r>
+      <w:r>
+        <w:rPr>
+          <w:b/>
+          <w:bCs/>
+          <w:sz w:val="34"/>
+          <w:szCs w:val="34"/>
+        </w:rPr>
+        <w:t xml:space="preserve"> </w:t>
+      </w:r>
+      <w:r>
+        <w:rPr>
+          <w:b/>
+          <w:bCs/>
+          <w:sz w:val="34"/>
+          <w:szCs w:val="34"/>
+        </w:rPr>
+        <w:t xml:space="preserve">not</w:t>
+      </w:r>
+      <w:r>
+        <w:rPr>
+          <w:b/>
+          <w:bCs/>
+          <w:sz w:val="34"/>
+          <w:szCs w:val="34"/>
+        </w:rPr>
+        <w:t xml:space="preserve"> </w:t>
+      </w:r>
+      <w:r>
+        <w:rPr>
+          <w:b/>
+          <w:bCs/>
+          <w:sz w:val="34"/>
+          <w:szCs w:val="34"/>
+        </w:rPr>
+        <w:t xml:space="preserve">require</w:t>
+      </w:r>
+      <w:r>
+        <w:rPr>
+          <w:b/>
+          <w:bCs/>
+          <w:sz w:val="34"/>
+          <w:szCs w:val="34"/>
+        </w:rPr>
+        <w:t xml:space="preserve"> </w:t>
+      </w:r>
+      <w:r>
+        <w:rPr>
+          <w:b/>
+          <w:bCs/>
+          <w:sz w:val="34"/>
+          <w:szCs w:val="34"/>
+        </w:rPr>
+        <w:t xml:space="preserve">UCB</w:t>
+      </w:r>
+      <w:r>
+        <w:rPr>
+          <w:b/>
+          <w:bCs/>
+          <w:sz w:val="34"/>
+          <w:szCs w:val="34"/>
+        </w:rPr>
+        <w:t xml:space="preserve"> </w:t>
+      </w:r>
+      <w:r>
+        <w:rPr>
+          <w:b/>
+          <w:bCs/>
+          <w:sz w:val="34"/>
+          <w:szCs w:val="34"/>
+        </w:rPr>
+        <w:t xml:space="preserve">to</w:t>
+      </w:r>
+      <w:r>
+        <w:rPr>
+          <w:b/>
+          <w:bCs/>
+          <w:sz w:val="34"/>
+          <w:szCs w:val="34"/>
+        </w:rPr>
+        <w:t xml:space="preserve"> </w:t>
+      </w:r>
+      <w:r>
+        <w:rPr>
+          <w:b/>
+          <w:bCs/>
+          <w:sz w:val="34"/>
+          <w:szCs w:val="34"/>
+        </w:rPr>
+        <w:t xml:space="preserve">pay</w:t>
+      </w:r>
+      <w:r>
+        <w:rPr>
+          <w:b/>
+          <w:bCs/>
+          <w:sz w:val="34"/>
+          <w:szCs w:val="34"/>
+        </w:rPr>
+        <w:t xml:space="preserve"> </w:t>
+      </w:r>
+      <w:r>
+        <w:rPr>
+          <w:b/>
+          <w:bCs/>
+          <w:sz w:val="34"/>
+          <w:szCs w:val="34"/>
+        </w:rPr>
+        <w:t xml:space="preserve">the</w:t>
+      </w:r>
+      <w:r>
+        <w:rPr>
+          <w:b/>
+          <w:bCs/>
+          <w:sz w:val="34"/>
+          <w:szCs w:val="34"/>
+        </w:rPr>
+        <w:t xml:space="preserve"> </w:t>
+      </w:r>
+      <w:r>
+        <w:rPr>
+          <w:b/>
+          <w:bCs/>
+          <w:sz w:val="34"/>
+          <w:szCs w:val="34"/>
+        </w:rPr>
+        <w:t xml:space="preserve">Professional</w:t>
+      </w:r>
+      <w:r>
+        <w:rPr>
+          <w:b/>
+          <w:bCs/>
+          <w:sz w:val="34"/>
+          <w:szCs w:val="34"/>
+        </w:rPr>
+        <w:t xml:space="preserve"> </w:t>
+      </w:r>
+      <w:r>
+        <w:rPr>
+          <w:b/>
+          <w:bCs/>
+          <w:sz w:val="34"/>
+          <w:szCs w:val="34"/>
+        </w:rPr>
+        <w:t xml:space="preserve">fees.</w:t>
+      </w:r>
     </w:p>
     <w:p>
       <w:pPr>
         <w:pStyle w:val="FirstParagraph"/>
       </w:pPr>
       <w:r>
-        <w:t xml:space="preserve">A confirmed plan is legally binding on all parties. 11 U.S.C. § 1141(a). Post-Confirmation, parties are precluded from raising issues they could have raised pre-confirmation. 11 U.S.C. § 1141(b).</w:t>
+        <w:t xml:space="preserve">A confirmed plan is legally binding on all parties. 11 U.S.C. § 1141(a). Post-Confirmation, parties are precluded from raising issues they could have raised pre-confirmation. 11 U.S.C. § 1141(b).</w:t>
       </w:r>
     </w:p>
     <w:p>
@@ -726,13 +2559,21 @@
     </w:p>
     <w:p>
       <w:pPr>
-        <w:pStyle w:val="Heading1"/>
-      </w:pPr>
-      <w:bookmarkStart w:id="15" w:name="_conclusion"/>
-      <w:r>
+        <w:pStyle w:val="BapLine"/>
+        <w:keepNext/>
+        <w:keepLines/>
+        <w:spacing w:before="448" w:after="336" w:line="480" w:lineRule="exact"/>
+        <w:jc w:val="center"/>
+      </w:pPr>
+      <w:r>
+        <w:rPr>
+          <w:b/>
+          <w:bCs/>
+          <w:sz w:val="39"/>
+          <w:szCs w:val="39"/>
+        </w:rPr>
         <w:t xml:space="preserve">Conclusion</w:t>
       </w:r>
-      <w:bookmarkEnd w:id="15"/>
     </w:p>
     <w:p>
       <w:pPr>
@@ -744,7 +2585,11 @@
     </w:p>
     <w:p>
       <w:pPr>
-        <w:pStyle w:val="SignatureLead"/>
+        <w:pStyle w:val="BapLine"/>
+        <w:keepNext/>
+        <w:keepLines/>
+        <w:spacing w:before="448" w:after="0" w:line="364" w:lineRule="exact"/>
+        <w:ind w:left="4680"/>
       </w:pPr>
       <w:r>
         <w:t xml:space="preserve">Respectfully submitted,</w:t>
@@ -752,7 +2597,11 @@
     </w:p>
     <w:p>
       <w:pPr>
-        <w:pStyle w:val="Signature"/>
+        <w:pStyle w:val="BapLine"/>
+        <w:keepNext/>
+        <w:keepLines/>
+        <w:spacing w:before="336" w:after="0" w:line="364" w:lineRule="exact"/>
+        <w:ind w:left="4680"/>
       </w:pPr>
       <w:r>
         <w:t xml:space="preserve">s/ Scott A. Bachert</w:t>
@@ -760,15 +2609,29 @@
     </w:p>
     <w:p>
       <w:pPr>
-        <w:pStyle w:val="Signature"/>
-      </w:pPr>
-      <w:r>
-        <w:t xml:space="preserve">KERRICK BACHERT</w:t>
-      </w:r>
-    </w:p>
-    <w:p>
-      <w:pPr>
-        <w:pStyle w:val="Signature"/>
+        <w:pStyle w:val="BapLine"/>
+        <w:keepNext/>
+        <w:keepLines/>
+        <w:spacing w:before="0" w:after="0" w:line="364" w:lineRule="exact"/>
+        <w:ind w:left="4680"/>
+      </w:pPr>
+      <w:r>
+        <w:t xml:space="preserve">KERRICK</w:t>
+      </w:r>
+      <w:r>
+        <w:t xml:space="preserve"> </w:t>
+      </w:r>
+      <w:r>
+        <w:t xml:space="preserve">BACHERT</w:t>
+      </w:r>
+    </w:p>
+    <w:p>
+      <w:pPr>
+        <w:pStyle w:val="BapLine"/>
+        <w:keepNext/>
+        <w:keepLines/>
+        <w:spacing w:before="0" w:after="0" w:line="364" w:lineRule="exact"/>
+        <w:ind w:left="4680"/>
       </w:pPr>
       <w:r>
         <w:t xml:space="preserve">sbachert@kerricklaw.com</w:t>
@@ -776,23 +2639,52 @@
     </w:p>
     <w:p>
       <w:pPr>
-        <w:pStyle w:val="SignatureDate"/>
-      </w:pPr>
-      <w:r>
-        <w:t xml:space="preserve">August 30, 2019</w:t>
-      </w:r>
-    </w:p>
-    <w:p>
-      <w:pPr>
-        <w:pStyle w:val="FrontHeadingBreak"/>
-      </w:pPr>
-      <w:r>
+        <w:pStyle w:val="BapLine"/>
+        <w:keepLines/>
+        <w:spacing w:before="224" w:after="0" w:line="364" w:lineRule="exact"/>
+        <w:ind w:left="4680"/>
+      </w:pPr>
+      <w:r>
+        <w:t xml:space="preserve">August</w:t>
+      </w:r>
+      <w:r>
+        <w:t xml:space="preserve"> </w:t>
+      </w:r>
+      <w:r>
+        <w:t xml:space="preserve">30,</w:t>
+      </w:r>
+      <w:r>
+        <w:t xml:space="preserve"> </w:t>
+      </w:r>
+      <w:r>
+        <w:t xml:space="preserve">2019</w:t>
+      </w:r>
+    </w:p>
+    <w:p>
+      <w:pPr>
+        <w:pStyle w:val="BapLine"/>
+        <w:keepNext/>
+        <w:keepLines/>
+        <w:pageBreakBefore/>
+        <w:spacing w:before="0" w:after="336" w:line="480" w:lineRule="exact"/>
+        <w:jc w:val="center"/>
+      </w:pPr>
+      <w:r>
+        <w:rPr>
+          <w:b/>
+          <w:bCs/>
+          <w:sz w:val="39"/>
+          <w:szCs w:val="39"/>
+        </w:rPr>
         <w:t xml:space="preserve">Certificate of Compliance</w:t>
       </w:r>
     </w:p>
     <w:p>
       <w:pPr>
-        <w:pStyle w:val="CertText"/>
+        <w:pStyle w:val="BapLine"/>
+        <w:keepNext/>
+        <w:keepLines/>
+        <w:spacing w:before="0" w:after="0" w:line="364" w:lineRule="exact"/>
       </w:pPr>
       <w:r>
         <w:t xml:space="preserve">This brief of appellee complies with the type-volume limitation of Fed. R. Bankr. P. 8015(a)(7)(B) because it contains 1,185 words, excluding the parts of the brief exempted by Fed. R. Bankr. P. 8015(g). It complies with the typeface requirement of Fed. R. Bankr. P. 8015(a)(5) and the type-style requirement of Fed. R. Bankr. P. 8015(a)(6) because it was prepared in a proportionally spaced typeface, Times New Roman at 14-point, with case names in italics.</w:t>
@@ -800,7 +2692,11 @@
     </w:p>
     <w:p>
       <w:pPr>
-        <w:pStyle w:val="SignatureLead"/>
+        <w:pStyle w:val="BapLine"/>
+        <w:keepNext/>
+        <w:keepLines/>
+        <w:spacing w:before="448" w:after="0" w:line="364" w:lineRule="exact"/>
+        <w:ind w:left="4680"/>
       </w:pPr>
       <w:r>
         <w:t xml:space="preserve">Respectfully submitted,</w:t>
@@ -808,7 +2704,11 @@
     </w:p>
     <w:p>
       <w:pPr>
-        <w:pStyle w:val="Signature"/>
+        <w:pStyle w:val="BapLine"/>
+        <w:keepNext/>
+        <w:keepLines/>
+        <w:spacing w:before="336" w:after="0" w:line="364" w:lineRule="exact"/>
+        <w:ind w:left="4680"/>
       </w:pPr>
       <w:r>
         <w:t xml:space="preserve">s/ Scott A. Bachert</w:t>
@@ -816,15 +2716,29 @@
     </w:p>
     <w:p>
       <w:pPr>
-        <w:pStyle w:val="Signature"/>
-      </w:pPr>
-      <w:r>
-        <w:t xml:space="preserve">KERRICK BACHERT</w:t>
-      </w:r>
-    </w:p>
-    <w:p>
-      <w:pPr>
-        <w:pStyle w:val="Signature"/>
+        <w:pStyle w:val="BapLine"/>
+        <w:keepNext/>
+        <w:keepLines/>
+        <w:spacing w:before="0" w:after="0" w:line="364" w:lineRule="exact"/>
+        <w:ind w:left="4680"/>
+      </w:pPr>
+      <w:r>
+        <w:t xml:space="preserve">KERRICK</w:t>
+      </w:r>
+      <w:r>
+        <w:t xml:space="preserve"> </w:t>
+      </w:r>
+      <w:r>
+        <w:t xml:space="preserve">BACHERT</w:t>
+      </w:r>
+    </w:p>
+    <w:p>
+      <w:pPr>
+        <w:pStyle w:val="BapLine"/>
+        <w:keepNext/>
+        <w:keepLines/>
+        <w:spacing w:before="0" w:after="0" w:line="364" w:lineRule="exact"/>
+        <w:ind w:left="4680"/>
       </w:pPr>
       <w:r>
         <w:t xml:space="preserve">sbachert@kerricklaw.com</w:t>
@@ -832,23 +2746,51 @@
     </w:p>
     <w:p>
       <w:pPr>
-        <w:pStyle w:val="SignatureDate"/>
-      </w:pPr>
-      <w:r>
-        <w:t xml:space="preserve">August 30, 2019</w:t>
-      </w:r>
-    </w:p>
-    <w:p>
-      <w:pPr>
-        <w:pStyle w:val="CertHeading"/>
-      </w:pPr>
-      <w:r>
+        <w:pStyle w:val="BapLine"/>
+        <w:keepLines/>
+        <w:spacing w:before="224" w:after="0" w:line="364" w:lineRule="exact"/>
+        <w:ind w:left="4680"/>
+      </w:pPr>
+      <w:r>
+        <w:t xml:space="preserve">August</w:t>
+      </w:r>
+      <w:r>
+        <w:t xml:space="preserve"> </w:t>
+      </w:r>
+      <w:r>
+        <w:t xml:space="preserve">30,</w:t>
+      </w:r>
+      <w:r>
+        <w:t xml:space="preserve"> </w:t>
+      </w:r>
+      <w:r>
+        <w:t xml:space="preserve">2019</w:t>
+      </w:r>
+    </w:p>
+    <w:p>
+      <w:pPr>
+        <w:pStyle w:val="BapLine"/>
+        <w:keepNext/>
+        <w:keepLines/>
+        <w:spacing w:before="448" w:after="336" w:line="480" w:lineRule="exact"/>
+        <w:jc w:val="center"/>
+      </w:pPr>
+      <w:r>
+        <w:rPr>
+          <w:b/>
+          <w:bCs/>
+          <w:sz w:val="39"/>
+          <w:szCs w:val="39"/>
+        </w:rPr>
         <w:t xml:space="preserve">Certificate of Service</w:t>
       </w:r>
     </w:p>
     <w:p>
       <w:pPr>
-        <w:pStyle w:val="CertText"/>
+        <w:pStyle w:val="BapLine"/>
+        <w:keepNext/>
+        <w:keepLines/>
+        <w:spacing w:before="0" w:after="0" w:line="364" w:lineRule="exact"/>
       </w:pPr>
       <w:r>
         <w:t xml:space="preserve">I certify that on August 30, 2019 I filed this brief of appellee with the Clerk of the Bankruptcy Appellate Panel of the Sixth Circuit through the court’s electronic filing system, which will send notice of the filing to all counsel of record.</w:t>
@@ -856,7 +2798,11 @@
     </w:p>
     <w:p>
       <w:pPr>
-        <w:pStyle w:val="SignatureLead"/>
+        <w:pStyle w:val="BapLine"/>
+        <w:keepNext/>
+        <w:keepLines/>
+        <w:spacing w:before="448" w:after="0" w:line="364" w:lineRule="exact"/>
+        <w:ind w:left="4680"/>
       </w:pPr>
       <w:r>
         <w:t xml:space="preserve">Respectfully submitted,</w:t>
@@ -864,7 +2810,11 @@
     </w:p>
     <w:p>
       <w:pPr>
-        <w:pStyle w:val="Signature"/>
+        <w:pStyle w:val="BapLine"/>
+        <w:keepNext/>
+        <w:keepLines/>
+        <w:spacing w:before="336" w:after="0" w:line="364" w:lineRule="exact"/>
+        <w:ind w:left="4680"/>
       </w:pPr>
       <w:r>
         <w:t xml:space="preserve">s/ Scott A. Bachert</w:t>
@@ -872,15 +2822,29 @@
     </w:p>
     <w:p>
       <w:pPr>
-        <w:pStyle w:val="Signature"/>
-      </w:pPr>
-      <w:r>
-        <w:t xml:space="preserve">KERRICK BACHERT</w:t>
-      </w:r>
-    </w:p>
-    <w:p>
-      <w:pPr>
-        <w:pStyle w:val="Signature"/>
+        <w:pStyle w:val="BapLine"/>
+        <w:keepNext/>
+        <w:keepLines/>
+        <w:spacing w:before="0" w:after="0" w:line="364" w:lineRule="exact"/>
+        <w:ind w:left="4680"/>
+      </w:pPr>
+      <w:r>
+        <w:t xml:space="preserve">KERRICK</w:t>
+      </w:r>
+      <w:r>
+        <w:t xml:space="preserve"> </w:t>
+      </w:r>
+      <w:r>
+        <w:t xml:space="preserve">BACHERT</w:t>
+      </w:r>
+    </w:p>
+    <w:p>
+      <w:pPr>
+        <w:pStyle w:val="BapLine"/>
+        <w:keepNext/>
+        <w:keepLines/>
+        <w:spacing w:before="0" w:after="0" w:line="364" w:lineRule="exact"/>
+        <w:ind w:left="4680"/>
       </w:pPr>
       <w:r>
         <w:t xml:space="preserve">sbachert@kerricklaw.com</w:t>
@@ -888,18 +2852,32 @@
     </w:p>
     <w:p>
       <w:pPr>
-        <w:pStyle w:val="SignatureDate"/>
-      </w:pPr>
-      <w:r>
-        <w:t xml:space="preserve">August 30, 2019</w:t>
+        <w:pStyle w:val="BapLine"/>
+        <w:keepLines/>
+        <w:spacing w:before="224" w:after="0" w:line="364" w:lineRule="exact"/>
+        <w:ind w:left="4680"/>
+      </w:pPr>
+      <w:r>
+        <w:t xml:space="preserve">August</w:t>
+      </w:r>
+      <w:r>
+        <w:t xml:space="preserve"> </w:t>
+      </w:r>
+      <w:r>
+        <w:t xml:space="preserve">30,</w:t>
+      </w:r>
+      <w:r>
+        <w:t xml:space="preserve"> </w:t>
+      </w:r>
+      <w:r>
+        <w:t xml:space="preserve">2019</w:t>
       </w:r>
     </w:p>
     <w:sectPr>
-      <w:footerReference w:type="default" r:id="rIdFtrPage"/>
+      <w:footerReference w:type="default" r:id="rIdBapPage"/>
       <w:pgSz w:w="12240" w:h="15840"/>
       <w:pgMar w:top="1440" w:right="1440" w:bottom="1440" w:left="1440" w:header="720" w:footer="720" w:gutter="0"/>
       <w:pgNumType w:fmt="decimal" w:start="1"/>
-      <w:cols w:space="720"/>
     </w:sectPr>
   </w:body>
 </w:document>
@@ -968,6 +2946,33 @@
 </w:ftr>
 </file>
 
+<file path=word/ftr-own1.xml><?xml version="1.0" encoding="utf-8"?>
+<w:ftr xmlns:w="http://schemas.openxmlformats.org/wordprocessingml/2006/main" xmlns:r="http://schemas.openxmlformats.org/officeDocument/2006/relationships">
+  <w:p>
+    <w:pPr>
+      <w:spacing w:before="0" w:after="0" w:line="364" w:lineRule="exact"/>
+      <w:ind w:firstLine="0"/>
+      <w:jc w:val="center"/>
+    </w:pPr>
+    <w:r>
+      <w:fldChar w:fldCharType="begin"/>
+    </w:r>
+    <w:r>
+      <w:instrText xml:space="preserve"> PAGE </w:instrText>
+    </w:r>
+    <w:r>
+      <w:fldChar w:fldCharType="separate"/>
+    </w:r>
+    <w:r>
+      <w:t>1</w:t>
+    </w:r>
+    <w:r>
+      <w:fldChar w:fldCharType="end"/>
+    </w:r>
+  </w:p>
+</w:ftr>
+</file>
+
 <file path=word/ftr-page.xml><?xml version="1.0" encoding="utf-8"?>
 <w:ftr xmlns:w="http://schemas.openxmlformats.org/wordprocessingml/2006/main" xmlns:r="http://schemas.openxmlformats.org/officeDocument/2006/relationships">
   <w:p>
@@ -1086,12 +3091,13 @@
         <w:rFonts w:ascii="Times New Roman" w:hAnsi="Times New Roman" w:eastAsia="Times New Roman" w:cs="Times New Roman"/>
         <w:sz w:val="28"/>
         <w:szCs w:val="28"/>
-        <w:lang w:val="en-US" w:eastAsia="en-US" w:bidi="ar-SA"/>
+        <w:lang w:val="en-US" w:eastAsia="zh-CN" w:bidi="ar-SA"/>
       </w:rPr>
     </w:rPrDefault>
     <w:pPrDefault>
       <w:pPr>
-        <w:spacing w:before="0" w:after="0" w:line="376" w:lineRule="exact"/>
+        <w:widowControl/>
+        <w:spacing w:after="0"/>
       </w:pPr>
     </w:pPrDefault>
   </w:docDefaults>
@@ -1099,10 +3105,6 @@
   <w:style w:type="paragraph" w:default="1" w:styleId="Normal">
     <w:name w:val="Normal"/>
     <w:qFormat/>
-    <w:pPr>
-      <w:spacing w:before="0" w:after="0" w:line="376" w:lineRule="exact"/>
-      <w:ind w:firstLine="0"/>
-    </w:pPr>
   </w:style>
   <w:style w:type="paragraph" w:styleId="BodyText">
     <w:name w:val="Body Text"/>
@@ -1110,17 +3112,17 @@
     <w:link w:val="BodyTextChar"/>
     <w:qFormat/>
     <w:pPr>
-      <w:spacing w:before="0" w:after="0" w:line="742" w:lineRule="exact"/>
-      <w:ind w:firstLine="720"/>
+      <w:spacing w:before="0" w:after="0" w:line="728" w:lineRule="exact"/>
+      <w:ind w:firstLine="720" w:right="2"/>
     </w:pPr>
   </w:style>
-  <w:style w:type="paragraph" w:styleId="FirstParagraph">
+  <w:style w:type="paragraph" w:customStyle="1" w:styleId="FirstParagraph">
     <w:name w:val="First Paragraph"/>
     <w:basedOn w:val="BodyText"/>
     <w:next w:val="BodyText"/>
     <w:qFormat/>
     <w:pPr>
-      <w:ind w:firstLine="0"/>
+      <w:ind w:right="2" w:firstLine="0"/>
     </w:pPr>
   </w:style>
   <w:style w:type="paragraph" w:customStyle="1" w:styleId="Compact">
@@ -1128,7 +3130,7 @@
     <w:basedOn w:val="BodyText"/>
     <w:qFormat/>
     <w:pPr>
-      <w:ind w:firstLine="0"/>
+      <w:spacing w:before="36" w:after="36"/>
     </w:pPr>
   </w:style>
   <w:style w:type="paragraph" w:styleId="Title">
@@ -1268,81 +3270,105 @@
     <w:name w:val="heading 1"/>
     <w:basedOn w:val="Normal"/>
     <w:next w:val="BodyText"/>
+    <w:link w:val="Heading1Char"/>
     <w:uiPriority w:val="9"/>
     <w:qFormat/>
+    <w:rsid w:val="00A10FD9"/>
     <w:pPr>
       <w:keepNext/>
       <w:keepLines/>
-      <w:spacing w:before="349" w:after="0" w:line="527" w:lineRule="exact"/>
+      <w:spacing w:before="240" w:after="120" w:line="364" w:lineRule="exact"/>
       <w:ind w:firstLine="0"/>
       <w:jc w:val="center"/>
       <w:outlineLvl w:val="0"/>
     </w:pPr>
     <w:rPr>
+      <w:rFonts w:ascii="Times New Roman" w:hAnsi="Times New Roman" w:eastAsia="Times New Roman" w:cs="Times New Roman"/>
       <w:b/>
       <w:bCs/>
+      <w:caps/>
       <w:color w:val="000000"/>
-      <w:sz w:val="39"/>
-      <w:szCs w:val="39"/>
+      <w:sz w:val="28"/>
+      <w:szCs w:val="28"/>
     </w:rPr>
   </w:style>
   <w:style w:type="paragraph" w:styleId="Heading2">
     <w:name w:val="heading 2"/>
     <w:basedOn w:val="Normal"/>
     <w:next w:val="BodyText"/>
+    <w:link w:val="Heading2Char"/>
     <w:uiPriority w:val="9"/>
+    <w:semiHidden/>
+    <w:unhideWhenUsed/>
     <w:qFormat/>
+    <w:rsid w:val="00A10FD9"/>
     <w:pPr>
       <w:keepNext/>
       <w:keepLines/>
-      <w:spacing w:before="181" w:after="0" w:line="446" w:lineRule="exact"/>
+      <w:spacing w:before="240" w:after="120" w:line="364" w:lineRule="exact"/>
       <w:ind w:firstLine="0"/>
       <w:outlineLvl w:val="1"/>
     </w:pPr>
     <w:rPr>
+      <w:rFonts w:ascii="Times New Roman" w:hAnsi="Times New Roman" w:eastAsia="Times New Roman" w:cs="Times New Roman"/>
       <w:b/>
       <w:bCs/>
       <w:color w:val="000000"/>
-      <w:sz w:val="34"/>
-      <w:szCs w:val="34"/>
+      <w:sz w:val="28"/>
+      <w:szCs w:val="28"/>
     </w:rPr>
   </w:style>
   <w:style w:type="paragraph" w:styleId="Heading3">
     <w:name w:val="heading 3"/>
     <w:basedOn w:val="Normal"/>
     <w:next w:val="BodyText"/>
+    <w:link w:val="Heading3Char"/>
     <w:uiPriority w:val="9"/>
+    <w:semiHidden/>
+    <w:unhideWhenUsed/>
     <w:qFormat/>
+    <w:rsid w:val="00A10FD9"/>
     <w:pPr>
       <w:keepNext/>
       <w:keepLines/>
-      <w:spacing w:before="160" w:after="0" w:line="372" w:lineRule="exact"/>
-      <w:ind w:left="720" w:firstLine="0"/>
+      <w:spacing w:before="240" w:after="120" w:line="364" w:lineRule="exact"/>
+      <w:ind w:firstLine="0"/>
       <w:outlineLvl w:val="2"/>
     </w:pPr>
     <w:rPr>
+      <w:rFonts w:ascii="Times New Roman" w:hAnsi="Times New Roman" w:eastAsia="Times New Roman" w:cs="Times New Roman"/>
       <w:b/>
       <w:bCs/>
       <w:color w:val="000000"/>
+      <w:sz w:val="28"/>
+      <w:szCs w:val="28"/>
     </w:rPr>
   </w:style>
   <w:style w:type="paragraph" w:styleId="Heading4">
     <w:name w:val="heading 4"/>
     <w:basedOn w:val="Normal"/>
     <w:next w:val="BodyText"/>
+    <w:link w:val="Heading4Char"/>
     <w:uiPriority w:val="9"/>
+    <w:semiHidden/>
+    <w:unhideWhenUsed/>
     <w:qFormat/>
+    <w:rsid w:val="00A10FD9"/>
     <w:pPr>
       <w:keepNext/>
       <w:keepLines/>
-      <w:spacing w:before="160" w:after="0" w:line="376" w:lineRule="exact"/>
-      <w:ind w:left="1440" w:firstLine="0"/>
+      <w:spacing w:before="240" w:after="120" w:line="364" w:lineRule="exact"/>
+      <w:ind w:firstLine="0"/>
       <w:outlineLvl w:val="3"/>
     </w:pPr>
     <w:rPr>
+      <w:rFonts w:ascii="Times New Roman" w:hAnsi="Times New Roman" w:eastAsia="Times New Roman" w:cs="Times New Roman"/>
+      <w:b/>
+      <w:bCs/>
       <w:i/>
-      <w:iCs/>
       <w:color w:val="000000"/>
+      <w:sz w:val="28"/>
+      <w:szCs w:val="28"/>
     </w:rPr>
   </w:style>
   <w:style w:type="paragraph" w:styleId="Heading5">
@@ -1358,12 +3384,18 @@
     <w:pPr>
       <w:keepNext/>
       <w:keepLines/>
-      <w:spacing w:before="80" w:after="40"/>
+      <w:spacing w:before="240" w:after="120" w:line="364" w:lineRule="exact"/>
+      <w:ind w:firstLine="0"/>
       <w:outlineLvl w:val="4"/>
     </w:pPr>
     <w:rPr>
-      <w:rFonts w:cstheme="majorBidi"/>
-      <w:color w:val="0F4761" w:themeColor="accent1" w:themeShade="BF"/>
+      <w:rFonts w:ascii="Times New Roman" w:hAnsi="Times New Roman" w:eastAsia="Times New Roman" w:cs="Times New Roman"/>
+      <w:b/>
+      <w:bCs/>
+      <w:i/>
+      <w:color w:val="000000"/>
+      <w:sz w:val="28"/>
+      <w:szCs w:val="28"/>
     </w:rPr>
   </w:style>
   <w:style w:type="paragraph" w:styleId="Heading6">
@@ -1575,22 +3607,26 @@
   </w:style>
   <w:style w:type="paragraph" w:styleId="BlockText">
     <w:name w:val="Block Text"/>
-    <w:basedOn w:val="Normal"/>
+    <w:basedOn w:val="BodyText"/>
     <w:next w:val="BodyText"/>
+    <w:uiPriority w:val="9"/>
+    <w:unhideWhenUsed/>
     <w:qFormat/>
     <w:pPr>
-      <w:spacing w:before="280" w:after="392" w:line="376" w:lineRule="exact"/>
-      <w:ind w:left="720" w:right="720" w:firstLine="0"/>
+      <w:spacing w:before="280" w:after="280" w:line="364" w:lineRule="exact"/>
+      <w:ind w:firstLine="0" w:left="720" w:right="720"/>
     </w:pPr>
   </w:style>
   <w:style w:type="paragraph" w:styleId="FootnoteText">
     <w:name w:val="Footnote Text"/>
     <w:basedOn w:val="Normal"/>
+    <w:next w:val="FootnoteText"/>
     <w:uiPriority w:val="9"/>
     <w:unhideWhenUsed/>
+    <w:qFormat/>
     <w:pPr>
-      <w:spacing w:before="0" w:after="0" w:line="376" w:lineRule="exact"/>
-      <w:ind w:firstLine="0"/>
+      <w:keepLines/>
+      <w:spacing w:before="0" w:after="140" w:line="364" w:lineRule="exact"/>
     </w:pPr>
     <w:rPr>
       <w:sz w:val="28"/>
@@ -1605,8 +3641,8 @@
     <w:unhideWhenUsed/>
     <w:qFormat/>
     <w:pPr>
-      <w:spacing w:before="100" w:after="100"/>
-      <w:ind w:firstLine="0" w:left="480" w:right="480"/>
+      <w:spacing w:before="280" w:after="280"/>
+      <w:ind w:firstLine="0" w:left="720" w:right="720"/>
     </w:pPr>
   </w:style>
   <w:style w:type="character" w:default="1" w:styleId="DefaultParagraphFont">
@@ -1714,7 +3750,7 @@
     <w:name w:val="Hyperlink"/>
     <w:basedOn w:val="BodyTextChar"/>
     <w:rPr>
-      <w:color w:val="4F81BD" w:themeColor="accent1"/>
+      <w:color w:val="000000"/>
     </w:rPr>
   </w:style>
   <w:style w:type="paragraph" w:styleId="TOCHeading">
@@ -1735,312 +3771,56 @@
       <w:color w:val="365F91" w:themeColor="accent1" w:themeShade="BF"/>
     </w:rPr>
   </w:style>
-  <w:style w:type="paragraph" w:customStyle="1" w:styleId="CertText">
-    <w:name w:val="Cert Text"/>
-    <w:basedOn w:val="FirstParagraph"/>
+  <w:style w:type="paragraph" w:customStyle="1" w:styleId="ListItem">
+    <w:name w:val="List Item"/>
+    <w:basedOn w:val="BodyText"/>
     <w:qFormat/>
     <w:pPr>
-      <w:keepNext/>
-      <w:keepLines/>
+      <w:spacing w:before="0" w:after="0" w:line="728" w:lineRule="exact"/>
+      <w:ind w:left="720" w:hanging="720"/>
     </w:pPr>
   </w:style>
-  <w:style w:type="paragraph" w:customStyle="1" w:styleId="Heading1Top">
-    <w:name w:val="Heading 1 Top"/>
-    <w:basedOn w:val="Heading1"/>
-    <w:next w:val="FirstParagraph"/>
-    <w:qFormat/>
-    <w:pPr>
-      <w:spacing w:before="0"/>
-      <w:outlineLvl w:val="0"/>
-    </w:pPr>
-  </w:style>
-  <w:style w:type="paragraph" w:customStyle="1" w:styleId="Centered">
-    <w:name w:val="Centered"/>
+  <w:style w:type="paragraph" w:customStyle="1" w:styleId="BapLine">
+    <w:name w:val="Bap Line"/>
     <w:basedOn w:val="Normal"/>
     <w:qFormat/>
     <w:pPr>
-      <w:jc w:val="center"/>
+      <w:spacing w:before="0" w:after="0" w:line="364" w:lineRule="exact"/>
+      <w:ind w:left="0" w:firstLine="0"/>
     </w:pPr>
   </w:style>
-  <w:style w:type="paragraph" w:customStyle="1" w:styleId="CoverGap">
-    <w:name w:val="CoverGap"/>
-    <w:basedOn w:val="Centered"/>
-    <w:qFormat/>
-    <w:pPr>
-      <w:spacing w:before="70"/>
-    </w:pPr>
-  </w:style>
-  <w:style w:type="paragraph" w:customStyle="1" w:styleId="CoverWide">
-    <w:name w:val="CoverWide"/>
-    <w:basedOn w:val="Centered"/>
-    <w:qFormat/>
-    <w:pPr>
-      <w:spacing w:before="758"/>
-    </w:pPr>
-  </w:style>
-  <w:style w:type="paragraph" w:customStyle="1" w:styleId="CoverTitle">
-    <w:name w:val="CoverTitle"/>
-    <w:basedOn w:val="Centered"/>
-    <w:qFormat/>
-    <w:pPr>
-      <w:spacing w:before="600" w:line="420" w:lineRule="exact"/>
-    </w:pPr>
-    <w:rPr>
-      <w:b/>
-      <w:bCs/>
-      <w:caps/>
-      <w:sz w:val="32"/>
-      <w:szCs w:val="32"/>
-    </w:rPr>
-  </w:style>
-  <w:style w:type="paragraph" w:customStyle="1" w:styleId="CoverBottom">
-    <w:name w:val="CoverBottom"/>
-    <w:basedOn w:val="Centered"/>
-    <w:qFormat/>
-    <w:pPr>
-      <w:spacing w:before="360"/>
-    </w:pPr>
-  </w:style>
-  <w:style w:type="paragraph" w:customStyle="1" w:styleId="CoverGroup">
-    <w:name w:val="CoverGroup"/>
-    <w:basedOn w:val="Centered"/>
-    <w:qFormat/>
-    <w:pPr>
-      <w:spacing w:before="360"/>
-    </w:pPr>
-  </w:style>
-  <w:style w:type="paragraph" w:customStyle="1" w:styleId="CoverDate">
-    <w:name w:val="CoverDate"/>
-    <w:basedOn w:val="Centered"/>
-    <w:qFormat/>
-    <w:pPr>
-      <w:spacing w:before="160"/>
-    </w:pPr>
-  </w:style>
-  <w:style w:type="paragraph" w:customStyle="1" w:styleId="SectionEnd">
-    <w:name w:val="SectionEnd"/>
+  <w:style w:type="paragraph" w:customStyle="1" w:styleId="BapQuote">
+    <w:name w:val="Bap Quote"/>
     <w:basedOn w:val="Normal"/>
     <w:qFormat/>
     <w:pPr>
-      <w:spacing w:before="0" w:after="0" w:line="20" w:lineRule="exact"/>
+      <w:spacing w:before="0" w:after="0" w:line="364" w:lineRule="exact"/>
+      <w:ind w:left="720" w:right="720" w:firstLine="0"/>
     </w:pPr>
-    <w:rPr>
-      <w:sz w:val="2"/>
-      <w:szCs w:val="2"/>
-    </w:rPr>
-  </w:style>
-  <w:style w:type="paragraph" w:customStyle="1" w:styleId="Single">
-    <w:name w:val="Single"/>
-    <w:basedOn w:val="Normal"/>
+  </w:style>
+  <w:style w:type="paragraph" w:customStyle="1" w:styleId="BapQuoteFirst">
+    <w:name w:val="Bap Quote First"/>
+    <w:basedOn w:val="BapQuote"/>
     <w:qFormat/>
     <w:pPr>
-      <w:spacing w:before="0" w:after="0" w:line="376" w:lineRule="exact"/>
-      <w:ind w:firstLine="0"/>
+      <w:spacing w:before="280" w:after="0" w:line="364" w:lineRule="exact"/>
     </w:pPr>
   </w:style>
-  <w:style w:type="paragraph" w:customStyle="1" w:styleId="FrontHeading">
-    <w:name w:val="FrontHeading"/>
-    <w:basedOn w:val="Normal"/>
-    <w:next w:val="FirstParagraph"/>
+  <w:style w:type="paragraph" w:customStyle="1" w:styleId="BapQuoteLast">
+    <w:name w:val="Bap Quote Last"/>
+    <w:basedOn w:val="BapQuote"/>
     <w:qFormat/>
     <w:pPr>
-      <w:keepNext/>
-      <w:keepLines/>
-      <w:spacing w:before="0" w:after="0" w:line="527" w:lineRule="exact"/>
-      <w:ind w:firstLine="0"/>
-      <w:jc w:val="center"/>
+      <w:spacing w:before="0" w:after="392" w:line="364" w:lineRule="exact"/>
     </w:pPr>
-    <w:rPr>
-      <w:b/>
-      <w:bCs/>
-      <w:sz w:val="39"/>
-      <w:szCs w:val="39"/>
-    </w:rPr>
-  </w:style>
-  <w:style w:type="paragraph" w:customStyle="1" w:styleId="CertHeading">
-    <w:name w:val="CertHeading"/>
-    <w:basedOn w:val="FrontHeading"/>
+  </w:style>
+  <w:style w:type="paragraph" w:customStyle="1" w:styleId="BapQuoteOnly">
+    <w:name w:val="Bap Quote Only"/>
+    <w:basedOn w:val="BapQuote"/>
     <w:qFormat/>
     <w:pPr>
-      <w:spacing w:before="349"/>
+      <w:spacing w:before="280" w:after="392" w:line="364" w:lineRule="exact"/>
     </w:pPr>
-  </w:style>
-  <w:style w:type="paragraph" w:customStyle="1" w:styleId="FrontHeadingBreak">
-    <w:name w:val="FrontHeadingBreak"/>
-    <w:basedOn w:val="FrontHeading"/>
-    <w:qFormat/>
-    <w:pPr>
-      <w:pageBreakBefore/>
-    </w:pPr>
-  </w:style>
-  <w:style w:type="paragraph" w:customStyle="1" w:styleId="ContentsHeading">
-    <w:name w:val="ContentsHeading"/>
-    <w:basedOn w:val="FrontHeading"/>
-    <w:qFormat/>
-    <w:pPr>
-      <w:spacing w:after="305"/>
-    </w:pPr>
-  </w:style>
-  <w:style w:type="paragraph" w:customStyle="1" w:styleId="ContentsHeadingBreak">
-    <w:name w:val="ContentsHeadingBreak"/>
-    <w:basedOn w:val="ContentsHeading"/>
-    <w:qFormat/>
-    <w:pPr>
-      <w:pageBreakBefore/>
-    </w:pPr>
-  </w:style>
-  <w:style w:type="paragraph" w:customStyle="1" w:styleId="AuthoritiesHeading">
-    <w:name w:val="AuthoritiesHeading"/>
-    <w:basedOn w:val="FrontHeadingBreak"/>
-    <w:qFormat/>
-    <w:pPr>
-      <w:spacing w:before="0" w:after="143"/>
-    </w:pPr>
-  </w:style>
-  <w:style w:type="paragraph" w:customStyle="1" w:styleId="AuthorityKind">
-    <w:name w:val="AuthorityKind"/>
-    <w:basedOn w:val="Single"/>
-    <w:next w:val="TOAEntry"/>
-    <w:qFormat/>
-    <w:pPr>
-      <w:keepNext/>
-      <w:spacing w:before="160" w:after="40"/>
-    </w:pPr>
-    <w:rPr>
-      <w:b/>
-      <w:bCs/>
-    </w:rPr>
-  </w:style>
-  <w:style w:type="paragraph" w:customStyle="1" w:styleId="TOAEntry">
-    <w:name w:val="TOA Entry"/>
-    <w:basedOn w:val="Single"/>
-    <w:qFormat/>
-    <w:pPr>
-      <w:keepLines/>
-      <w:tabs>
-        <w:tab w:val="right" w:leader="dot" w:pos="9350"/>
-      </w:tabs>
-      <w:spacing w:after="0"/>
-      <w:ind w:left="720" w:right="720" w:hanging="720"/>
-    </w:pPr>
-  </w:style>
-  <w:style w:type="paragraph" w:customStyle="1" w:styleId="TOCEntry1">
-    <w:name w:val="TOC Entry 1"/>
-    <w:basedOn w:val="Single"/>
-    <w:qFormat/>
-    <w:pPr>
-      <w:keepLines/>
-      <w:tabs>
-        <w:tab w:val="right" w:pos="9350"/>
-      </w:tabs>
-      <w:spacing w:after="0"/>
-      <w:ind w:left="420" w:right="720" w:hanging="420"/>
-    </w:pPr>
-  </w:style>
-  <w:style w:type="paragraph" w:customStyle="1" w:styleId="TOCEntry2">
-    <w:name w:val="TOC Entry 2"/>
-    <w:basedOn w:val="TOCEntry1"/>
-    <w:qFormat/>
-    <w:pPr>
-      <w:ind w:left="840" w:right="720" w:hanging="420"/>
-    </w:pPr>
-  </w:style>
-  <w:style w:type="paragraph" w:customStyle="1" w:styleId="TOCEntry3">
-    <w:name w:val="TOC Entry 3"/>
-    <w:basedOn w:val="TOCEntry1"/>
-    <w:qFormat/>
-    <w:pPr>
-      <w:ind w:left="1260" w:right="720" w:hanging="420"/>
-    </w:pPr>
-  </w:style>
-  <w:style w:type="paragraph" w:customStyle="1" w:styleId="TOCEntry4">
-    <w:name w:val="TOC Entry 4"/>
-    <w:basedOn w:val="TOCEntry1"/>
-    <w:qFormat/>
-    <w:pPr>
-      <w:ind w:left="1680" w:right="720" w:hanging="420"/>
-    </w:pPr>
-  </w:style>
-  <w:style w:type="paragraph" w:customStyle="1" w:styleId="Signature">
-    <w:name w:val="Signature"/>
-    <w:basedOn w:val="Single"/>
-    <w:qFormat/>
-    <w:pPr>
-      <w:keepNext/>
-      <w:keepLines/>
-      <w:ind w:left="4680" w:firstLine="0"/>
-    </w:pPr>
-  </w:style>
-  <w:style w:type="paragraph" w:customStyle="1" w:styleId="SignatureLead">
-    <w:name w:val="SignatureLead"/>
-    <w:basedOn w:val="Signature"/>
-    <w:qFormat/>
-    <w:pPr>
-      <w:spacing w:before="260" w:after="700"/>
-    </w:pPr>
-  </w:style>
-  <w:style w:type="paragraph" w:customStyle="1" w:styleId="SignatureDate">
-    <w:name w:val="SignatureDate"/>
-    <w:basedOn w:val="Signature"/>
-    <w:qFormat/>
-    <w:pPr>
-      <w:keepNext w:val="0"/>
-      <w:spacing w:before="590"/>
-    </w:pPr>
-  </w:style>
-  <w:style w:type="paragraph" w:customStyle="1" w:styleId="KeepWithNext">
-    <w:name w:val="Keep With Next"/>
-    <w:basedOn w:val="BodyText"/>
-    <w:qFormat/>
-    <w:pPr>
-      <w:keepNext/>
-      <w:keepLines/>
-    </w:pPr>
-  </w:style>
-  <w:style w:type="paragraph" w:styleId="Footer">
-    <w:name w:val="footer"/>
-    <w:basedOn w:val="Normal"/>
-    <w:uiPriority w:val="99"/>
-    <w:unhideWhenUsed/>
-    <w:pPr>
-      <w:spacing w:before="0" w:after="0" w:line="240" w:lineRule="auto"/>
-      <w:ind w:firstLine="0"/>
-      <w:jc w:val="center"/>
-    </w:pPr>
-    <w:rPr>
-      <w:sz w:val="28"/>
-      <w:szCs w:val="28"/>
-    </w:rPr>
-  </w:style>
-  <w:style w:type="paragraph" w:customStyle="1" w:styleId="CertText">
-    <w:name w:val="CertText"/>
-    <w:basedOn w:val="BodyText"/>
-    <w:qFormat/>
-  </w:style>
-  <w:style w:type="paragraph" w:customStyle="1" w:styleId="FirstParagraph">
-    <w:name w:val="FirstParagraph"/>
-    <w:basedOn w:val="BodyText"/>
-    <w:qFormat/>
-  </w:style>
-  <w:style w:type="paragraph" w:customStyle="1" w:styleId="Heading1Top">
-    <w:name w:val="Heading1Top"/>
-    <w:basedOn w:val="BodyText"/>
-    <w:qFormat/>
-  </w:style>
-  <w:style w:type="paragraph" w:customStyle="1" w:styleId="TOAEntry">
-    <w:name w:val="TOAEntry"/>
-    <w:basedOn w:val="BodyText"/>
-    <w:qFormat/>
-  </w:style>
-  <w:style w:type="paragraph" w:customStyle="1" w:styleId="TOCEntry1">
-    <w:name w:val="TOCEntry1"/>
-    <w:basedOn w:val="BodyText"/>
-    <w:qFormat/>
-  </w:style>
-  <w:style w:type="paragraph" w:customStyle="1" w:styleId="TOCEntry2">
-    <w:name w:val="TOCEntry2"/>
-    <w:basedOn w:val="BodyText"/>
-    <w:qFormat/>
   </w:style>
   <w:style w:type="paragraph" w:customStyle="1" w:styleId="SourceCode">
     <w:name w:val="Source Code"/>

</xml_diff>